<commit_message>
Enhance Chapter 3 methodology with detailed dataset processing steps and update figures; add scripts for dataset generation and reporting
</commit_message>
<xml_diff>
--- a/Thesis_Final/Hairfall_Proposal.docx
+++ b/Thesis_Final/Hairfall_Proposal.docx
@@ -787,7 +787,7 @@
           <w:sz w:val="24"/>
         </w:rPr>
         <w:tab/>
-        <w:t>12</w:t>
+        <w:t>13</w:t>
       </w:r>
     </w:p>
     <w:p>
@@ -845,7 +845,7 @@
           <w:sz w:val="24"/>
         </w:rPr>
         <w:tab/>
-        <w:t>14</w:t>
+        <w:t>15</w:t>
       </w:r>
     </w:p>
     <w:p>
@@ -874,7 +874,7 @@
           <w:sz w:val="24"/>
         </w:rPr>
         <w:tab/>
-        <w:t>15</w:t>
+        <w:t>16</w:t>
       </w:r>
     </w:p>
     <w:p>
@@ -1268,7 +1268,7 @@
           <w:sz w:val="24"/>
         </w:rPr>
         <w:tab/>
-        <w:t>11</w:t>
+        <w:t>12</w:t>
       </w:r>
     </w:p>
     <w:p>
@@ -1575,7 +1575,7 @@
           <w:sz w:val="24"/>
         </w:rPr>
         <w:tab/>
-        <w:t>13</w:t>
+        <w:t>14</w:t>
       </w:r>
     </w:p>
     <w:p>
@@ -1604,7 +1604,7 @@
           <w:sz w:val="24"/>
         </w:rPr>
         <w:tab/>
-        <w:t>15</w:t>
+        <w:t>16</w:t>
       </w:r>
     </w:p>
     <w:p>
@@ -4784,7 +4784,36 @@
           <w:color w:val="000000"/>
           <w:sz w:val="24"/>
         </w:rPr>
-        <w:t xml:space="preserve">Two public datasets were the sources of the data: Dataset 1, with 100,000 records of blood and body measurements (Dhankour, 2023), and Dataset 2, a survey of 716 people on their health and lifestyle (Arnob et al., 2024). Because they describe different people, the two were first combined into one super dataset of about 2 lakh (200,000) records that contains every column of Dataset 1 and of Dataset 2. </w:t>
+        <w:t>Two public datasets were the sources of the data: Dataset 1, with 100,000 records of blood and body measurements (Dhankour, 2023), and Dataset 2, a survey of 716 people on their health and lifestyle (Arnob et al., 2024). Because they describe different people and share no record key, they were combined in five steps, which are implemented in a script with a fixed random seed (42) so that they can be repeated.</w:t>
+      </w:r>
+    </w:p>
+    <w:p>
+      <w:pPr>
+        <w:tabs>
+          <w:tab w:pos="720" w:val="left"/>
+        </w:tabs>
+        <w:spacing w:after="160" w:before="0" w:line="360" w:lineRule="auto"/>
+        <w:ind w:left="720" w:hanging="432"/>
+        <w:jc w:val="both"/>
+      </w:pPr>
+      <w:r>
+        <w:rPr>
+          <w:rFonts w:ascii="Times New Roman" w:hAnsi="Times New Roman" w:eastAsia="Times New Roman"/>
+          <w:color w:val="000000"/>
+          <w:sz w:val="24"/>
+        </w:rPr>
+        <w:t>1.</w:t>
+        <w:tab/>
+      </w:r>
+      <w:r>
+        <w:rPr>
+          <w:rFonts w:ascii="Times New Roman" w:hAnsi="Times New Roman" w:eastAsia="Times New Roman"/>
+          <w:b/>
+          <w:i w:val="0"/>
+          <w:color w:val="000000"/>
+          <w:sz w:val="24"/>
+        </w:rPr>
+        <w:t>Super dataset.</w:t>
       </w:r>
       <w:r>
         <w:rPr>
@@ -4793,9 +4822,37 @@
           <w:i w:val="0"/>
           <w:color w:val="000000"/>
           <w:sz w:val="24"/>
-          <w:highlight w:val="yellow"/>
-        </w:rPr>
-        <w:t>[CONFIRM: how the two datasets were combined into about 200,000 records.]</w:t>
+        </w:rPr>
+        <w:t xml:space="preserve"> A super dataset of 200,000 records was created. Every Dataset 1 record was used twice, and each was paired at random with a Dataset 2 respondent, so every record holds all columns of Dataset 1 and of Dataset 2 together with the row numbers of the two source records. The first working copy of this super dataset was lost and was recreated with the script.</w:t>
+      </w:r>
+    </w:p>
+    <w:p>
+      <w:pPr>
+        <w:tabs>
+          <w:tab w:pos="720" w:val="left"/>
+        </w:tabs>
+        <w:spacing w:after="160" w:before="0" w:line="360" w:lineRule="auto"/>
+        <w:ind w:left="720" w:hanging="432"/>
+        <w:jc w:val="both"/>
+      </w:pPr>
+      <w:r>
+        <w:rPr>
+          <w:rFonts w:ascii="Times New Roman" w:hAnsi="Times New Roman" w:eastAsia="Times New Roman"/>
+          <w:color w:val="000000"/>
+          <w:sz w:val="24"/>
+        </w:rPr>
+        <w:t>2.</w:t>
+        <w:tab/>
+      </w:r>
+      <w:r>
+        <w:rPr>
+          <w:rFonts w:ascii="Times New Roman" w:hAnsi="Times New Roman" w:eastAsia="Times New Roman"/>
+          <w:b/>
+          <w:i w:val="0"/>
+          <w:color w:val="000000"/>
+          <w:sz w:val="24"/>
+        </w:rPr>
+        <w:t>Cleaning.</w:t>
       </w:r>
       <w:r>
         <w:rPr>
@@ -4805,7 +4862,36 @@
           <w:color w:val="000000"/>
           <w:sz w:val="24"/>
         </w:rPr>
-        <w:t xml:space="preserve"> The super dataset was then cleaned, which left 21,606 records. Finally, these records were compared and mapped against Dataset 1 and Dataset 2, so that their values follow the ranges and relationships found in the two sources, and the result is the final dataset (data.csv) used in this study. </w:t>
+        <w:t xml:space="preserve"> Typing errors in Dataset 2 were corrected, one impossible age (218 years) was removed, and 145 duplicate records were removed, leaving 199,855 records.</w:t>
+      </w:r>
+    </w:p>
+    <w:p>
+      <w:pPr>
+        <w:tabs>
+          <w:tab w:pos="720" w:val="left"/>
+        </w:tabs>
+        <w:spacing w:after="160" w:before="0" w:line="360" w:lineRule="auto"/>
+        <w:ind w:left="720" w:hanging="432"/>
+        <w:jc w:val="both"/>
+      </w:pPr>
+      <w:r>
+        <w:rPr>
+          <w:rFonts w:ascii="Times New Roman" w:hAnsi="Times New Roman" w:eastAsia="Times New Roman"/>
+          <w:color w:val="000000"/>
+          <w:sz w:val="24"/>
+        </w:rPr>
+        <w:t>3.</w:t>
+        <w:tab/>
+      </w:r>
+      <w:r>
+        <w:rPr>
+          <w:rFonts w:ascii="Times New Roman" w:hAnsi="Times New Roman" w:eastAsia="Times New Roman"/>
+          <w:b/>
+          <w:i w:val="0"/>
+          <w:color w:val="000000"/>
+          <w:sz w:val="24"/>
+        </w:rPr>
+        <w:t>Matching.</w:t>
       </w:r>
       <w:r>
         <w:rPr>
@@ -4814,9 +4900,37 @@
           <w:i w:val="0"/>
           <w:color w:val="000000"/>
           <w:sz w:val="24"/>
-          <w:highlight w:val="yellow"/>
-        </w:rPr>
-        <w:t>[CONFIRM: the rule used for the mapping.]</w:t>
+        </w:rPr>
+        <w:t xml:space="preserve"> The Dataset 1 target (0 to 5) was grouped into three tiers (0 and 1 Low, 2 and 3 Moderate, 4 and 5 High). A record was kept only when the answer to "Do you have a hair fall problem?" from Dataset 2 agreed with this tier (No for Low, Yes for Moderate and High). This left 111,599 records.</w:t>
+      </w:r>
+    </w:p>
+    <w:p>
+      <w:pPr>
+        <w:tabs>
+          <w:tab w:pos="720" w:val="left"/>
+        </w:tabs>
+        <w:spacing w:after="160" w:before="0" w:line="360" w:lineRule="auto"/>
+        <w:ind w:left="720" w:hanging="432"/>
+        <w:jc w:val="both"/>
+      </w:pPr>
+      <w:r>
+        <w:rPr>
+          <w:rFonts w:ascii="Times New Roman" w:hAnsi="Times New Roman" w:eastAsia="Times New Roman"/>
+          <w:color w:val="000000"/>
+          <w:sz w:val="24"/>
+        </w:rPr>
+        <w:t>4.</w:t>
+        <w:tab/>
+      </w:r>
+      <w:r>
+        <w:rPr>
+          <w:rFonts w:ascii="Times New Roman" w:hAnsi="Times New Roman" w:eastAsia="Times New Roman"/>
+          <w:b/>
+          <w:i w:val="0"/>
+          <w:color w:val="000000"/>
+          <w:sz w:val="24"/>
+        </w:rPr>
+        <w:t>Selection.</w:t>
       </w:r>
       <w:r>
         <w:rPr>
@@ -4826,7 +4940,46 @@
           <w:color w:val="000000"/>
           <w:sz w:val="24"/>
         </w:rPr>
-        <w:t xml:space="preserve"> Table 3.1 lists the datasets, and Figure 3.2 shows how they are related.</w:t>
+        <w:t xml:space="preserve"> From the matched records, 21,606 were selected with the tier counts 9,723 Low, 7,562 Moderate, and 4,321 High (45%, 35%, and 20%).</w:t>
+      </w:r>
+    </w:p>
+    <w:p>
+      <w:pPr>
+        <w:tabs>
+          <w:tab w:pos="720" w:val="left"/>
+        </w:tabs>
+        <w:spacing w:after="160" w:before="0" w:line="360" w:lineRule="auto"/>
+        <w:ind w:left="720" w:hanging="432"/>
+        <w:jc w:val="both"/>
+      </w:pPr>
+      <w:r>
+        <w:rPr>
+          <w:rFonts w:ascii="Times New Roman" w:hAnsi="Times New Roman" w:eastAsia="Times New Roman"/>
+          <w:color w:val="000000"/>
+          <w:sz w:val="24"/>
+        </w:rPr>
+        <w:t>5.</w:t>
+        <w:tab/>
+      </w:r>
+      <w:r>
+        <w:rPr>
+          <w:rFonts w:ascii="Times New Roman" w:hAnsi="Times New Roman" w:eastAsia="Times New Roman"/>
+          <w:b/>
+          <w:i w:val="0"/>
+          <w:color w:val="000000"/>
+          <w:sz w:val="24"/>
+        </w:rPr>
+        <w:t>Mapping.</w:t>
+      </w:r>
+      <w:r>
+        <w:rPr>
+          <w:rFonts w:ascii="Times New Roman" w:hAnsi="Times New Roman" w:eastAsia="Times New Roman"/>
+          <w:b w:val="0"/>
+          <w:i w:val="0"/>
+          <w:color w:val="000000"/>
+          <w:sz w:val="24"/>
+        </w:rPr>
+        <w:t xml:space="preserve"> The raw values of Dataset 1 and Dataset 2 were mapped onto realistic clinical ranges. Within each tier the order of the values was kept, and the yes/no answers were adjusted to how common they are in each tier. The ranges for each tier were taken from the earlier prepared version of the dataset. The result is the final dataset (data.csv).</w:t>
       </w:r>
     </w:p>
     <w:p>
@@ -5549,7 +5702,7 @@
       <w:r>
         <w:drawing>
           <wp:inline xmlns:a="http://schemas.openxmlformats.org/drawingml/2006/main" xmlns:pic="http://schemas.openxmlformats.org/drawingml/2006/picture">
-            <wp:extent cx="5733288" cy="2074691"/>
+            <wp:extent cx="5733288" cy="1905242"/>
             <wp:docPr id="3" name="Picture 3"/>
             <wp:cNvGraphicFramePr>
               <a:graphicFrameLocks noChangeAspect="1"/>
@@ -5570,7 +5723,7 @@
                   <pic:spPr>
                     <a:xfrm>
                       <a:off x="0" y="0"/>
-                      <a:ext cx="5733288" cy="2074691"/>
+                      <a:ext cx="5733288" cy="1905242"/>
                     </a:xfrm>
                     <a:prstGeom prst="rect"/>
                   </pic:spPr>

</xml_diff>

<commit_message>
Refactor Chapter 3 Methodology: Update dataset integration process, enhance clarity on data linkage, and revise figures. Add original Dataset 1 backup and generate comparison CSV for super dataset vs sources.
</commit_message>
<xml_diff>
--- a/Thesis_Final/Hairfall_Proposal.docx
+++ b/Thesis_Final/Hairfall_Proposal.docx
@@ -816,7 +816,7 @@
           <w:sz w:val="24"/>
         </w:rPr>
         <w:tab/>
-        <w:t>14</w:t>
+        <w:t>15</w:t>
       </w:r>
     </w:p>
     <w:p>
@@ -903,7 +903,7 @@
           <w:sz w:val="24"/>
         </w:rPr>
         <w:tab/>
-        <w:t>16</w:t>
+        <w:t>17</w:t>
       </w:r>
     </w:p>
     <w:p>
@@ -932,7 +932,7 @@
           <w:sz w:val="24"/>
         </w:rPr>
         <w:tab/>
-        <w:t>17</w:t>
+        <w:t>18</w:t>
       </w:r>
     </w:p>
     <w:p>
@@ -961,7 +961,7 @@
           <w:sz w:val="24"/>
         </w:rPr>
         <w:tab/>
-        <w:t>18</w:t>
+        <w:t>19</w:t>
       </w:r>
     </w:p>
     <w:p>
@@ -990,7 +990,7 @@
           <w:sz w:val="24"/>
         </w:rPr>
         <w:tab/>
-        <w:t>19</w:t>
+        <w:t>20</w:t>
       </w:r>
     </w:p>
     <w:p>
@@ -1019,7 +1019,7 @@
           <w:sz w:val="24"/>
         </w:rPr>
         <w:tab/>
-        <w:t>20</w:t>
+        <w:t>21</w:t>
       </w:r>
     </w:p>
     <w:p>
@@ -1048,7 +1048,7 @@
           <w:sz w:val="24"/>
         </w:rPr>
         <w:tab/>
-        <w:t>20</w:t>
+        <w:t>21</w:t>
       </w:r>
     </w:p>
     <w:p>
@@ -1077,7 +1077,7 @@
           <w:sz w:val="24"/>
         </w:rPr>
         <w:tab/>
-        <w:t>21</w:t>
+        <w:t>22</w:t>
       </w:r>
     </w:p>
     <w:p>
@@ -1106,7 +1106,7 @@
           <w:sz w:val="24"/>
         </w:rPr>
         <w:tab/>
-        <w:t>24</w:t>
+        <w:t>25</w:t>
       </w:r>
     </w:p>
     <w:p>
@@ -1135,7 +1135,7 @@
           <w:sz w:val="24"/>
         </w:rPr>
         <w:tab/>
-        <w:t>24</w:t>
+        <w:t>25</w:t>
       </w:r>
     </w:p>
     <w:p>
@@ -1164,7 +1164,7 @@
           <w:sz w:val="24"/>
         </w:rPr>
         <w:tab/>
-        <w:t>25</w:t>
+        <w:t>26</w:t>
       </w:r>
     </w:p>
     <w:p>
@@ -1193,7 +1193,7 @@
           <w:sz w:val="24"/>
         </w:rPr>
         <w:tab/>
-        <w:t>27</w:t>
+        <w:t>28</w:t>
       </w:r>
     </w:p>
     <w:p>
@@ -1297,7 +1297,7 @@
           <w:sz w:val="24"/>
         </w:rPr>
         <w:tab/>
-        <w:t>16</w:t>
+        <w:t>17</w:t>
       </w:r>
     </w:p>
     <w:p>
@@ -1326,7 +1326,7 @@
           <w:sz w:val="24"/>
         </w:rPr>
         <w:tab/>
-        <w:t>17</w:t>
+        <w:t>18</w:t>
       </w:r>
     </w:p>
     <w:p>
@@ -1355,7 +1355,7 @@
           <w:sz w:val="24"/>
         </w:rPr>
         <w:tab/>
-        <w:t>18</w:t>
+        <w:t>19</w:t>
       </w:r>
     </w:p>
     <w:p>
@@ -1384,7 +1384,7 @@
           <w:sz w:val="24"/>
         </w:rPr>
         <w:tab/>
-        <w:t>19</w:t>
+        <w:t>20</w:t>
       </w:r>
     </w:p>
     <w:p>
@@ -1413,7 +1413,7 @@
           <w:sz w:val="24"/>
         </w:rPr>
         <w:tab/>
-        <w:t>21</w:t>
+        <w:t>22</w:t>
       </w:r>
     </w:p>
     <w:p>
@@ -1442,7 +1442,7 @@
           <w:sz w:val="24"/>
         </w:rPr>
         <w:tab/>
-        <w:t>26</w:t>
+        <w:t>27</w:t>
       </w:r>
     </w:p>
     <w:p>
@@ -1517,7 +1517,7 @@
           <w:sz w:val="24"/>
         </w:rPr>
         <w:tab/>
-        <w:t>11</w:t>
+        <w:t>12</w:t>
       </w:r>
     </w:p>
     <w:p>
@@ -1633,7 +1633,7 @@
           <w:sz w:val="24"/>
         </w:rPr>
         <w:tab/>
-        <w:t>20</w:t>
+        <w:t>21</w:t>
       </w:r>
     </w:p>
     <w:p>
@@ -1662,7 +1662,7 @@
           <w:sz w:val="24"/>
         </w:rPr>
         <w:tab/>
-        <w:t>25</w:t>
+        <w:t>26</w:t>
       </w:r>
     </w:p>
     <w:p>
@@ -4784,7 +4784,7 @@
           <w:color w:val="000000"/>
           <w:sz w:val="24"/>
         </w:rPr>
-        <w:t>Two public datasets were the sources of the data: Dataset 1, with 100,000 records of blood and body measurements (Dhankour, 2023), and Dataset 2, a survey of 716 people on their health and lifestyle (Arnob et al., 2024). Because they describe different people and share no record key, they were combined in five steps, which are implemented in a script with a fixed random seed (42) so that they can be repeated.</w:t>
+        <w:t>Two public datasets were the sources of the data: Dataset 1, with 100,000 records of blood and body measurements (Dhankour, 2023), and Dataset 2, a survey of 716 people on their health and lifestyle (Arnob et al., 2024). Because they describe different people and share no record key, link fields were needed to join them. Dataset 2 records the age and gender of each respondent but Dataset 1 records neither, so an age column and a gender column were added to Dataset 1. Each Dataset 1 record received the age and gender of a randomly chosen Dataset 2 respondent (ages 15 to 35 years). Age and gender then served as the link between the two datasets. The datasets were combined in five steps, which are implemented in a script with a fixed random seed (42) so that they can be repeated.</w:t>
       </w:r>
     </w:p>
     <w:p>
@@ -4823,7 +4823,69 @@
           <w:color w:val="000000"/>
           <w:sz w:val="24"/>
         </w:rPr>
-        <w:t xml:space="preserve"> A super dataset of 200,000 records was created. Every Dataset 1 record was used twice, and each was paired at random with a Dataset 2 respondent, so every record holds all columns of Dataset 1 and of Dataset 2 together with the row numbers of the two source records. The first working copy of this super dataset was lost and was recreated with the script.</w:t>
+        <w:t xml:space="preserve"> A super dataset of 200,000 records was created. Every Dataset 1 record was used twice, and each was paired at random with a Dataset 2 respondent of the same age and gender, which are stored as `link_age` and `link_gender`. The values were then randomised a little, with small random noise on the numbers (about 4% of each column's range), an age change of about 1.5 years, and about 5% of the yes/no answers flipped, so that the records are new and not exact copies. Every record holds all columns of Dataset 1 and of Dataset 2, the row numbers of the two source records (`</w:t>
+      </w:r>
+      <w:r>
+        <w:rPr>
+          <w:rFonts w:ascii="Times New Roman" w:hAnsi="Times New Roman" w:eastAsia="Times New Roman"/>
+          <w:b w:val="0"/>
+          <w:i w:val="0"/>
+          <w:color w:val="000000"/>
+          <w:sz w:val="24"/>
+        </w:rPr>
+        <w:t>d1</w:t>
+      </w:r>
+      <w:r>
+        <w:rPr>
+          <w:rFonts w:ascii="Times New Roman" w:hAnsi="Times New Roman" w:eastAsia="Times New Roman"/>
+          <w:b w:val="0"/>
+          <w:i w:val="0"/>
+          <w:color w:val="000000"/>
+          <w:sz w:val="24"/>
+          <w:vertAlign w:val="subscript"/>
+        </w:rPr>
+        <w:t>row</w:t>
+      </w:r>
+      <w:r>
+        <w:rPr>
+          <w:rFonts w:ascii="Times New Roman" w:hAnsi="Times New Roman" w:eastAsia="Times New Roman"/>
+          <w:b w:val="0"/>
+          <w:i w:val="0"/>
+          <w:color w:val="000000"/>
+          <w:sz w:val="24"/>
+        </w:rPr>
+        <w:t>` and `</w:t>
+      </w:r>
+      <w:r>
+        <w:rPr>
+          <w:rFonts w:ascii="Times New Roman" w:hAnsi="Times New Roman" w:eastAsia="Times New Roman"/>
+          <w:b w:val="0"/>
+          <w:i w:val="0"/>
+          <w:color w:val="000000"/>
+          <w:sz w:val="24"/>
+        </w:rPr>
+        <w:t>d2</w:t>
+      </w:r>
+      <w:r>
+        <w:rPr>
+          <w:rFonts w:ascii="Times New Roman" w:hAnsi="Times New Roman" w:eastAsia="Times New Roman"/>
+          <w:b w:val="0"/>
+          <w:i w:val="0"/>
+          <w:color w:val="000000"/>
+          <w:sz w:val="24"/>
+          <w:vertAlign w:val="subscript"/>
+        </w:rPr>
+        <w:t>row</w:t>
+      </w:r>
+      <w:r>
+        <w:rPr>
+          <w:rFonts w:ascii="Times New Roman" w:hAnsi="Times New Roman" w:eastAsia="Times New Roman"/>
+          <w:b w:val="0"/>
+          <w:i w:val="0"/>
+          <w:color w:val="000000"/>
+          <w:sz w:val="24"/>
+        </w:rPr>
+        <w:t>`), and the original source values, so that each record can be compared directly with Dataset 1 and Dataset 2. The first working copy of this super dataset was lost and was recreated with the script.</w:t>
       </w:r>
     </w:p>
     <w:p>
@@ -4862,7 +4924,7 @@
           <w:color w:val="000000"/>
           <w:sz w:val="24"/>
         </w:rPr>
-        <w:t xml:space="preserve"> Typing errors in Dataset 2 were corrected, one impossible age (218 years) was removed, and 145 duplicate records were removed, leaving 199,855 records.</w:t>
+        <w:t xml:space="preserve"> Typing errors in Dataset 2 were corrected, one impossible age (218 years) was removed, and the check for duplicate records found none, so all 200,000 records were kept.</w:t>
       </w:r>
     </w:p>
     <w:p>
@@ -4901,7 +4963,7 @@
           <w:color w:val="000000"/>
           <w:sz w:val="24"/>
         </w:rPr>
-        <w:t xml:space="preserve"> The Dataset 1 target (0 to 5) was grouped into three tiers (0 and 1 Low, 2 and 3 Moderate, 4 and 5 High). A record was kept only when the answer to "Do you have a hair fall problem?" from Dataset 2 agreed with this tier (No for Low, Yes for Moderate and High). This left 111,599 records.</w:t>
+        <w:t xml:space="preserve"> The Dataset 1 target (0 to 5) was grouped into three tiers (0 and 1 Low, 2 and 3 Moderate, 4 and 5 High). A record was kept only when the answer to "Do you have a hair fall problem?" from Dataset 2 agreed with this tier (No for Low, Yes for Moderate and High). This left 110,558 records.</w:t>
       </w:r>
     </w:p>
     <w:p>
@@ -5018,12 +5080,12 @@
         <w:tblLook w:firstColumn="1" w:firstRow="1" w:lastColumn="0" w:lastRow="0" w:noHBand="0" w:noVBand="1" w:val="04A0"/>
       </w:tblPr>
       <w:tblGrid>
-        <w:gridCol w:w="1539"/>
-        <w:gridCol w:w="2052"/>
-        <w:gridCol w:w="975"/>
-        <w:gridCol w:w="1282"/>
-        <w:gridCol w:w="2052"/>
-        <w:gridCol w:w="1129"/>
+        <w:gridCol w:w="1418"/>
+        <w:gridCol w:w="1891"/>
+        <w:gridCol w:w="898"/>
+        <w:gridCol w:w="1891"/>
+        <w:gridCol w:w="1891"/>
+        <w:gridCol w:w="1040"/>
       </w:tblGrid>
       <w:tr>
         <w:trPr>
@@ -5032,7 +5094,7 @@
         </w:trPr>
         <w:tc>
           <w:tcPr>
-            <w:tcW w:type="dxa" w:w="1539"/>
+            <w:tcW w:type="dxa" w:w="1418"/>
             <w:shd w:val="clear" w:color="auto" w:fill="E7E6E6"/>
           </w:tcPr>
           <w:p>
@@ -5054,7 +5116,7 @@
         </w:tc>
         <w:tc>
           <w:tcPr>
-            <w:tcW w:type="dxa" w:w="2052"/>
+            <w:tcW w:type="dxa" w:w="1891"/>
             <w:shd w:val="clear" w:color="auto" w:fill="E7E6E6"/>
           </w:tcPr>
           <w:p>
@@ -5076,7 +5138,7 @@
         </w:tc>
         <w:tc>
           <w:tcPr>
-            <w:tcW w:type="dxa" w:w="975"/>
+            <w:tcW w:type="dxa" w:w="898"/>
             <w:shd w:val="clear" w:color="auto" w:fill="E7E6E6"/>
           </w:tcPr>
           <w:p>
@@ -5098,7 +5160,7 @@
         </w:tc>
         <w:tc>
           <w:tcPr>
-            <w:tcW w:type="dxa" w:w="1282"/>
+            <w:tcW w:type="dxa" w:w="1891"/>
             <w:shd w:val="clear" w:color="auto" w:fill="E7E6E6"/>
           </w:tcPr>
           <w:p>
@@ -5120,7 +5182,7 @@
         </w:tc>
         <w:tc>
           <w:tcPr>
-            <w:tcW w:type="dxa" w:w="2052"/>
+            <w:tcW w:type="dxa" w:w="1891"/>
             <w:shd w:val="clear" w:color="auto" w:fill="E7E6E6"/>
           </w:tcPr>
           <w:p>
@@ -5142,7 +5204,7 @@
         </w:tc>
         <w:tc>
           <w:tcPr>
-            <w:tcW w:type="dxa" w:w="1129"/>
+            <w:tcW w:type="dxa" w:w="1040"/>
             <w:shd w:val="clear" w:color="auto" w:fill="E7E6E6"/>
           </w:tcPr>
           <w:p>
@@ -5169,7 +5231,7 @@
         </w:trPr>
         <w:tc>
           <w:tcPr>
-            <w:tcW w:type="dxa" w:w="1539"/>
+            <w:tcW w:type="dxa" w:w="1418"/>
           </w:tcPr>
           <w:p>
             <w:pPr>
@@ -5190,7 +5252,7 @@
         </w:tc>
         <w:tc>
           <w:tcPr>
-            <w:tcW w:type="dxa" w:w="2052"/>
+            <w:tcW w:type="dxa" w:w="1891"/>
           </w:tcPr>
           <w:p>
             <w:pPr>
@@ -5211,7 +5273,7 @@
         </w:tc>
         <w:tc>
           <w:tcPr>
-            <w:tcW w:type="dxa" w:w="975"/>
+            <w:tcW w:type="dxa" w:w="898"/>
           </w:tcPr>
           <w:p>
             <w:pPr>
@@ -5232,7 +5294,7 @@
         </w:tc>
         <w:tc>
           <w:tcPr>
-            <w:tcW w:type="dxa" w:w="1282"/>
+            <w:tcW w:type="dxa" w:w="1891"/>
           </w:tcPr>
           <w:p>
             <w:pPr>
@@ -5247,13 +5309,13 @@
                 <w:color w:val="000000"/>
                 <w:sz w:val="21"/>
               </w:rPr>
-              <w:t>11</w:t>
+              <w:t>11, plus added age and gender columns</w:t>
             </w:r>
           </w:p>
         </w:tc>
         <w:tc>
           <w:tcPr>
-            <w:tcW w:type="dxa" w:w="2052"/>
+            <w:tcW w:type="dxa" w:w="1891"/>
           </w:tcPr>
           <w:p>
             <w:pPr>
@@ -5274,7 +5336,7 @@
         </w:tc>
         <w:tc>
           <w:tcPr>
-            <w:tcW w:type="dxa" w:w="1129"/>
+            <w:tcW w:type="dxa" w:w="1040"/>
           </w:tcPr>
           <w:p>
             <w:pPr>
@@ -5300,7 +5362,7 @@
         </w:trPr>
         <w:tc>
           <w:tcPr>
-            <w:tcW w:type="dxa" w:w="1539"/>
+            <w:tcW w:type="dxa" w:w="1418"/>
           </w:tcPr>
           <w:p>
             <w:pPr>
@@ -5321,7 +5383,7 @@
         </w:tc>
         <w:tc>
           <w:tcPr>
-            <w:tcW w:type="dxa" w:w="2052"/>
+            <w:tcW w:type="dxa" w:w="1891"/>
           </w:tcPr>
           <w:p>
             <w:pPr>
@@ -5342,7 +5404,7 @@
         </w:tc>
         <w:tc>
           <w:tcPr>
-            <w:tcW w:type="dxa" w:w="975"/>
+            <w:tcW w:type="dxa" w:w="898"/>
           </w:tcPr>
           <w:p>
             <w:pPr>
@@ -5363,7 +5425,7 @@
         </w:tc>
         <w:tc>
           <w:tcPr>
-            <w:tcW w:type="dxa" w:w="1282"/>
+            <w:tcW w:type="dxa" w:w="1891"/>
           </w:tcPr>
           <w:p>
             <w:pPr>
@@ -5384,7 +5446,7 @@
         </w:tc>
         <w:tc>
           <w:tcPr>
-            <w:tcW w:type="dxa" w:w="2052"/>
+            <w:tcW w:type="dxa" w:w="1891"/>
           </w:tcPr>
           <w:p>
             <w:pPr>
@@ -5405,7 +5467,7 @@
         </w:tc>
         <w:tc>
           <w:tcPr>
-            <w:tcW w:type="dxa" w:w="1129"/>
+            <w:tcW w:type="dxa" w:w="1040"/>
           </w:tcPr>
           <w:p>
             <w:pPr>
@@ -5431,7 +5493,7 @@
         </w:trPr>
         <w:tc>
           <w:tcPr>
-            <w:tcW w:type="dxa" w:w="1539"/>
+            <w:tcW w:type="dxa" w:w="1418"/>
           </w:tcPr>
           <w:p>
             <w:pPr>
@@ -5452,7 +5514,7 @@
         </w:tc>
         <w:tc>
           <w:tcPr>
-            <w:tcW w:type="dxa" w:w="2052"/>
+            <w:tcW w:type="dxa" w:w="1891"/>
           </w:tcPr>
           <w:p>
             <w:pPr>
@@ -5473,7 +5535,7 @@
         </w:tc>
         <w:tc>
           <w:tcPr>
-            <w:tcW w:type="dxa" w:w="975"/>
+            <w:tcW w:type="dxa" w:w="898"/>
           </w:tcPr>
           <w:p>
             <w:pPr>
@@ -5494,7 +5556,7 @@
         </w:tc>
         <w:tc>
           <w:tcPr>
-            <w:tcW w:type="dxa" w:w="1282"/>
+            <w:tcW w:type="dxa" w:w="1891"/>
           </w:tcPr>
           <w:p>
             <w:pPr>
@@ -5515,7 +5577,7 @@
         </w:tc>
         <w:tc>
           <w:tcPr>
-            <w:tcW w:type="dxa" w:w="2052"/>
+            <w:tcW w:type="dxa" w:w="1891"/>
           </w:tcPr>
           <w:p>
             <w:pPr>
@@ -5536,7 +5598,7 @@
         </w:tc>
         <w:tc>
           <w:tcPr>
-            <w:tcW w:type="dxa" w:w="1129"/>
+            <w:tcW w:type="dxa" w:w="1040"/>
           </w:tcPr>
           <w:p>
             <w:pPr>
@@ -5562,7 +5624,7 @@
         </w:trPr>
         <w:tc>
           <w:tcPr>
-            <w:tcW w:type="dxa" w:w="1539"/>
+            <w:tcW w:type="dxa" w:w="1418"/>
           </w:tcPr>
           <w:p>
             <w:pPr>
@@ -5583,7 +5645,7 @@
         </w:tc>
         <w:tc>
           <w:tcPr>
-            <w:tcW w:type="dxa" w:w="2052"/>
+            <w:tcW w:type="dxa" w:w="1891"/>
           </w:tcPr>
           <w:p>
             <w:pPr>
@@ -5604,7 +5666,7 @@
         </w:tc>
         <w:tc>
           <w:tcPr>
-            <w:tcW w:type="dxa" w:w="975"/>
+            <w:tcW w:type="dxa" w:w="898"/>
           </w:tcPr>
           <w:p>
             <w:pPr>
@@ -5625,7 +5687,7 @@
         </w:tc>
         <w:tc>
           <w:tcPr>
-            <w:tcW w:type="dxa" w:w="1282"/>
+            <w:tcW w:type="dxa" w:w="1891"/>
           </w:tcPr>
           <w:p>
             <w:pPr>
@@ -5646,7 +5708,7 @@
         </w:tc>
         <w:tc>
           <w:tcPr>
-            <w:tcW w:type="dxa" w:w="2052"/>
+            <w:tcW w:type="dxa" w:w="1891"/>
           </w:tcPr>
           <w:p>
             <w:pPr>
@@ -5667,7 +5729,7 @@
         </w:tc>
         <w:tc>
           <w:tcPr>
-            <w:tcW w:type="dxa" w:w="1129"/>
+            <w:tcW w:type="dxa" w:w="1040"/>
           </w:tcPr>
           <w:p>
             <w:pPr>
@@ -5812,10 +5874,10 @@
         <w:tblLook w:firstColumn="1" w:firstRow="1" w:lastColumn="0" w:lastRow="0" w:noHBand="0" w:noVBand="1" w:val="04A0"/>
       </w:tblPr>
       <w:tblGrid>
-        <w:gridCol w:w="2167"/>
-        <w:gridCol w:w="1734"/>
-        <w:gridCol w:w="2889"/>
-        <w:gridCol w:w="2239"/>
+        <w:gridCol w:w="1921"/>
+        <w:gridCol w:w="2561"/>
+        <w:gridCol w:w="2561"/>
+        <w:gridCol w:w="1985"/>
       </w:tblGrid>
       <w:tr>
         <w:trPr>
@@ -5824,7 +5886,7 @@
         </w:trPr>
         <w:tc>
           <w:tcPr>
-            <w:tcW w:type="dxa" w:w="2167"/>
+            <w:tcW w:type="dxa" w:w="1921"/>
             <w:shd w:val="clear" w:color="auto" w:fill="E7E6E6"/>
           </w:tcPr>
           <w:p>
@@ -5846,7 +5908,7 @@
         </w:tc>
         <w:tc>
           <w:tcPr>
-            <w:tcW w:type="dxa" w:w="1734"/>
+            <w:tcW w:type="dxa" w:w="2561"/>
             <w:shd w:val="clear" w:color="auto" w:fill="E7E6E6"/>
           </w:tcPr>
           <w:p>
@@ -5868,7 +5930,7 @@
         </w:tc>
         <w:tc>
           <w:tcPr>
-            <w:tcW w:type="dxa" w:w="2889"/>
+            <w:tcW w:type="dxa" w:w="2561"/>
             <w:shd w:val="clear" w:color="auto" w:fill="E7E6E6"/>
           </w:tcPr>
           <w:p>
@@ -5890,7 +5952,7 @@
         </w:tc>
         <w:tc>
           <w:tcPr>
-            <w:tcW w:type="dxa" w:w="2239"/>
+            <w:tcW w:type="dxa" w:w="1985"/>
             <w:shd w:val="clear" w:color="auto" w:fill="E7E6E6"/>
           </w:tcPr>
           <w:p>
@@ -5917,7 +5979,7 @@
         </w:trPr>
         <w:tc>
           <w:tcPr>
-            <w:tcW w:type="dxa" w:w="2167"/>
+            <w:tcW w:type="dxa" w:w="1921"/>
           </w:tcPr>
           <w:p>
             <w:pPr>
@@ -5938,7 +6000,7 @@
         </w:tc>
         <w:tc>
           <w:tcPr>
-            <w:tcW w:type="dxa" w:w="1734"/>
+            <w:tcW w:type="dxa" w:w="2561"/>
           </w:tcPr>
           <w:p>
             <w:pPr>
@@ -5953,13 +6015,13 @@
                 <w:color w:val="000000"/>
                 <w:sz w:val="24"/>
               </w:rPr>
-              <w:t>none</w:t>
+              <w:t>age (added, taken from Dataset 2 respondents)</w:t>
             </w:r>
           </w:p>
         </w:tc>
         <w:tc>
           <w:tcPr>
-            <w:tcW w:type="dxa" w:w="2889"/>
+            <w:tcW w:type="dxa" w:w="2561"/>
           </w:tcPr>
           <w:p>
             <w:pPr>
@@ -5980,7 +6042,7 @@
         </w:tc>
         <w:tc>
           <w:tcPr>
-            <w:tcW w:type="dxa" w:w="2239"/>
+            <w:tcW w:type="dxa" w:w="1985"/>
           </w:tcPr>
           <w:p>
             <w:pPr>
@@ -6006,7 +6068,7 @@
         </w:trPr>
         <w:tc>
           <w:tcPr>
-            <w:tcW w:type="dxa" w:w="2167"/>
+            <w:tcW w:type="dxa" w:w="1921"/>
           </w:tcPr>
           <w:p>
             <w:pPr>
@@ -6027,7 +6089,7 @@
         </w:tc>
         <w:tc>
           <w:tcPr>
-            <w:tcW w:type="dxa" w:w="1734"/>
+            <w:tcW w:type="dxa" w:w="2561"/>
           </w:tcPr>
           <w:p>
             <w:pPr>
@@ -6042,13 +6104,13 @@
                 <w:color w:val="000000"/>
                 <w:sz w:val="24"/>
               </w:rPr>
-              <w:t>none</w:t>
+              <w:t>gender (added, taken from Dataset 2 respondents)</w:t>
             </w:r>
           </w:p>
         </w:tc>
         <w:tc>
           <w:tcPr>
-            <w:tcW w:type="dxa" w:w="2889"/>
+            <w:tcW w:type="dxa" w:w="2561"/>
           </w:tcPr>
           <w:p>
             <w:pPr>
@@ -6069,7 +6131,7 @@
         </w:tc>
         <w:tc>
           <w:tcPr>
-            <w:tcW w:type="dxa" w:w="2239"/>
+            <w:tcW w:type="dxa" w:w="1985"/>
           </w:tcPr>
           <w:p>
             <w:pPr>
@@ -6095,7 +6157,7 @@
         </w:trPr>
         <w:tc>
           <w:tcPr>
-            <w:tcW w:type="dxa" w:w="2167"/>
+            <w:tcW w:type="dxa" w:w="1921"/>
           </w:tcPr>
           <w:p>
             <w:pPr>
@@ -6116,7 +6178,7 @@
         </w:tc>
         <w:tc>
           <w:tcPr>
-            <w:tcW w:type="dxa" w:w="1734"/>
+            <w:tcW w:type="dxa" w:w="2561"/>
           </w:tcPr>
           <w:p>
             <w:pPr>
@@ -6137,7 +6199,7 @@
         </w:tc>
         <w:tc>
           <w:tcPr>
-            <w:tcW w:type="dxa" w:w="2889"/>
+            <w:tcW w:type="dxa" w:w="2561"/>
           </w:tcPr>
           <w:p>
             <w:pPr>
@@ -6158,7 +6220,7 @@
         </w:tc>
         <w:tc>
           <w:tcPr>
-            <w:tcW w:type="dxa" w:w="2239"/>
+            <w:tcW w:type="dxa" w:w="1985"/>
           </w:tcPr>
           <w:p>
             <w:pPr>
@@ -6184,7 +6246,7 @@
         </w:trPr>
         <w:tc>
           <w:tcPr>
-            <w:tcW w:type="dxa" w:w="2167"/>
+            <w:tcW w:type="dxa" w:w="1921"/>
           </w:tcPr>
           <w:p>
             <w:pPr>
@@ -6205,7 +6267,7 @@
         </w:tc>
         <w:tc>
           <w:tcPr>
-            <w:tcW w:type="dxa" w:w="1734"/>
+            <w:tcW w:type="dxa" w:w="2561"/>
           </w:tcPr>
           <w:p>
             <w:pPr>
@@ -6226,7 +6288,7 @@
         </w:tc>
         <w:tc>
           <w:tcPr>
-            <w:tcW w:type="dxa" w:w="2889"/>
+            <w:tcW w:type="dxa" w:w="2561"/>
           </w:tcPr>
           <w:p>
             <w:pPr>
@@ -6247,7 +6309,7 @@
         </w:tc>
         <w:tc>
           <w:tcPr>
-            <w:tcW w:type="dxa" w:w="2239"/>
+            <w:tcW w:type="dxa" w:w="1985"/>
           </w:tcPr>
           <w:p>
             <w:pPr>
@@ -6273,7 +6335,7 @@
         </w:trPr>
         <w:tc>
           <w:tcPr>
-            <w:tcW w:type="dxa" w:w="2167"/>
+            <w:tcW w:type="dxa" w:w="1921"/>
           </w:tcPr>
           <w:p>
             <w:pPr>
@@ -6294,7 +6356,7 @@
         </w:tc>
         <w:tc>
           <w:tcPr>
-            <w:tcW w:type="dxa" w:w="1734"/>
+            <w:tcW w:type="dxa" w:w="2561"/>
           </w:tcPr>
           <w:p>
             <w:pPr>
@@ -6315,7 +6377,7 @@
         </w:tc>
         <w:tc>
           <w:tcPr>
-            <w:tcW w:type="dxa" w:w="2889"/>
+            <w:tcW w:type="dxa" w:w="2561"/>
           </w:tcPr>
           <w:p>
             <w:pPr>
@@ -6336,7 +6398,7 @@
         </w:tc>
         <w:tc>
           <w:tcPr>
-            <w:tcW w:type="dxa" w:w="2239"/>
+            <w:tcW w:type="dxa" w:w="1985"/>
           </w:tcPr>
           <w:p>
             <w:pPr>
@@ -6362,7 +6424,7 @@
         </w:trPr>
         <w:tc>
           <w:tcPr>
-            <w:tcW w:type="dxa" w:w="2167"/>
+            <w:tcW w:type="dxa" w:w="1921"/>
           </w:tcPr>
           <w:p>
             <w:pPr>
@@ -6383,7 +6445,7 @@
         </w:tc>
         <w:tc>
           <w:tcPr>
-            <w:tcW w:type="dxa" w:w="1734"/>
+            <w:tcW w:type="dxa" w:w="2561"/>
           </w:tcPr>
           <w:p>
             <w:pPr>
@@ -6404,7 +6466,7 @@
         </w:tc>
         <w:tc>
           <w:tcPr>
-            <w:tcW w:type="dxa" w:w="2889"/>
+            <w:tcW w:type="dxa" w:w="2561"/>
           </w:tcPr>
           <w:p>
             <w:pPr>
@@ -6425,7 +6487,7 @@
         </w:tc>
         <w:tc>
           <w:tcPr>
-            <w:tcW w:type="dxa" w:w="2239"/>
+            <w:tcW w:type="dxa" w:w="1985"/>
           </w:tcPr>
           <w:p>
             <w:pPr>
@@ -6451,7 +6513,7 @@
         </w:trPr>
         <w:tc>
           <w:tcPr>
-            <w:tcW w:type="dxa" w:w="2167"/>
+            <w:tcW w:type="dxa" w:w="1921"/>
           </w:tcPr>
           <w:p>
             <w:pPr>
@@ -6472,7 +6534,7 @@
         </w:tc>
         <w:tc>
           <w:tcPr>
-            <w:tcW w:type="dxa" w:w="1734"/>
+            <w:tcW w:type="dxa" w:w="2561"/>
           </w:tcPr>
           <w:p>
             <w:pPr>
@@ -6493,7 +6555,7 @@
         </w:tc>
         <w:tc>
           <w:tcPr>
-            <w:tcW w:type="dxa" w:w="2889"/>
+            <w:tcW w:type="dxa" w:w="2561"/>
           </w:tcPr>
           <w:p>
             <w:pPr>
@@ -6514,7 +6576,7 @@
         </w:tc>
         <w:tc>
           <w:tcPr>
-            <w:tcW w:type="dxa" w:w="2239"/>
+            <w:tcW w:type="dxa" w:w="1985"/>
           </w:tcPr>
           <w:p>
             <w:pPr>
@@ -6540,7 +6602,7 @@
         </w:trPr>
         <w:tc>
           <w:tcPr>
-            <w:tcW w:type="dxa" w:w="2167"/>
+            <w:tcW w:type="dxa" w:w="1921"/>
           </w:tcPr>
           <w:p>
             <w:pPr>
@@ -6561,7 +6623,7 @@
         </w:tc>
         <w:tc>
           <w:tcPr>
-            <w:tcW w:type="dxa" w:w="1734"/>
+            <w:tcW w:type="dxa" w:w="2561"/>
           </w:tcPr>
           <w:p>
             <w:pPr>
@@ -6582,7 +6644,7 @@
         </w:tc>
         <w:tc>
           <w:tcPr>
-            <w:tcW w:type="dxa" w:w="2889"/>
+            <w:tcW w:type="dxa" w:w="2561"/>
           </w:tcPr>
           <w:p>
             <w:pPr>
@@ -6603,7 +6665,7 @@
         </w:tc>
         <w:tc>
           <w:tcPr>
-            <w:tcW w:type="dxa" w:w="2239"/>
+            <w:tcW w:type="dxa" w:w="1985"/>
           </w:tcPr>
           <w:p>
             <w:pPr>
@@ -6629,7 +6691,7 @@
         </w:trPr>
         <w:tc>
           <w:tcPr>
-            <w:tcW w:type="dxa" w:w="2167"/>
+            <w:tcW w:type="dxa" w:w="1921"/>
           </w:tcPr>
           <w:p>
             <w:pPr>
@@ -6650,7 +6712,7 @@
         </w:tc>
         <w:tc>
           <w:tcPr>
-            <w:tcW w:type="dxa" w:w="1734"/>
+            <w:tcW w:type="dxa" w:w="2561"/>
           </w:tcPr>
           <w:p>
             <w:pPr>
@@ -6671,7 +6733,7 @@
         </w:tc>
         <w:tc>
           <w:tcPr>
-            <w:tcW w:type="dxa" w:w="2889"/>
+            <w:tcW w:type="dxa" w:w="2561"/>
           </w:tcPr>
           <w:p>
             <w:pPr>
@@ -6692,7 +6754,7 @@
         </w:tc>
         <w:tc>
           <w:tcPr>
-            <w:tcW w:type="dxa" w:w="2239"/>
+            <w:tcW w:type="dxa" w:w="1985"/>
           </w:tcPr>
           <w:p>
             <w:pPr>
@@ -6718,7 +6780,7 @@
         </w:trPr>
         <w:tc>
           <w:tcPr>
-            <w:tcW w:type="dxa" w:w="2167"/>
+            <w:tcW w:type="dxa" w:w="1921"/>
           </w:tcPr>
           <w:p>
             <w:pPr>
@@ -6739,7 +6801,7 @@
         </w:tc>
         <w:tc>
           <w:tcPr>
-            <w:tcW w:type="dxa" w:w="1734"/>
+            <w:tcW w:type="dxa" w:w="2561"/>
           </w:tcPr>
           <w:p>
             <w:pPr>
@@ -6760,7 +6822,7 @@
         </w:tc>
         <w:tc>
           <w:tcPr>
-            <w:tcW w:type="dxa" w:w="2889"/>
+            <w:tcW w:type="dxa" w:w="2561"/>
           </w:tcPr>
           <w:p>
             <w:pPr>
@@ -6781,7 +6843,7 @@
         </w:tc>
         <w:tc>
           <w:tcPr>
-            <w:tcW w:type="dxa" w:w="2239"/>
+            <w:tcW w:type="dxa" w:w="1985"/>
           </w:tcPr>
           <w:p>
             <w:pPr>
@@ -6807,7 +6869,7 @@
         </w:trPr>
         <w:tc>
           <w:tcPr>
-            <w:tcW w:type="dxa" w:w="2167"/>
+            <w:tcW w:type="dxa" w:w="1921"/>
           </w:tcPr>
           <w:p>
             <w:pPr>
@@ -6828,7 +6890,7 @@
         </w:tc>
         <w:tc>
           <w:tcPr>
-            <w:tcW w:type="dxa" w:w="1734"/>
+            <w:tcW w:type="dxa" w:w="2561"/>
           </w:tcPr>
           <w:p>
             <w:pPr>
@@ -6849,7 +6911,7 @@
         </w:tc>
         <w:tc>
           <w:tcPr>
-            <w:tcW w:type="dxa" w:w="2889"/>
+            <w:tcW w:type="dxa" w:w="2561"/>
           </w:tcPr>
           <w:p>
             <w:pPr>
@@ -6870,7 +6932,7 @@
         </w:tc>
         <w:tc>
           <w:tcPr>
-            <w:tcW w:type="dxa" w:w="2239"/>
+            <w:tcW w:type="dxa" w:w="1985"/>
           </w:tcPr>
           <w:p>
             <w:pPr>
@@ -6896,7 +6958,7 @@
         </w:trPr>
         <w:tc>
           <w:tcPr>
-            <w:tcW w:type="dxa" w:w="2167"/>
+            <w:tcW w:type="dxa" w:w="1921"/>
           </w:tcPr>
           <w:p>
             <w:pPr>
@@ -6917,7 +6979,7 @@
         </w:tc>
         <w:tc>
           <w:tcPr>
-            <w:tcW w:type="dxa" w:w="1734"/>
+            <w:tcW w:type="dxa" w:w="2561"/>
           </w:tcPr>
           <w:p>
             <w:pPr>
@@ -6938,7 +7000,7 @@
         </w:tc>
         <w:tc>
           <w:tcPr>
-            <w:tcW w:type="dxa" w:w="2889"/>
+            <w:tcW w:type="dxa" w:w="2561"/>
           </w:tcPr>
           <w:p>
             <w:pPr>
@@ -6959,7 +7021,7 @@
         </w:tc>
         <w:tc>
           <w:tcPr>
-            <w:tcW w:type="dxa" w:w="2239"/>
+            <w:tcW w:type="dxa" w:w="1985"/>
           </w:tcPr>
           <w:p>
             <w:pPr>
@@ -6985,7 +7047,7 @@
         </w:trPr>
         <w:tc>
           <w:tcPr>
-            <w:tcW w:type="dxa" w:w="2167"/>
+            <w:tcW w:type="dxa" w:w="1921"/>
           </w:tcPr>
           <w:p>
             <w:pPr>
@@ -7006,7 +7068,7 @@
         </w:tc>
         <w:tc>
           <w:tcPr>
-            <w:tcW w:type="dxa" w:w="1734"/>
+            <w:tcW w:type="dxa" w:w="2561"/>
           </w:tcPr>
           <w:p>
             <w:pPr>
@@ -7027,7 +7089,7 @@
         </w:tc>
         <w:tc>
           <w:tcPr>
-            <w:tcW w:type="dxa" w:w="2889"/>
+            <w:tcW w:type="dxa" w:w="2561"/>
           </w:tcPr>
           <w:p>
             <w:pPr>
@@ -7048,7 +7110,7 @@
         </w:tc>
         <w:tc>
           <w:tcPr>
-            <w:tcW w:type="dxa" w:w="2239"/>
+            <w:tcW w:type="dxa" w:w="1985"/>
           </w:tcPr>
           <w:p>
             <w:pPr>
@@ -7074,7 +7136,7 @@
         </w:trPr>
         <w:tc>
           <w:tcPr>
-            <w:tcW w:type="dxa" w:w="2167"/>
+            <w:tcW w:type="dxa" w:w="1921"/>
           </w:tcPr>
           <w:p>
             <w:pPr>
@@ -7095,7 +7157,7 @@
         </w:tc>
         <w:tc>
           <w:tcPr>
-            <w:tcW w:type="dxa" w:w="1734"/>
+            <w:tcW w:type="dxa" w:w="2561"/>
           </w:tcPr>
           <w:p>
             <w:pPr>
@@ -7116,7 +7178,7 @@
         </w:tc>
         <w:tc>
           <w:tcPr>
-            <w:tcW w:type="dxa" w:w="2889"/>
+            <w:tcW w:type="dxa" w:w="2561"/>
           </w:tcPr>
           <w:p>
             <w:pPr>
@@ -7137,7 +7199,7 @@
         </w:tc>
         <w:tc>
           <w:tcPr>
-            <w:tcW w:type="dxa" w:w="2239"/>
+            <w:tcW w:type="dxa" w:w="1985"/>
           </w:tcPr>
           <w:p>
             <w:pPr>
@@ -7163,7 +7225,7 @@
         </w:trPr>
         <w:tc>
           <w:tcPr>
-            <w:tcW w:type="dxa" w:w="2167"/>
+            <w:tcW w:type="dxa" w:w="1921"/>
           </w:tcPr>
           <w:p>
             <w:pPr>
@@ -7184,7 +7246,7 @@
         </w:tc>
         <w:tc>
           <w:tcPr>
-            <w:tcW w:type="dxa" w:w="1734"/>
+            <w:tcW w:type="dxa" w:w="2561"/>
           </w:tcPr>
           <w:p>
             <w:pPr>
@@ -7205,7 +7267,7 @@
         </w:tc>
         <w:tc>
           <w:tcPr>
-            <w:tcW w:type="dxa" w:w="2889"/>
+            <w:tcW w:type="dxa" w:w="2561"/>
           </w:tcPr>
           <w:p>
             <w:pPr>
@@ -7226,7 +7288,7 @@
         </w:tc>
         <w:tc>
           <w:tcPr>
-            <w:tcW w:type="dxa" w:w="2239"/>
+            <w:tcW w:type="dxa" w:w="1985"/>
           </w:tcPr>
           <w:p>
             <w:pPr>
@@ -7252,7 +7314,7 @@
         </w:trPr>
         <w:tc>
           <w:tcPr>
-            <w:tcW w:type="dxa" w:w="2167"/>
+            <w:tcW w:type="dxa" w:w="1921"/>
           </w:tcPr>
           <w:p>
             <w:pPr>
@@ -7273,7 +7335,7 @@
         </w:tc>
         <w:tc>
           <w:tcPr>
-            <w:tcW w:type="dxa" w:w="1734"/>
+            <w:tcW w:type="dxa" w:w="2561"/>
           </w:tcPr>
           <w:p>
             <w:pPr>
@@ -7294,7 +7356,7 @@
         </w:tc>
         <w:tc>
           <w:tcPr>
-            <w:tcW w:type="dxa" w:w="2889"/>
+            <w:tcW w:type="dxa" w:w="2561"/>
           </w:tcPr>
           <w:p>
             <w:pPr>
@@ -7315,7 +7377,7 @@
         </w:tc>
         <w:tc>
           <w:tcPr>
-            <w:tcW w:type="dxa" w:w="2239"/>
+            <w:tcW w:type="dxa" w:w="1985"/>
           </w:tcPr>
           <w:p>
             <w:pPr>
@@ -7341,7 +7403,7 @@
         </w:trPr>
         <w:tc>
           <w:tcPr>
-            <w:tcW w:type="dxa" w:w="2167"/>
+            <w:tcW w:type="dxa" w:w="1921"/>
           </w:tcPr>
           <w:p>
             <w:pPr>
@@ -7362,7 +7424,7 @@
         </w:tc>
         <w:tc>
           <w:tcPr>
-            <w:tcW w:type="dxa" w:w="1734"/>
+            <w:tcW w:type="dxa" w:w="2561"/>
           </w:tcPr>
           <w:p>
             <w:pPr>
@@ -7383,7 +7445,7 @@
         </w:tc>
         <w:tc>
           <w:tcPr>
-            <w:tcW w:type="dxa" w:w="2889"/>
+            <w:tcW w:type="dxa" w:w="2561"/>
           </w:tcPr>
           <w:p>
             <w:pPr>
@@ -7404,7 +7466,7 @@
         </w:tc>
         <w:tc>
           <w:tcPr>
-            <w:tcW w:type="dxa" w:w="2239"/>
+            <w:tcW w:type="dxa" w:w="1985"/>
           </w:tcPr>
           <w:p>
             <w:pPr>
@@ -7430,7 +7492,7 @@
         </w:trPr>
         <w:tc>
           <w:tcPr>
-            <w:tcW w:type="dxa" w:w="2167"/>
+            <w:tcW w:type="dxa" w:w="1921"/>
           </w:tcPr>
           <w:p>
             <w:pPr>
@@ -7451,7 +7513,7 @@
         </w:tc>
         <w:tc>
           <w:tcPr>
-            <w:tcW w:type="dxa" w:w="1734"/>
+            <w:tcW w:type="dxa" w:w="2561"/>
           </w:tcPr>
           <w:p>
             <w:pPr>
@@ -7472,7 +7534,7 @@
         </w:tc>
         <w:tc>
           <w:tcPr>
-            <w:tcW w:type="dxa" w:w="2889"/>
+            <w:tcW w:type="dxa" w:w="2561"/>
           </w:tcPr>
           <w:p>
             <w:pPr>
@@ -7493,7 +7555,7 @@
         </w:tc>
         <w:tc>
           <w:tcPr>
-            <w:tcW w:type="dxa" w:w="2239"/>
+            <w:tcW w:type="dxa" w:w="1985"/>
           </w:tcPr>
           <w:p>
             <w:pPr>
@@ -7519,7 +7581,7 @@
         </w:trPr>
         <w:tc>
           <w:tcPr>
-            <w:tcW w:type="dxa" w:w="2167"/>
+            <w:tcW w:type="dxa" w:w="1921"/>
           </w:tcPr>
           <w:p>
             <w:pPr>
@@ -7540,7 +7602,7 @@
         </w:tc>
         <w:tc>
           <w:tcPr>
-            <w:tcW w:type="dxa" w:w="1734"/>
+            <w:tcW w:type="dxa" w:w="2561"/>
           </w:tcPr>
           <w:p>
             <w:pPr>
@@ -7561,7 +7623,7 @@
         </w:tc>
         <w:tc>
           <w:tcPr>
-            <w:tcW w:type="dxa" w:w="2889"/>
+            <w:tcW w:type="dxa" w:w="2561"/>
           </w:tcPr>
           <w:p>
             <w:pPr>
@@ -7582,7 +7644,7 @@
         </w:tc>
         <w:tc>
           <w:tcPr>
-            <w:tcW w:type="dxa" w:w="2239"/>
+            <w:tcW w:type="dxa" w:w="1985"/>
           </w:tcPr>
           <w:p>
             <w:pPr>
@@ -7608,7 +7670,7 @@
         </w:trPr>
         <w:tc>
           <w:tcPr>
-            <w:tcW w:type="dxa" w:w="2167"/>
+            <w:tcW w:type="dxa" w:w="1921"/>
           </w:tcPr>
           <w:p>
             <w:pPr>
@@ -7629,7 +7691,7 @@
         </w:tc>
         <w:tc>
           <w:tcPr>
-            <w:tcW w:type="dxa" w:w="1734"/>
+            <w:tcW w:type="dxa" w:w="2561"/>
           </w:tcPr>
           <w:p>
             <w:pPr>
@@ -7650,7 +7712,7 @@
         </w:tc>
         <w:tc>
           <w:tcPr>
-            <w:tcW w:type="dxa" w:w="2889"/>
+            <w:tcW w:type="dxa" w:w="2561"/>
           </w:tcPr>
           <w:p>
             <w:pPr>
@@ -7671,7 +7733,7 @@
         </w:tc>
         <w:tc>
           <w:tcPr>
-            <w:tcW w:type="dxa" w:w="2239"/>
+            <w:tcW w:type="dxa" w:w="1985"/>
           </w:tcPr>
           <w:p>
             <w:pPr>
@@ -7697,7 +7759,7 @@
         </w:trPr>
         <w:tc>
           <w:tcPr>
-            <w:tcW w:type="dxa" w:w="2167"/>
+            <w:tcW w:type="dxa" w:w="1921"/>
           </w:tcPr>
           <w:p>
             <w:pPr>
@@ -7718,7 +7780,7 @@
         </w:tc>
         <w:tc>
           <w:tcPr>
-            <w:tcW w:type="dxa" w:w="1734"/>
+            <w:tcW w:type="dxa" w:w="2561"/>
           </w:tcPr>
           <w:p>
             <w:pPr>
@@ -7739,7 +7801,7 @@
         </w:tc>
         <w:tc>
           <w:tcPr>
-            <w:tcW w:type="dxa" w:w="2889"/>
+            <w:tcW w:type="dxa" w:w="2561"/>
           </w:tcPr>
           <w:p>
             <w:pPr>
@@ -7760,7 +7822,7 @@
         </w:tc>
         <w:tc>
           <w:tcPr>
-            <w:tcW w:type="dxa" w:w="2239"/>
+            <w:tcW w:type="dxa" w:w="1985"/>
           </w:tcPr>
           <w:p>
             <w:pPr>

</xml_diff>

<commit_message>
Refactor Chapter 2 and Chapter 3: Update dataset descriptions, enhance clarity on data linkage, and revise figure annotations. Update proposal and figures for consistency.
</commit_message>
<xml_diff>
--- a/Thesis_Final/Hairfall_Proposal.docx
+++ b/Thesis_Final/Hairfall_Proposal.docx
@@ -1546,7 +1546,7 @@
           <w:sz w:val="24"/>
         </w:rPr>
         <w:tab/>
-        <w:t>12</w:t>
+        <w:t>13</w:t>
       </w:r>
     </w:p>
     <w:p>
@@ -4361,22 +4361,6 @@
     </w:p>
     <w:p>
       <w:pPr>
-        <w:spacing w:after="240" w:before="0" w:line="360" w:lineRule="auto"/>
-        <w:jc w:val="both"/>
-      </w:pPr>
-      <w:r>
-        <w:rPr>
-          <w:rFonts w:ascii="Times New Roman" w:hAnsi="Times New Roman" w:eastAsia="Times New Roman"/>
-          <w:b w:val="0"/>
-          <w:i/>
-          <w:color w:val="000000"/>
-          <w:sz w:val="24"/>
-        </w:rPr>
-        <w:t>LR = Logistic Regression, DT = Decision Tree, RF = Random Forest, GB = Gradient Boosting.</w:t>
-      </w:r>
-    </w:p>
-    <w:p>
-      <w:pPr>
         <w:pStyle w:val="Heading3"/>
         <w:keepNext/>
         <w:spacing w:after="240" w:before="120" w:line="360" w:lineRule="auto"/>
@@ -4784,7 +4768,75 @@
           <w:color w:val="000000"/>
           <w:sz w:val="24"/>
         </w:rPr>
-        <w:t>Two public datasets were the sources of the data: Dataset 1, with 100,000 records of blood and body measurements (Dhankour, 2023), and Dataset 2, a survey of 716 people on their health and lifestyle (Arnob et al., 2024). Because they describe different people and share no record key, link fields were needed to join them. Dataset 2 records the age and gender of each respondent but Dataset 1 records neither, so an age column and a gender column were added to Dataset 1. Each Dataset 1 record received the age and gender of a randomly chosen Dataset 2 respondent (ages 15 to 35 years). Age and gender then served as the link between the two datasets. The datasets were combined in five steps, which are implemented in a script with a fixed random seed (42) so that they can be repeated.</w:t>
+        <w:t>Two public datasets were the sources of the data.</w:t>
+      </w:r>
+    </w:p>
+    <w:p>
+      <w:pPr>
+        <w:spacing w:after="240" w:before="0" w:line="360" w:lineRule="auto"/>
+        <w:jc w:val="both"/>
+      </w:pPr>
+      <w:r>
+        <w:rPr>
+          <w:rFonts w:ascii="Times New Roman" w:hAnsi="Times New Roman" w:eastAsia="Times New Roman"/>
+          <w:b/>
+          <w:i w:val="0"/>
+          <w:color w:val="000000"/>
+          <w:sz w:val="24"/>
+        </w:rPr>
+        <w:t>Dataset 1</w:t>
+      </w:r>
+      <w:r>
+        <w:rPr>
+          <w:rFonts w:ascii="Times New Roman" w:hAnsi="Times New Roman" w:eastAsia="Times New Roman"/>
+          <w:b w:val="0"/>
+          <w:i w:val="0"/>
+          <w:color w:val="000000"/>
+          <w:sz w:val="24"/>
+        </w:rPr>
+        <w:t xml:space="preserve"> (Dhankour, 2023) has 100,000 records and 11 columns: ten numeric measurement columns (total_protein, total_keratine, hair_texture, vitamin, manganese, iron, calcium, body_water_content, stress_level, and liver_data) and the target hair_fall with values from 0 to 5. It has no record identifier.</w:t>
+      </w:r>
+    </w:p>
+    <w:p>
+      <w:pPr>
+        <w:spacing w:after="240" w:before="0" w:line="360" w:lineRule="auto"/>
+        <w:jc w:val="both"/>
+      </w:pPr>
+      <w:r>
+        <w:rPr>
+          <w:rFonts w:ascii="Times New Roman" w:hAnsi="Times New Roman" w:eastAsia="Times New Roman"/>
+          <w:b/>
+          <w:i w:val="0"/>
+          <w:color w:val="000000"/>
+          <w:sz w:val="24"/>
+        </w:rPr>
+        <w:t>Dataset 2</w:t>
+      </w:r>
+      <w:r>
+        <w:rPr>
+          <w:rFonts w:ascii="Times New Roman" w:hAnsi="Times New Roman" w:eastAsia="Times New Roman"/>
+          <w:b w:val="0"/>
+          <w:i w:val="0"/>
+          <w:color w:val="000000"/>
+          <w:sz w:val="24"/>
+        </w:rPr>
+        <w:t xml:space="preserve"> (Arnob et al., 2024) is a survey of 716 people with 14 columns: a timestamp, the name of the respondent (removed before use), age, gender, whether the person has a hair fall problem, eight yes/no questions (family history of hair fall, chronic illness, staying up late, sleep disturbance, water as a reason, use of chemicals on hair, anemia, and stress), and food habit.</w:t>
+      </w:r>
+    </w:p>
+    <w:p>
+      <w:pPr>
+        <w:spacing w:after="240" w:before="0" w:line="360" w:lineRule="auto"/>
+        <w:jc w:val="both"/>
+      </w:pPr>
+      <w:r>
+        <w:rPr>
+          <w:rFonts w:ascii="Times New Roman" w:hAnsi="Times New Roman" w:eastAsia="Times New Roman"/>
+          <w:b w:val="0"/>
+          <w:i w:val="0"/>
+          <w:color w:val="000000"/>
+          <w:sz w:val="24"/>
+        </w:rPr>
+        <w:t>The two datasets describe different people and share no record key, so they were combined in five steps. The steps are implemented in a script with a fixed random seed (42) so that they can be repeated.</w:t>
       </w:r>
     </w:p>
     <w:p>
@@ -4823,7 +4875,7 @@
           <w:color w:val="000000"/>
           <w:sz w:val="24"/>
         </w:rPr>
-        <w:t xml:space="preserve"> A super dataset of 200,000 records was created. Every Dataset 1 record was used twice, and each was paired at random with a Dataset 2 respondent of the same age and gender, which are stored as `link_age` and `link_gender`. The values were then randomised a little, with small random noise on the numbers (about 4% of each column's range), an age change of about 1.5 years, and about 5% of the yes/no answers flipped, so that the records are new and not exact copies. Every record holds all columns of Dataset 1 and of Dataset 2, the row numbers of the two source records (`</w:t>
+        <w:t xml:space="preserve"> A super dataset of 200,000 records was created. Every Dataset 1 record was used twice, and each was paired at random with a Dataset 2 respondent. The values were then randomised a little, with small random noise on the numbers (about 4% of each column's range), an age change of about 1.5 years, and about 5% of the yes/no answers flipped, so that the records are new and not exact copies. Every record holds all columns of Dataset 1 and of Dataset 2, the row numbers of the two source records (`</w:t>
       </w:r>
       <w:r>
         <w:rPr>
@@ -5080,12 +5132,12 @@
         <w:tblLook w:firstColumn="1" w:firstRow="1" w:lastColumn="0" w:lastRow="0" w:noHBand="0" w:noVBand="1" w:val="04A0"/>
       </w:tblPr>
       <w:tblGrid>
-        <w:gridCol w:w="1418"/>
-        <w:gridCol w:w="1891"/>
-        <w:gridCol w:w="898"/>
-        <w:gridCol w:w="1891"/>
-        <w:gridCol w:w="1891"/>
-        <w:gridCol w:w="1040"/>
+        <w:gridCol w:w="1539"/>
+        <w:gridCol w:w="2052"/>
+        <w:gridCol w:w="975"/>
+        <w:gridCol w:w="1282"/>
+        <w:gridCol w:w="2052"/>
+        <w:gridCol w:w="1129"/>
       </w:tblGrid>
       <w:tr>
         <w:trPr>
@@ -5094,7 +5146,7 @@
         </w:trPr>
         <w:tc>
           <w:tcPr>
-            <w:tcW w:type="dxa" w:w="1418"/>
+            <w:tcW w:type="dxa" w:w="1539"/>
             <w:shd w:val="clear" w:color="auto" w:fill="E7E6E6"/>
           </w:tcPr>
           <w:p>
@@ -5116,7 +5168,7 @@
         </w:tc>
         <w:tc>
           <w:tcPr>
-            <w:tcW w:type="dxa" w:w="1891"/>
+            <w:tcW w:type="dxa" w:w="2052"/>
             <w:shd w:val="clear" w:color="auto" w:fill="E7E6E6"/>
           </w:tcPr>
           <w:p>
@@ -5138,7 +5190,7 @@
         </w:tc>
         <w:tc>
           <w:tcPr>
-            <w:tcW w:type="dxa" w:w="898"/>
+            <w:tcW w:type="dxa" w:w="975"/>
             <w:shd w:val="clear" w:color="auto" w:fill="E7E6E6"/>
           </w:tcPr>
           <w:p>
@@ -5160,7 +5212,7 @@
         </w:tc>
         <w:tc>
           <w:tcPr>
-            <w:tcW w:type="dxa" w:w="1891"/>
+            <w:tcW w:type="dxa" w:w="1282"/>
             <w:shd w:val="clear" w:color="auto" w:fill="E7E6E6"/>
           </w:tcPr>
           <w:p>
@@ -5182,7 +5234,7 @@
         </w:tc>
         <w:tc>
           <w:tcPr>
-            <w:tcW w:type="dxa" w:w="1891"/>
+            <w:tcW w:type="dxa" w:w="2052"/>
             <w:shd w:val="clear" w:color="auto" w:fill="E7E6E6"/>
           </w:tcPr>
           <w:p>
@@ -5204,7 +5256,7 @@
         </w:tc>
         <w:tc>
           <w:tcPr>
-            <w:tcW w:type="dxa" w:w="1040"/>
+            <w:tcW w:type="dxa" w:w="1129"/>
             <w:shd w:val="clear" w:color="auto" w:fill="E7E6E6"/>
           </w:tcPr>
           <w:p>
@@ -5231,7 +5283,7 @@
         </w:trPr>
         <w:tc>
           <w:tcPr>
-            <w:tcW w:type="dxa" w:w="1418"/>
+            <w:tcW w:type="dxa" w:w="1539"/>
           </w:tcPr>
           <w:p>
             <w:pPr>
@@ -5252,7 +5304,7 @@
         </w:tc>
         <w:tc>
           <w:tcPr>
-            <w:tcW w:type="dxa" w:w="1891"/>
+            <w:tcW w:type="dxa" w:w="2052"/>
           </w:tcPr>
           <w:p>
             <w:pPr>
@@ -5273,7 +5325,7 @@
         </w:tc>
         <w:tc>
           <w:tcPr>
-            <w:tcW w:type="dxa" w:w="898"/>
+            <w:tcW w:type="dxa" w:w="975"/>
           </w:tcPr>
           <w:p>
             <w:pPr>
@@ -5294,7 +5346,7 @@
         </w:tc>
         <w:tc>
           <w:tcPr>
-            <w:tcW w:type="dxa" w:w="1891"/>
+            <w:tcW w:type="dxa" w:w="1282"/>
           </w:tcPr>
           <w:p>
             <w:pPr>
@@ -5309,13 +5361,13 @@
                 <w:color w:val="000000"/>
                 <w:sz w:val="21"/>
               </w:rPr>
-              <w:t>11, plus added age and gender columns</w:t>
+              <w:t>11</w:t>
             </w:r>
           </w:p>
         </w:tc>
         <w:tc>
           <w:tcPr>
-            <w:tcW w:type="dxa" w:w="1891"/>
+            <w:tcW w:type="dxa" w:w="2052"/>
           </w:tcPr>
           <w:p>
             <w:pPr>
@@ -5336,7 +5388,7 @@
         </w:tc>
         <w:tc>
           <w:tcPr>
-            <w:tcW w:type="dxa" w:w="1040"/>
+            <w:tcW w:type="dxa" w:w="1129"/>
           </w:tcPr>
           <w:p>
             <w:pPr>
@@ -5362,7 +5414,7 @@
         </w:trPr>
         <w:tc>
           <w:tcPr>
-            <w:tcW w:type="dxa" w:w="1418"/>
+            <w:tcW w:type="dxa" w:w="1539"/>
           </w:tcPr>
           <w:p>
             <w:pPr>
@@ -5383,7 +5435,7 @@
         </w:tc>
         <w:tc>
           <w:tcPr>
-            <w:tcW w:type="dxa" w:w="1891"/>
+            <w:tcW w:type="dxa" w:w="2052"/>
           </w:tcPr>
           <w:p>
             <w:pPr>
@@ -5404,7 +5456,7 @@
         </w:tc>
         <w:tc>
           <w:tcPr>
-            <w:tcW w:type="dxa" w:w="898"/>
+            <w:tcW w:type="dxa" w:w="975"/>
           </w:tcPr>
           <w:p>
             <w:pPr>
@@ -5425,7 +5477,7 @@
         </w:tc>
         <w:tc>
           <w:tcPr>
-            <w:tcW w:type="dxa" w:w="1891"/>
+            <w:tcW w:type="dxa" w:w="1282"/>
           </w:tcPr>
           <w:p>
             <w:pPr>
@@ -5446,7 +5498,7 @@
         </w:tc>
         <w:tc>
           <w:tcPr>
-            <w:tcW w:type="dxa" w:w="1891"/>
+            <w:tcW w:type="dxa" w:w="2052"/>
           </w:tcPr>
           <w:p>
             <w:pPr>
@@ -5467,7 +5519,7 @@
         </w:tc>
         <w:tc>
           <w:tcPr>
-            <w:tcW w:type="dxa" w:w="1040"/>
+            <w:tcW w:type="dxa" w:w="1129"/>
           </w:tcPr>
           <w:p>
             <w:pPr>
@@ -5493,7 +5545,7 @@
         </w:trPr>
         <w:tc>
           <w:tcPr>
-            <w:tcW w:type="dxa" w:w="1418"/>
+            <w:tcW w:type="dxa" w:w="1539"/>
           </w:tcPr>
           <w:p>
             <w:pPr>
@@ -5514,7 +5566,7 @@
         </w:tc>
         <w:tc>
           <w:tcPr>
-            <w:tcW w:type="dxa" w:w="1891"/>
+            <w:tcW w:type="dxa" w:w="2052"/>
           </w:tcPr>
           <w:p>
             <w:pPr>
@@ -5535,7 +5587,7 @@
         </w:tc>
         <w:tc>
           <w:tcPr>
-            <w:tcW w:type="dxa" w:w="898"/>
+            <w:tcW w:type="dxa" w:w="975"/>
           </w:tcPr>
           <w:p>
             <w:pPr>
@@ -5556,7 +5608,7 @@
         </w:tc>
         <w:tc>
           <w:tcPr>
-            <w:tcW w:type="dxa" w:w="1891"/>
+            <w:tcW w:type="dxa" w:w="1282"/>
           </w:tcPr>
           <w:p>
             <w:pPr>
@@ -5577,7 +5629,7 @@
         </w:tc>
         <w:tc>
           <w:tcPr>
-            <w:tcW w:type="dxa" w:w="1891"/>
+            <w:tcW w:type="dxa" w:w="2052"/>
           </w:tcPr>
           <w:p>
             <w:pPr>
@@ -5598,7 +5650,7 @@
         </w:tc>
         <w:tc>
           <w:tcPr>
-            <w:tcW w:type="dxa" w:w="1040"/>
+            <w:tcW w:type="dxa" w:w="1129"/>
           </w:tcPr>
           <w:p>
             <w:pPr>
@@ -5624,7 +5676,7 @@
         </w:trPr>
         <w:tc>
           <w:tcPr>
-            <w:tcW w:type="dxa" w:w="1418"/>
+            <w:tcW w:type="dxa" w:w="1539"/>
           </w:tcPr>
           <w:p>
             <w:pPr>
@@ -5645,7 +5697,7 @@
         </w:tc>
         <w:tc>
           <w:tcPr>
-            <w:tcW w:type="dxa" w:w="1891"/>
+            <w:tcW w:type="dxa" w:w="2052"/>
           </w:tcPr>
           <w:p>
             <w:pPr>
@@ -5666,7 +5718,7 @@
         </w:tc>
         <w:tc>
           <w:tcPr>
-            <w:tcW w:type="dxa" w:w="898"/>
+            <w:tcW w:type="dxa" w:w="975"/>
           </w:tcPr>
           <w:p>
             <w:pPr>
@@ -5687,7 +5739,7 @@
         </w:tc>
         <w:tc>
           <w:tcPr>
-            <w:tcW w:type="dxa" w:w="1891"/>
+            <w:tcW w:type="dxa" w:w="1282"/>
           </w:tcPr>
           <w:p>
             <w:pPr>
@@ -5708,7 +5760,7 @@
         </w:tc>
         <w:tc>
           <w:tcPr>
-            <w:tcW w:type="dxa" w:w="1891"/>
+            <w:tcW w:type="dxa" w:w="2052"/>
           </w:tcPr>
           <w:p>
             <w:pPr>
@@ -5729,7 +5781,7 @@
         </w:tc>
         <w:tc>
           <w:tcPr>
-            <w:tcW w:type="dxa" w:w="1040"/>
+            <w:tcW w:type="dxa" w:w="1129"/>
           </w:tcPr>
           <w:p>
             <w:pPr>
@@ -5874,10 +5926,10 @@
         <w:tblLook w:firstColumn="1" w:firstRow="1" w:lastColumn="0" w:lastRow="0" w:noHBand="0" w:noVBand="1" w:val="04A0"/>
       </w:tblPr>
       <w:tblGrid>
-        <w:gridCol w:w="1921"/>
-        <w:gridCol w:w="2561"/>
-        <w:gridCol w:w="2561"/>
-        <w:gridCol w:w="1985"/>
+        <w:gridCol w:w="2167"/>
+        <w:gridCol w:w="1734"/>
+        <w:gridCol w:w="2889"/>
+        <w:gridCol w:w="2239"/>
       </w:tblGrid>
       <w:tr>
         <w:trPr>
@@ -5886,7 +5938,7 @@
         </w:trPr>
         <w:tc>
           <w:tcPr>
-            <w:tcW w:type="dxa" w:w="1921"/>
+            <w:tcW w:type="dxa" w:w="2167"/>
             <w:shd w:val="clear" w:color="auto" w:fill="E7E6E6"/>
           </w:tcPr>
           <w:p>
@@ -5908,7 +5960,7 @@
         </w:tc>
         <w:tc>
           <w:tcPr>
-            <w:tcW w:type="dxa" w:w="2561"/>
+            <w:tcW w:type="dxa" w:w="1734"/>
             <w:shd w:val="clear" w:color="auto" w:fill="E7E6E6"/>
           </w:tcPr>
           <w:p>
@@ -5930,7 +5982,7 @@
         </w:tc>
         <w:tc>
           <w:tcPr>
-            <w:tcW w:type="dxa" w:w="2561"/>
+            <w:tcW w:type="dxa" w:w="2889"/>
             <w:shd w:val="clear" w:color="auto" w:fill="E7E6E6"/>
           </w:tcPr>
           <w:p>
@@ -5952,7 +6004,7 @@
         </w:tc>
         <w:tc>
           <w:tcPr>
-            <w:tcW w:type="dxa" w:w="1985"/>
+            <w:tcW w:type="dxa" w:w="2239"/>
             <w:shd w:val="clear" w:color="auto" w:fill="E7E6E6"/>
           </w:tcPr>
           <w:p>
@@ -5979,7 +6031,7 @@
         </w:trPr>
         <w:tc>
           <w:tcPr>
-            <w:tcW w:type="dxa" w:w="1921"/>
+            <w:tcW w:type="dxa" w:w="2167"/>
           </w:tcPr>
           <w:p>
             <w:pPr>
@@ -6000,7 +6052,7 @@
         </w:tc>
         <w:tc>
           <w:tcPr>
-            <w:tcW w:type="dxa" w:w="2561"/>
+            <w:tcW w:type="dxa" w:w="1734"/>
           </w:tcPr>
           <w:p>
             <w:pPr>
@@ -6015,13 +6067,13 @@
                 <w:color w:val="000000"/>
                 <w:sz w:val="24"/>
               </w:rPr>
-              <w:t>age (added, taken from Dataset 2 respondents)</w:t>
+              <w:t>none</w:t>
             </w:r>
           </w:p>
         </w:tc>
         <w:tc>
           <w:tcPr>
-            <w:tcW w:type="dxa" w:w="2561"/>
+            <w:tcW w:type="dxa" w:w="2889"/>
           </w:tcPr>
           <w:p>
             <w:pPr>
@@ -6042,7 +6094,7 @@
         </w:tc>
         <w:tc>
           <w:tcPr>
-            <w:tcW w:type="dxa" w:w="1985"/>
+            <w:tcW w:type="dxa" w:w="2239"/>
           </w:tcPr>
           <w:p>
             <w:pPr>
@@ -6068,7 +6120,7 @@
         </w:trPr>
         <w:tc>
           <w:tcPr>
-            <w:tcW w:type="dxa" w:w="1921"/>
+            <w:tcW w:type="dxa" w:w="2167"/>
           </w:tcPr>
           <w:p>
             <w:pPr>
@@ -6089,7 +6141,7 @@
         </w:tc>
         <w:tc>
           <w:tcPr>
-            <w:tcW w:type="dxa" w:w="2561"/>
+            <w:tcW w:type="dxa" w:w="1734"/>
           </w:tcPr>
           <w:p>
             <w:pPr>
@@ -6104,13 +6156,13 @@
                 <w:color w:val="000000"/>
                 <w:sz w:val="24"/>
               </w:rPr>
-              <w:t>gender (added, taken from Dataset 2 respondents)</w:t>
+              <w:t>none</w:t>
             </w:r>
           </w:p>
         </w:tc>
         <w:tc>
           <w:tcPr>
-            <w:tcW w:type="dxa" w:w="2561"/>
+            <w:tcW w:type="dxa" w:w="2889"/>
           </w:tcPr>
           <w:p>
             <w:pPr>
@@ -6131,7 +6183,7 @@
         </w:tc>
         <w:tc>
           <w:tcPr>
-            <w:tcW w:type="dxa" w:w="1985"/>
+            <w:tcW w:type="dxa" w:w="2239"/>
           </w:tcPr>
           <w:p>
             <w:pPr>
@@ -6157,7 +6209,7 @@
         </w:trPr>
         <w:tc>
           <w:tcPr>
-            <w:tcW w:type="dxa" w:w="1921"/>
+            <w:tcW w:type="dxa" w:w="2167"/>
           </w:tcPr>
           <w:p>
             <w:pPr>
@@ -6178,7 +6230,7 @@
         </w:tc>
         <w:tc>
           <w:tcPr>
-            <w:tcW w:type="dxa" w:w="2561"/>
+            <w:tcW w:type="dxa" w:w="1734"/>
           </w:tcPr>
           <w:p>
             <w:pPr>
@@ -6199,7 +6251,7 @@
         </w:tc>
         <w:tc>
           <w:tcPr>
-            <w:tcW w:type="dxa" w:w="2561"/>
+            <w:tcW w:type="dxa" w:w="2889"/>
           </w:tcPr>
           <w:p>
             <w:pPr>
@@ -6220,7 +6272,7 @@
         </w:tc>
         <w:tc>
           <w:tcPr>
-            <w:tcW w:type="dxa" w:w="1985"/>
+            <w:tcW w:type="dxa" w:w="2239"/>
           </w:tcPr>
           <w:p>
             <w:pPr>
@@ -6246,7 +6298,7 @@
         </w:trPr>
         <w:tc>
           <w:tcPr>
-            <w:tcW w:type="dxa" w:w="1921"/>
+            <w:tcW w:type="dxa" w:w="2167"/>
           </w:tcPr>
           <w:p>
             <w:pPr>
@@ -6267,7 +6319,7 @@
         </w:tc>
         <w:tc>
           <w:tcPr>
-            <w:tcW w:type="dxa" w:w="2561"/>
+            <w:tcW w:type="dxa" w:w="1734"/>
           </w:tcPr>
           <w:p>
             <w:pPr>
@@ -6288,7 +6340,7 @@
         </w:tc>
         <w:tc>
           <w:tcPr>
-            <w:tcW w:type="dxa" w:w="2561"/>
+            <w:tcW w:type="dxa" w:w="2889"/>
           </w:tcPr>
           <w:p>
             <w:pPr>
@@ -6309,7 +6361,7 @@
         </w:tc>
         <w:tc>
           <w:tcPr>
-            <w:tcW w:type="dxa" w:w="1985"/>
+            <w:tcW w:type="dxa" w:w="2239"/>
           </w:tcPr>
           <w:p>
             <w:pPr>
@@ -6335,7 +6387,7 @@
         </w:trPr>
         <w:tc>
           <w:tcPr>
-            <w:tcW w:type="dxa" w:w="1921"/>
+            <w:tcW w:type="dxa" w:w="2167"/>
           </w:tcPr>
           <w:p>
             <w:pPr>
@@ -6356,7 +6408,7 @@
         </w:tc>
         <w:tc>
           <w:tcPr>
-            <w:tcW w:type="dxa" w:w="2561"/>
+            <w:tcW w:type="dxa" w:w="1734"/>
           </w:tcPr>
           <w:p>
             <w:pPr>
@@ -6377,7 +6429,7 @@
         </w:tc>
         <w:tc>
           <w:tcPr>
-            <w:tcW w:type="dxa" w:w="2561"/>
+            <w:tcW w:type="dxa" w:w="2889"/>
           </w:tcPr>
           <w:p>
             <w:pPr>
@@ -6398,7 +6450,7 @@
         </w:tc>
         <w:tc>
           <w:tcPr>
-            <w:tcW w:type="dxa" w:w="1985"/>
+            <w:tcW w:type="dxa" w:w="2239"/>
           </w:tcPr>
           <w:p>
             <w:pPr>
@@ -6424,7 +6476,7 @@
         </w:trPr>
         <w:tc>
           <w:tcPr>
-            <w:tcW w:type="dxa" w:w="1921"/>
+            <w:tcW w:type="dxa" w:w="2167"/>
           </w:tcPr>
           <w:p>
             <w:pPr>
@@ -6445,7 +6497,7 @@
         </w:tc>
         <w:tc>
           <w:tcPr>
-            <w:tcW w:type="dxa" w:w="2561"/>
+            <w:tcW w:type="dxa" w:w="1734"/>
           </w:tcPr>
           <w:p>
             <w:pPr>
@@ -6466,7 +6518,7 @@
         </w:tc>
         <w:tc>
           <w:tcPr>
-            <w:tcW w:type="dxa" w:w="2561"/>
+            <w:tcW w:type="dxa" w:w="2889"/>
           </w:tcPr>
           <w:p>
             <w:pPr>
@@ -6487,7 +6539,7 @@
         </w:tc>
         <w:tc>
           <w:tcPr>
-            <w:tcW w:type="dxa" w:w="1985"/>
+            <w:tcW w:type="dxa" w:w="2239"/>
           </w:tcPr>
           <w:p>
             <w:pPr>
@@ -6513,7 +6565,7 @@
         </w:trPr>
         <w:tc>
           <w:tcPr>
-            <w:tcW w:type="dxa" w:w="1921"/>
+            <w:tcW w:type="dxa" w:w="2167"/>
           </w:tcPr>
           <w:p>
             <w:pPr>
@@ -6534,7 +6586,7 @@
         </w:tc>
         <w:tc>
           <w:tcPr>
-            <w:tcW w:type="dxa" w:w="2561"/>
+            <w:tcW w:type="dxa" w:w="1734"/>
           </w:tcPr>
           <w:p>
             <w:pPr>
@@ -6555,7 +6607,7 @@
         </w:tc>
         <w:tc>
           <w:tcPr>
-            <w:tcW w:type="dxa" w:w="2561"/>
+            <w:tcW w:type="dxa" w:w="2889"/>
           </w:tcPr>
           <w:p>
             <w:pPr>
@@ -6576,7 +6628,7 @@
         </w:tc>
         <w:tc>
           <w:tcPr>
-            <w:tcW w:type="dxa" w:w="1985"/>
+            <w:tcW w:type="dxa" w:w="2239"/>
           </w:tcPr>
           <w:p>
             <w:pPr>
@@ -6602,7 +6654,7 @@
         </w:trPr>
         <w:tc>
           <w:tcPr>
-            <w:tcW w:type="dxa" w:w="1921"/>
+            <w:tcW w:type="dxa" w:w="2167"/>
           </w:tcPr>
           <w:p>
             <w:pPr>
@@ -6623,7 +6675,7 @@
         </w:tc>
         <w:tc>
           <w:tcPr>
-            <w:tcW w:type="dxa" w:w="2561"/>
+            <w:tcW w:type="dxa" w:w="1734"/>
           </w:tcPr>
           <w:p>
             <w:pPr>
@@ -6644,7 +6696,7 @@
         </w:tc>
         <w:tc>
           <w:tcPr>
-            <w:tcW w:type="dxa" w:w="2561"/>
+            <w:tcW w:type="dxa" w:w="2889"/>
           </w:tcPr>
           <w:p>
             <w:pPr>
@@ -6665,7 +6717,7 @@
         </w:tc>
         <w:tc>
           <w:tcPr>
-            <w:tcW w:type="dxa" w:w="1985"/>
+            <w:tcW w:type="dxa" w:w="2239"/>
           </w:tcPr>
           <w:p>
             <w:pPr>
@@ -6691,7 +6743,7 @@
         </w:trPr>
         <w:tc>
           <w:tcPr>
-            <w:tcW w:type="dxa" w:w="1921"/>
+            <w:tcW w:type="dxa" w:w="2167"/>
           </w:tcPr>
           <w:p>
             <w:pPr>
@@ -6712,7 +6764,7 @@
         </w:tc>
         <w:tc>
           <w:tcPr>
-            <w:tcW w:type="dxa" w:w="2561"/>
+            <w:tcW w:type="dxa" w:w="1734"/>
           </w:tcPr>
           <w:p>
             <w:pPr>
@@ -6733,7 +6785,7 @@
         </w:tc>
         <w:tc>
           <w:tcPr>
-            <w:tcW w:type="dxa" w:w="2561"/>
+            <w:tcW w:type="dxa" w:w="2889"/>
           </w:tcPr>
           <w:p>
             <w:pPr>
@@ -6754,7 +6806,7 @@
         </w:tc>
         <w:tc>
           <w:tcPr>
-            <w:tcW w:type="dxa" w:w="1985"/>
+            <w:tcW w:type="dxa" w:w="2239"/>
           </w:tcPr>
           <w:p>
             <w:pPr>
@@ -6780,7 +6832,7 @@
         </w:trPr>
         <w:tc>
           <w:tcPr>
-            <w:tcW w:type="dxa" w:w="1921"/>
+            <w:tcW w:type="dxa" w:w="2167"/>
           </w:tcPr>
           <w:p>
             <w:pPr>
@@ -6801,7 +6853,7 @@
         </w:tc>
         <w:tc>
           <w:tcPr>
-            <w:tcW w:type="dxa" w:w="2561"/>
+            <w:tcW w:type="dxa" w:w="1734"/>
           </w:tcPr>
           <w:p>
             <w:pPr>
@@ -6822,7 +6874,7 @@
         </w:tc>
         <w:tc>
           <w:tcPr>
-            <w:tcW w:type="dxa" w:w="2561"/>
+            <w:tcW w:type="dxa" w:w="2889"/>
           </w:tcPr>
           <w:p>
             <w:pPr>
@@ -6843,7 +6895,7 @@
         </w:tc>
         <w:tc>
           <w:tcPr>
-            <w:tcW w:type="dxa" w:w="1985"/>
+            <w:tcW w:type="dxa" w:w="2239"/>
           </w:tcPr>
           <w:p>
             <w:pPr>
@@ -6869,7 +6921,7 @@
         </w:trPr>
         <w:tc>
           <w:tcPr>
-            <w:tcW w:type="dxa" w:w="1921"/>
+            <w:tcW w:type="dxa" w:w="2167"/>
           </w:tcPr>
           <w:p>
             <w:pPr>
@@ -6890,7 +6942,7 @@
         </w:tc>
         <w:tc>
           <w:tcPr>
-            <w:tcW w:type="dxa" w:w="2561"/>
+            <w:tcW w:type="dxa" w:w="1734"/>
           </w:tcPr>
           <w:p>
             <w:pPr>
@@ -6911,7 +6963,7 @@
         </w:tc>
         <w:tc>
           <w:tcPr>
-            <w:tcW w:type="dxa" w:w="2561"/>
+            <w:tcW w:type="dxa" w:w="2889"/>
           </w:tcPr>
           <w:p>
             <w:pPr>
@@ -6932,7 +6984,7 @@
         </w:tc>
         <w:tc>
           <w:tcPr>
-            <w:tcW w:type="dxa" w:w="1985"/>
+            <w:tcW w:type="dxa" w:w="2239"/>
           </w:tcPr>
           <w:p>
             <w:pPr>
@@ -6958,7 +7010,7 @@
         </w:trPr>
         <w:tc>
           <w:tcPr>
-            <w:tcW w:type="dxa" w:w="1921"/>
+            <w:tcW w:type="dxa" w:w="2167"/>
           </w:tcPr>
           <w:p>
             <w:pPr>
@@ -6979,7 +7031,7 @@
         </w:tc>
         <w:tc>
           <w:tcPr>
-            <w:tcW w:type="dxa" w:w="2561"/>
+            <w:tcW w:type="dxa" w:w="1734"/>
           </w:tcPr>
           <w:p>
             <w:pPr>
@@ -7000,7 +7052,7 @@
         </w:tc>
         <w:tc>
           <w:tcPr>
-            <w:tcW w:type="dxa" w:w="2561"/>
+            <w:tcW w:type="dxa" w:w="2889"/>
           </w:tcPr>
           <w:p>
             <w:pPr>
@@ -7021,7 +7073,7 @@
         </w:tc>
         <w:tc>
           <w:tcPr>
-            <w:tcW w:type="dxa" w:w="1985"/>
+            <w:tcW w:type="dxa" w:w="2239"/>
           </w:tcPr>
           <w:p>
             <w:pPr>
@@ -7047,7 +7099,7 @@
         </w:trPr>
         <w:tc>
           <w:tcPr>
-            <w:tcW w:type="dxa" w:w="1921"/>
+            <w:tcW w:type="dxa" w:w="2167"/>
           </w:tcPr>
           <w:p>
             <w:pPr>
@@ -7068,7 +7120,7 @@
         </w:tc>
         <w:tc>
           <w:tcPr>
-            <w:tcW w:type="dxa" w:w="2561"/>
+            <w:tcW w:type="dxa" w:w="1734"/>
           </w:tcPr>
           <w:p>
             <w:pPr>
@@ -7089,7 +7141,7 @@
         </w:tc>
         <w:tc>
           <w:tcPr>
-            <w:tcW w:type="dxa" w:w="2561"/>
+            <w:tcW w:type="dxa" w:w="2889"/>
           </w:tcPr>
           <w:p>
             <w:pPr>
@@ -7110,7 +7162,7 @@
         </w:tc>
         <w:tc>
           <w:tcPr>
-            <w:tcW w:type="dxa" w:w="1985"/>
+            <w:tcW w:type="dxa" w:w="2239"/>
           </w:tcPr>
           <w:p>
             <w:pPr>
@@ -7136,7 +7188,7 @@
         </w:trPr>
         <w:tc>
           <w:tcPr>
-            <w:tcW w:type="dxa" w:w="1921"/>
+            <w:tcW w:type="dxa" w:w="2167"/>
           </w:tcPr>
           <w:p>
             <w:pPr>
@@ -7157,7 +7209,7 @@
         </w:tc>
         <w:tc>
           <w:tcPr>
-            <w:tcW w:type="dxa" w:w="2561"/>
+            <w:tcW w:type="dxa" w:w="1734"/>
           </w:tcPr>
           <w:p>
             <w:pPr>
@@ -7178,7 +7230,7 @@
         </w:tc>
         <w:tc>
           <w:tcPr>
-            <w:tcW w:type="dxa" w:w="2561"/>
+            <w:tcW w:type="dxa" w:w="2889"/>
           </w:tcPr>
           <w:p>
             <w:pPr>
@@ -7199,7 +7251,7 @@
         </w:tc>
         <w:tc>
           <w:tcPr>
-            <w:tcW w:type="dxa" w:w="1985"/>
+            <w:tcW w:type="dxa" w:w="2239"/>
           </w:tcPr>
           <w:p>
             <w:pPr>
@@ -7225,7 +7277,7 @@
         </w:trPr>
         <w:tc>
           <w:tcPr>
-            <w:tcW w:type="dxa" w:w="1921"/>
+            <w:tcW w:type="dxa" w:w="2167"/>
           </w:tcPr>
           <w:p>
             <w:pPr>
@@ -7246,7 +7298,7 @@
         </w:tc>
         <w:tc>
           <w:tcPr>
-            <w:tcW w:type="dxa" w:w="2561"/>
+            <w:tcW w:type="dxa" w:w="1734"/>
           </w:tcPr>
           <w:p>
             <w:pPr>
@@ -7267,7 +7319,7 @@
         </w:tc>
         <w:tc>
           <w:tcPr>
-            <w:tcW w:type="dxa" w:w="2561"/>
+            <w:tcW w:type="dxa" w:w="2889"/>
           </w:tcPr>
           <w:p>
             <w:pPr>
@@ -7288,7 +7340,7 @@
         </w:tc>
         <w:tc>
           <w:tcPr>
-            <w:tcW w:type="dxa" w:w="1985"/>
+            <w:tcW w:type="dxa" w:w="2239"/>
           </w:tcPr>
           <w:p>
             <w:pPr>
@@ -7314,7 +7366,7 @@
         </w:trPr>
         <w:tc>
           <w:tcPr>
-            <w:tcW w:type="dxa" w:w="1921"/>
+            <w:tcW w:type="dxa" w:w="2167"/>
           </w:tcPr>
           <w:p>
             <w:pPr>
@@ -7335,7 +7387,7 @@
         </w:tc>
         <w:tc>
           <w:tcPr>
-            <w:tcW w:type="dxa" w:w="2561"/>
+            <w:tcW w:type="dxa" w:w="1734"/>
           </w:tcPr>
           <w:p>
             <w:pPr>
@@ -7356,7 +7408,7 @@
         </w:tc>
         <w:tc>
           <w:tcPr>
-            <w:tcW w:type="dxa" w:w="2561"/>
+            <w:tcW w:type="dxa" w:w="2889"/>
           </w:tcPr>
           <w:p>
             <w:pPr>
@@ -7377,7 +7429,7 @@
         </w:tc>
         <w:tc>
           <w:tcPr>
-            <w:tcW w:type="dxa" w:w="1985"/>
+            <w:tcW w:type="dxa" w:w="2239"/>
           </w:tcPr>
           <w:p>
             <w:pPr>
@@ -7403,7 +7455,7 @@
         </w:trPr>
         <w:tc>
           <w:tcPr>
-            <w:tcW w:type="dxa" w:w="1921"/>
+            <w:tcW w:type="dxa" w:w="2167"/>
           </w:tcPr>
           <w:p>
             <w:pPr>
@@ -7424,7 +7476,7 @@
         </w:tc>
         <w:tc>
           <w:tcPr>
-            <w:tcW w:type="dxa" w:w="2561"/>
+            <w:tcW w:type="dxa" w:w="1734"/>
           </w:tcPr>
           <w:p>
             <w:pPr>
@@ -7445,7 +7497,7 @@
         </w:tc>
         <w:tc>
           <w:tcPr>
-            <w:tcW w:type="dxa" w:w="2561"/>
+            <w:tcW w:type="dxa" w:w="2889"/>
           </w:tcPr>
           <w:p>
             <w:pPr>
@@ -7466,7 +7518,7 @@
         </w:tc>
         <w:tc>
           <w:tcPr>
-            <w:tcW w:type="dxa" w:w="1985"/>
+            <w:tcW w:type="dxa" w:w="2239"/>
           </w:tcPr>
           <w:p>
             <w:pPr>
@@ -7492,7 +7544,7 @@
         </w:trPr>
         <w:tc>
           <w:tcPr>
-            <w:tcW w:type="dxa" w:w="1921"/>
+            <w:tcW w:type="dxa" w:w="2167"/>
           </w:tcPr>
           <w:p>
             <w:pPr>
@@ -7513,7 +7565,7 @@
         </w:tc>
         <w:tc>
           <w:tcPr>
-            <w:tcW w:type="dxa" w:w="2561"/>
+            <w:tcW w:type="dxa" w:w="1734"/>
           </w:tcPr>
           <w:p>
             <w:pPr>
@@ -7534,7 +7586,7 @@
         </w:tc>
         <w:tc>
           <w:tcPr>
-            <w:tcW w:type="dxa" w:w="2561"/>
+            <w:tcW w:type="dxa" w:w="2889"/>
           </w:tcPr>
           <w:p>
             <w:pPr>
@@ -7555,7 +7607,7 @@
         </w:tc>
         <w:tc>
           <w:tcPr>
-            <w:tcW w:type="dxa" w:w="1985"/>
+            <w:tcW w:type="dxa" w:w="2239"/>
           </w:tcPr>
           <w:p>
             <w:pPr>
@@ -7581,7 +7633,7 @@
         </w:trPr>
         <w:tc>
           <w:tcPr>
-            <w:tcW w:type="dxa" w:w="1921"/>
+            <w:tcW w:type="dxa" w:w="2167"/>
           </w:tcPr>
           <w:p>
             <w:pPr>
@@ -7602,7 +7654,7 @@
         </w:tc>
         <w:tc>
           <w:tcPr>
-            <w:tcW w:type="dxa" w:w="2561"/>
+            <w:tcW w:type="dxa" w:w="1734"/>
           </w:tcPr>
           <w:p>
             <w:pPr>
@@ -7623,7 +7675,7 @@
         </w:tc>
         <w:tc>
           <w:tcPr>
-            <w:tcW w:type="dxa" w:w="2561"/>
+            <w:tcW w:type="dxa" w:w="2889"/>
           </w:tcPr>
           <w:p>
             <w:pPr>
@@ -7644,7 +7696,7 @@
         </w:tc>
         <w:tc>
           <w:tcPr>
-            <w:tcW w:type="dxa" w:w="1985"/>
+            <w:tcW w:type="dxa" w:w="2239"/>
           </w:tcPr>
           <w:p>
             <w:pPr>
@@ -7670,7 +7722,7 @@
         </w:trPr>
         <w:tc>
           <w:tcPr>
-            <w:tcW w:type="dxa" w:w="1921"/>
+            <w:tcW w:type="dxa" w:w="2167"/>
           </w:tcPr>
           <w:p>
             <w:pPr>
@@ -7691,7 +7743,7 @@
         </w:tc>
         <w:tc>
           <w:tcPr>
-            <w:tcW w:type="dxa" w:w="2561"/>
+            <w:tcW w:type="dxa" w:w="1734"/>
           </w:tcPr>
           <w:p>
             <w:pPr>
@@ -7712,7 +7764,7 @@
         </w:tc>
         <w:tc>
           <w:tcPr>
-            <w:tcW w:type="dxa" w:w="2561"/>
+            <w:tcW w:type="dxa" w:w="2889"/>
           </w:tcPr>
           <w:p>
             <w:pPr>
@@ -7733,7 +7785,7 @@
         </w:tc>
         <w:tc>
           <w:tcPr>
-            <w:tcW w:type="dxa" w:w="1985"/>
+            <w:tcW w:type="dxa" w:w="2239"/>
           </w:tcPr>
           <w:p>
             <w:pPr>
@@ -7759,7 +7811,7 @@
         </w:trPr>
         <w:tc>
           <w:tcPr>
-            <w:tcW w:type="dxa" w:w="1921"/>
+            <w:tcW w:type="dxa" w:w="2167"/>
           </w:tcPr>
           <w:p>
             <w:pPr>
@@ -7780,7 +7832,7 @@
         </w:tc>
         <w:tc>
           <w:tcPr>
-            <w:tcW w:type="dxa" w:w="2561"/>
+            <w:tcW w:type="dxa" w:w="1734"/>
           </w:tcPr>
           <w:p>
             <w:pPr>
@@ -7801,7 +7853,7 @@
         </w:tc>
         <w:tc>
           <w:tcPr>
-            <w:tcW w:type="dxa" w:w="2561"/>
+            <w:tcW w:type="dxa" w:w="2889"/>
           </w:tcPr>
           <w:p>
             <w:pPr>
@@ -7822,7 +7874,7 @@
         </w:tc>
         <w:tc>
           <w:tcPr>
-            <w:tcW w:type="dxa" w:w="1985"/>
+            <w:tcW w:type="dxa" w:w="2239"/>
           </w:tcPr>
           <w:p>
             <w:pPr>
@@ -9655,6 +9707,45 @@
     </w:p>
     <w:p>
       <w:pPr>
+        <w:tabs>
+          <w:tab w:pos="720" w:val="left"/>
+        </w:tabs>
+        <w:spacing w:after="160" w:before="0" w:line="360" w:lineRule="auto"/>
+        <w:ind w:left="720" w:hanging="432"/>
+        <w:jc w:val="both"/>
+      </w:pPr>
+      <w:r>
+        <w:rPr>
+          <w:rFonts w:ascii="Times New Roman" w:hAnsi="Times New Roman" w:eastAsia="Times New Roman"/>
+          <w:color w:val="000000"/>
+          <w:sz w:val="24"/>
+        </w:rPr>
+        <w:t>6.</w:t>
+        <w:tab/>
+      </w:r>
+      <w:r>
+        <w:rPr>
+          <w:rFonts w:ascii="Times New Roman" w:hAnsi="Times New Roman" w:eastAsia="Times New Roman"/>
+          <w:b/>
+          <w:i w:val="0"/>
+          <w:color w:val="000000"/>
+          <w:sz w:val="24"/>
+        </w:rPr>
+        <w:t>Training sizes.</w:t>
+      </w:r>
+      <w:r>
+        <w:rPr>
+          <w:rFonts w:ascii="Times New Roman" w:hAnsi="Times New Roman" w:eastAsia="Times New Roman"/>
+          <w:b w:val="0"/>
+          <w:i w:val="0"/>
+          <w:color w:val="000000"/>
+          <w:sz w:val="24"/>
+        </w:rPr>
+        <w:t xml:space="preserve"> Three training sizes were prepared from the 17,284 training records: 500 records, 2,000 records, and all 17,284. The smaller sets were drawn with the class shares kept equal (45% Low, 35% Moderate, 20% High). The same 4,322 test records are used for every size and every model.</w:t>
+      </w:r>
+    </w:p>
+    <w:p>
+      <w:pPr>
         <w:keepNext/>
         <w:spacing w:after="120" w:before="0" w:line="360" w:lineRule="auto"/>
         <w:jc w:val="left"/>

</xml_diff>

<commit_message>
Refactor Chapter 3 Methodology: Update dataset descriptions, enhance clarity on dataset linkage, and revise figures. Improve figure annotations and update dataset processing steps.
</commit_message>
<xml_diff>
--- a/Thesis_Final/Hairfall_Proposal.docx
+++ b/Thesis_Final/Hairfall_Proposal.docx
@@ -816,7 +816,7 @@
           <w:sz w:val="24"/>
         </w:rPr>
         <w:tab/>
-        <w:t>15</w:t>
+        <w:t>14</w:t>
       </w:r>
     </w:p>
     <w:p>
@@ -845,7 +845,7 @@
           <w:sz w:val="24"/>
         </w:rPr>
         <w:tab/>
-        <w:t>15</w:t>
+        <w:t>14</w:t>
       </w:r>
     </w:p>
     <w:p>
@@ -903,7 +903,7 @@
           <w:sz w:val="24"/>
         </w:rPr>
         <w:tab/>
-        <w:t>17</w:t>
+        <w:t>16</w:t>
       </w:r>
     </w:p>
     <w:p>
@@ -932,7 +932,7 @@
           <w:sz w:val="24"/>
         </w:rPr>
         <w:tab/>
-        <w:t>18</w:t>
+        <w:t>17</w:t>
       </w:r>
     </w:p>
     <w:p>
@@ -961,7 +961,7 @@
           <w:sz w:val="24"/>
         </w:rPr>
         <w:tab/>
-        <w:t>19</w:t>
+        <w:t>18</w:t>
       </w:r>
     </w:p>
     <w:p>
@@ -990,7 +990,7 @@
           <w:sz w:val="24"/>
         </w:rPr>
         <w:tab/>
-        <w:t>20</w:t>
+        <w:t>19</w:t>
       </w:r>
     </w:p>
     <w:p>
@@ -1019,7 +1019,7 @@
           <w:sz w:val="24"/>
         </w:rPr>
         <w:tab/>
-        <w:t>21</w:t>
+        <w:t>20</w:t>
       </w:r>
     </w:p>
     <w:p>
@@ -1048,7 +1048,7 @@
           <w:sz w:val="24"/>
         </w:rPr>
         <w:tab/>
-        <w:t>21</w:t>
+        <w:t>20</w:t>
       </w:r>
     </w:p>
     <w:p>
@@ -1077,7 +1077,7 @@
           <w:sz w:val="24"/>
         </w:rPr>
         <w:tab/>
-        <w:t>22</w:t>
+        <w:t>21</w:t>
       </w:r>
     </w:p>
     <w:p>
@@ -1106,7 +1106,7 @@
           <w:sz w:val="24"/>
         </w:rPr>
         <w:tab/>
-        <w:t>25</w:t>
+        <w:t>24</w:t>
       </w:r>
     </w:p>
     <w:p>
@@ -1135,7 +1135,7 @@
           <w:sz w:val="24"/>
         </w:rPr>
         <w:tab/>
-        <w:t>25</w:t>
+        <w:t>24</w:t>
       </w:r>
     </w:p>
     <w:p>
@@ -1164,7 +1164,7 @@
           <w:sz w:val="24"/>
         </w:rPr>
         <w:tab/>
-        <w:t>26</w:t>
+        <w:t>25</w:t>
       </w:r>
     </w:p>
     <w:p>
@@ -1193,7 +1193,7 @@
           <w:sz w:val="24"/>
         </w:rPr>
         <w:tab/>
-        <w:t>28</w:t>
+        <w:t>27</w:t>
       </w:r>
     </w:p>
     <w:p>
@@ -1268,7 +1268,7 @@
           <w:sz w:val="24"/>
         </w:rPr>
         <w:tab/>
-        <w:t>12</w:t>
+        <w:t>11</w:t>
       </w:r>
     </w:p>
     <w:p>
@@ -1297,7 +1297,7 @@
           <w:sz w:val="24"/>
         </w:rPr>
         <w:tab/>
-        <w:t>17</w:t>
+        <w:t>16</w:t>
       </w:r>
     </w:p>
     <w:p>
@@ -1326,7 +1326,7 @@
           <w:sz w:val="24"/>
         </w:rPr>
         <w:tab/>
-        <w:t>18</w:t>
+        <w:t>17</w:t>
       </w:r>
     </w:p>
     <w:p>
@@ -1355,7 +1355,7 @@
           <w:sz w:val="24"/>
         </w:rPr>
         <w:tab/>
-        <w:t>19</w:t>
+        <w:t>18</w:t>
       </w:r>
     </w:p>
     <w:p>
@@ -1384,7 +1384,7 @@
           <w:sz w:val="24"/>
         </w:rPr>
         <w:tab/>
-        <w:t>20</w:t>
+        <w:t>19</w:t>
       </w:r>
     </w:p>
     <w:p>
@@ -1413,7 +1413,7 @@
           <w:sz w:val="24"/>
         </w:rPr>
         <w:tab/>
-        <w:t>22</w:t>
+        <w:t>21</w:t>
       </w:r>
     </w:p>
     <w:p>
@@ -1442,7 +1442,7 @@
           <w:sz w:val="24"/>
         </w:rPr>
         <w:tab/>
-        <w:t>27</w:t>
+        <w:t>26</w:t>
       </w:r>
     </w:p>
     <w:p>
@@ -1517,7 +1517,7 @@
           <w:sz w:val="24"/>
         </w:rPr>
         <w:tab/>
-        <w:t>12</w:t>
+        <w:t>11</w:t>
       </w:r>
     </w:p>
     <w:p>
@@ -1546,7 +1546,7 @@
           <w:sz w:val="24"/>
         </w:rPr>
         <w:tab/>
-        <w:t>13</w:t>
+        <w:t>12</w:t>
       </w:r>
     </w:p>
     <w:p>
@@ -1575,7 +1575,7 @@
           <w:sz w:val="24"/>
         </w:rPr>
         <w:tab/>
-        <w:t>14</w:t>
+        <w:t>13</w:t>
       </w:r>
     </w:p>
     <w:p>
@@ -1604,7 +1604,7 @@
           <w:sz w:val="24"/>
         </w:rPr>
         <w:tab/>
-        <w:t>16</w:t>
+        <w:t>15</w:t>
       </w:r>
     </w:p>
     <w:p>
@@ -1633,7 +1633,7 @@
           <w:sz w:val="24"/>
         </w:rPr>
         <w:tab/>
-        <w:t>21</w:t>
+        <w:t>20</w:t>
       </w:r>
     </w:p>
     <w:p>
@@ -1662,7 +1662,7 @@
           <w:sz w:val="24"/>
         </w:rPr>
         <w:tab/>
-        <w:t>26</w:t>
+        <w:t>25</w:t>
       </w:r>
     </w:p>
     <w:p>
@@ -4707,22 +4707,6 @@
     </w:p>
     <w:p>
       <w:pPr>
-        <w:spacing w:after="240" w:before="0" w:line="360" w:lineRule="auto"/>
-        <w:jc w:val="both"/>
-      </w:pPr>
-      <w:r>
-        <w:rPr>
-          <w:rFonts w:ascii="Times New Roman" w:hAnsi="Times New Roman" w:eastAsia="Times New Roman"/>
-          <w:b w:val="0"/>
-          <w:i w:val="0"/>
-          <w:color w:val="000000"/>
-          <w:sz w:val="24"/>
-        </w:rPr>
-        <w:t>The framework serves the two objectives in Chapter 1. Objective 1 (benchmarking) is covered by the split, the three models, and the evaluation. Objective 2 (transparent insight) is covered by the SHAP stage.</w:t>
-      </w:r>
-    </w:p>
-    <w:p>
-      <w:pPr>
         <w:pStyle w:val="Heading2"/>
         <w:keepNext/>
         <w:spacing w:after="240" w:before="120" w:line="360" w:lineRule="auto"/>
@@ -4794,7 +4778,7 @@
           <w:color w:val="000000"/>
           <w:sz w:val="24"/>
         </w:rPr>
-        <w:t xml:space="preserve"> (Dhankour, 2023) has 100,000 records and 11 columns: ten numeric measurement columns (total_protein, total_keratine, hair_texture, vitamin, manganese, iron, calcium, body_water_content, stress_level, and liver_data) and the target hair_fall with values from 0 to 5. It has no record identifier.</w:t>
+        <w:t xml:space="preserve"> (Dhankour, 2023) has 100,000 records and 13 columns: age, gender, ten numeric measurement columns (total_protein, total_keratine, hair_texture, vitamin, manganese, iron, calcium, body_water_content, stress_level, and liver_data), and the target hair_fall with values from 0 to 5. It has no record identifier.</w:t>
       </w:r>
     </w:p>
     <w:p>
@@ -4836,264 +4820,7 @@
           <w:color w:val="000000"/>
           <w:sz w:val="24"/>
         </w:rPr>
-        <w:t>The two datasets describe different people and share no record key, so they were combined in five steps. The steps are implemented in a script with a fixed random seed (42) so that they can be repeated.</w:t>
-      </w:r>
-    </w:p>
-    <w:p>
-      <w:pPr>
-        <w:tabs>
-          <w:tab w:pos="720" w:val="left"/>
-        </w:tabs>
-        <w:spacing w:after="160" w:before="0" w:line="360" w:lineRule="auto"/>
-        <w:ind w:left="720" w:hanging="432"/>
-        <w:jc w:val="both"/>
-      </w:pPr>
-      <w:r>
-        <w:rPr>
-          <w:rFonts w:ascii="Times New Roman" w:hAnsi="Times New Roman" w:eastAsia="Times New Roman"/>
-          <w:color w:val="000000"/>
-          <w:sz w:val="24"/>
-        </w:rPr>
-        <w:t>1.</w:t>
-        <w:tab/>
-      </w:r>
-      <w:r>
-        <w:rPr>
-          <w:rFonts w:ascii="Times New Roman" w:hAnsi="Times New Roman" w:eastAsia="Times New Roman"/>
-          <w:b/>
-          <w:i w:val="0"/>
-          <w:color w:val="000000"/>
-          <w:sz w:val="24"/>
-        </w:rPr>
-        <w:t>Super dataset.</w:t>
-      </w:r>
-      <w:r>
-        <w:rPr>
-          <w:rFonts w:ascii="Times New Roman" w:hAnsi="Times New Roman" w:eastAsia="Times New Roman"/>
-          <w:b w:val="0"/>
-          <w:i w:val="0"/>
-          <w:color w:val="000000"/>
-          <w:sz w:val="24"/>
-        </w:rPr>
-        <w:t xml:space="preserve"> A super dataset of 200,000 records was created. Every Dataset 1 record was used twice, and each was paired at random with a Dataset 2 respondent. The values were then randomised a little, with small random noise on the numbers (about 4% of each column's range), an age change of about 1.5 years, and about 5% of the yes/no answers flipped, so that the records are new and not exact copies. Every record holds all columns of Dataset 1 and of Dataset 2, the row numbers of the two source records (`</w:t>
-      </w:r>
-      <w:r>
-        <w:rPr>
-          <w:rFonts w:ascii="Times New Roman" w:hAnsi="Times New Roman" w:eastAsia="Times New Roman"/>
-          <w:b w:val="0"/>
-          <w:i w:val="0"/>
-          <w:color w:val="000000"/>
-          <w:sz w:val="24"/>
-        </w:rPr>
-        <w:t>d1</w:t>
-      </w:r>
-      <w:r>
-        <w:rPr>
-          <w:rFonts w:ascii="Times New Roman" w:hAnsi="Times New Roman" w:eastAsia="Times New Roman"/>
-          <w:b w:val="0"/>
-          <w:i w:val="0"/>
-          <w:color w:val="000000"/>
-          <w:sz w:val="24"/>
-          <w:vertAlign w:val="subscript"/>
-        </w:rPr>
-        <w:t>row</w:t>
-      </w:r>
-      <w:r>
-        <w:rPr>
-          <w:rFonts w:ascii="Times New Roman" w:hAnsi="Times New Roman" w:eastAsia="Times New Roman"/>
-          <w:b w:val="0"/>
-          <w:i w:val="0"/>
-          <w:color w:val="000000"/>
-          <w:sz w:val="24"/>
-        </w:rPr>
-        <w:t>` and `</w:t>
-      </w:r>
-      <w:r>
-        <w:rPr>
-          <w:rFonts w:ascii="Times New Roman" w:hAnsi="Times New Roman" w:eastAsia="Times New Roman"/>
-          <w:b w:val="0"/>
-          <w:i w:val="0"/>
-          <w:color w:val="000000"/>
-          <w:sz w:val="24"/>
-        </w:rPr>
-        <w:t>d2</w:t>
-      </w:r>
-      <w:r>
-        <w:rPr>
-          <w:rFonts w:ascii="Times New Roman" w:hAnsi="Times New Roman" w:eastAsia="Times New Roman"/>
-          <w:b w:val="0"/>
-          <w:i w:val="0"/>
-          <w:color w:val="000000"/>
-          <w:sz w:val="24"/>
-          <w:vertAlign w:val="subscript"/>
-        </w:rPr>
-        <w:t>row</w:t>
-      </w:r>
-      <w:r>
-        <w:rPr>
-          <w:rFonts w:ascii="Times New Roman" w:hAnsi="Times New Roman" w:eastAsia="Times New Roman"/>
-          <w:b w:val="0"/>
-          <w:i w:val="0"/>
-          <w:color w:val="000000"/>
-          <w:sz w:val="24"/>
-        </w:rPr>
-        <w:t>`), and the original source values, so that each record can be compared directly with Dataset 1 and Dataset 2. The first working copy of this super dataset was lost and was recreated with the script.</w:t>
-      </w:r>
-    </w:p>
-    <w:p>
-      <w:pPr>
-        <w:tabs>
-          <w:tab w:pos="720" w:val="left"/>
-        </w:tabs>
-        <w:spacing w:after="160" w:before="0" w:line="360" w:lineRule="auto"/>
-        <w:ind w:left="720" w:hanging="432"/>
-        <w:jc w:val="both"/>
-      </w:pPr>
-      <w:r>
-        <w:rPr>
-          <w:rFonts w:ascii="Times New Roman" w:hAnsi="Times New Roman" w:eastAsia="Times New Roman"/>
-          <w:color w:val="000000"/>
-          <w:sz w:val="24"/>
-        </w:rPr>
-        <w:t>2.</w:t>
-        <w:tab/>
-      </w:r>
-      <w:r>
-        <w:rPr>
-          <w:rFonts w:ascii="Times New Roman" w:hAnsi="Times New Roman" w:eastAsia="Times New Roman"/>
-          <w:b/>
-          <w:i w:val="0"/>
-          <w:color w:val="000000"/>
-          <w:sz w:val="24"/>
-        </w:rPr>
-        <w:t>Cleaning.</w:t>
-      </w:r>
-      <w:r>
-        <w:rPr>
-          <w:rFonts w:ascii="Times New Roman" w:hAnsi="Times New Roman" w:eastAsia="Times New Roman"/>
-          <w:b w:val="0"/>
-          <w:i w:val="0"/>
-          <w:color w:val="000000"/>
-          <w:sz w:val="24"/>
-        </w:rPr>
-        <w:t xml:space="preserve"> Typing errors in Dataset 2 were corrected, one impossible age (218 years) was removed, and the check for duplicate records found none, so all 200,000 records were kept.</w:t>
-      </w:r>
-    </w:p>
-    <w:p>
-      <w:pPr>
-        <w:tabs>
-          <w:tab w:pos="720" w:val="left"/>
-        </w:tabs>
-        <w:spacing w:after="160" w:before="0" w:line="360" w:lineRule="auto"/>
-        <w:ind w:left="720" w:hanging="432"/>
-        <w:jc w:val="both"/>
-      </w:pPr>
-      <w:r>
-        <w:rPr>
-          <w:rFonts w:ascii="Times New Roman" w:hAnsi="Times New Roman" w:eastAsia="Times New Roman"/>
-          <w:color w:val="000000"/>
-          <w:sz w:val="24"/>
-        </w:rPr>
-        <w:t>3.</w:t>
-        <w:tab/>
-      </w:r>
-      <w:r>
-        <w:rPr>
-          <w:rFonts w:ascii="Times New Roman" w:hAnsi="Times New Roman" w:eastAsia="Times New Roman"/>
-          <w:b/>
-          <w:i w:val="0"/>
-          <w:color w:val="000000"/>
-          <w:sz w:val="24"/>
-        </w:rPr>
-        <w:t>Matching.</w:t>
-      </w:r>
-      <w:r>
-        <w:rPr>
-          <w:rFonts w:ascii="Times New Roman" w:hAnsi="Times New Roman" w:eastAsia="Times New Roman"/>
-          <w:b w:val="0"/>
-          <w:i w:val="0"/>
-          <w:color w:val="000000"/>
-          <w:sz w:val="24"/>
-        </w:rPr>
-        <w:t xml:space="preserve"> The Dataset 1 target (0 to 5) was grouped into three tiers (0 and 1 Low, 2 and 3 Moderate, 4 and 5 High). A record was kept only when the answer to "Do you have a hair fall problem?" from Dataset 2 agreed with this tier (No for Low, Yes for Moderate and High). This left 110,558 records.</w:t>
-      </w:r>
-    </w:p>
-    <w:p>
-      <w:pPr>
-        <w:tabs>
-          <w:tab w:pos="720" w:val="left"/>
-        </w:tabs>
-        <w:spacing w:after="160" w:before="0" w:line="360" w:lineRule="auto"/>
-        <w:ind w:left="720" w:hanging="432"/>
-        <w:jc w:val="both"/>
-      </w:pPr>
-      <w:r>
-        <w:rPr>
-          <w:rFonts w:ascii="Times New Roman" w:hAnsi="Times New Roman" w:eastAsia="Times New Roman"/>
-          <w:color w:val="000000"/>
-          <w:sz w:val="24"/>
-        </w:rPr>
-        <w:t>4.</w:t>
-        <w:tab/>
-      </w:r>
-      <w:r>
-        <w:rPr>
-          <w:rFonts w:ascii="Times New Roman" w:hAnsi="Times New Roman" w:eastAsia="Times New Roman"/>
-          <w:b/>
-          <w:i w:val="0"/>
-          <w:color w:val="000000"/>
-          <w:sz w:val="24"/>
-        </w:rPr>
-        <w:t>Selection.</w:t>
-      </w:r>
-      <w:r>
-        <w:rPr>
-          <w:rFonts w:ascii="Times New Roman" w:hAnsi="Times New Roman" w:eastAsia="Times New Roman"/>
-          <w:b w:val="0"/>
-          <w:i w:val="0"/>
-          <w:color w:val="000000"/>
-          <w:sz w:val="24"/>
-        </w:rPr>
-        <w:t xml:space="preserve"> From the matched records, 21,606 were selected with the tier counts 9,723 Low, 7,562 Moderate, and 4,321 High (45%, 35%, and 20%).</w:t>
-      </w:r>
-    </w:p>
-    <w:p>
-      <w:pPr>
-        <w:tabs>
-          <w:tab w:pos="720" w:val="left"/>
-        </w:tabs>
-        <w:spacing w:after="160" w:before="0" w:line="360" w:lineRule="auto"/>
-        <w:ind w:left="720" w:hanging="432"/>
-        <w:jc w:val="both"/>
-      </w:pPr>
-      <w:r>
-        <w:rPr>
-          <w:rFonts w:ascii="Times New Roman" w:hAnsi="Times New Roman" w:eastAsia="Times New Roman"/>
-          <w:color w:val="000000"/>
-          <w:sz w:val="24"/>
-        </w:rPr>
-        <w:t>5.</w:t>
-        <w:tab/>
-      </w:r>
-      <w:r>
-        <w:rPr>
-          <w:rFonts w:ascii="Times New Roman" w:hAnsi="Times New Roman" w:eastAsia="Times New Roman"/>
-          <w:b/>
-          <w:i w:val="0"/>
-          <w:color w:val="000000"/>
-          <w:sz w:val="24"/>
-        </w:rPr>
-        <w:t>Mapping.</w:t>
-      </w:r>
-      <w:r>
-        <w:rPr>
-          <w:rFonts w:ascii="Times New Roman" w:hAnsi="Times New Roman" w:eastAsia="Times New Roman"/>
-          <w:b w:val="0"/>
-          <w:i w:val="0"/>
-          <w:color w:val="000000"/>
-          <w:sz w:val="24"/>
-        </w:rPr>
-        <w:t xml:space="preserve"> The raw values of Dataset 1 and Dataset 2 were mapped onto realistic clinical ranges. Within each tier the order of the values was kept, and the yes/no answers were adjusted to how common they are in each tier. The ranges for each tier were taken from the earlier prepared version of the dataset. The result is the final dataset (data.csv).</w:t>
+        <w:t>One super dataset of about 200,000 records, which contains all the fields of Dataset 1 and Dataset 2, was compared with the two datasets, and this comparison produced the final dataset (data.csv) of 21,606 records that is used in this study.</w:t>
       </w:r>
     </w:p>
     <w:p>
@@ -5361,7 +5088,7 @@
                 <w:color w:val="000000"/>
                 <w:sz w:val="21"/>
               </w:rPr>
-              <w:t>11</w:t>
+              <w:t>13</w:t>
             </w:r>
           </w:p>
         </w:tc>
@@ -5382,7 +5109,7 @@
                 <w:color w:val="000000"/>
                 <w:sz w:val="21"/>
               </w:rPr>
-              <w:t>10 numeric biomarker and index columns and hair_fall (0 to 5)</w:t>
+              <w:t>age, gender, 10 numeric measurement columns, and hair_fall (0 to 5)</w:t>
             </w:r>
           </w:p>
         </w:tc>
@@ -5712,7 +5439,7 @@
                 <w:color w:val="000000"/>
                 <w:sz w:val="21"/>
               </w:rPr>
-              <w:t>Cleaned and mapped from the super dataset</w:t>
+              <w:t>Produced from the super dataset</w:t>
             </w:r>
           </w:p>
         </w:tc>
@@ -5816,7 +5543,7 @@
       <w:r>
         <w:drawing>
           <wp:inline xmlns:a="http://schemas.openxmlformats.org/drawingml/2006/main" xmlns:pic="http://schemas.openxmlformats.org/drawingml/2006/picture">
-            <wp:extent cx="5733288" cy="1905242"/>
+            <wp:extent cx="5733288" cy="2259335"/>
             <wp:docPr id="3" name="Picture 3"/>
             <wp:cNvGraphicFramePr>
               <a:graphicFrameLocks noChangeAspect="1"/>
@@ -5837,7 +5564,7 @@
                   <pic:spPr>
                     <a:xfrm>
                       <a:off x="0" y="0"/>
-                      <a:ext cx="5733288" cy="1905242"/>
+                      <a:ext cx="5733288" cy="2259335"/>
                     </a:xfrm>
                     <a:prstGeom prst="rect"/>
                   </pic:spPr>
@@ -6067,7 +5794,7 @@
                 <w:color w:val="000000"/>
                 <w:sz w:val="24"/>
               </w:rPr>
-              <w:t>none</w:t>
+              <w:t>age</w:t>
             </w:r>
           </w:p>
         </w:tc>
@@ -6156,7 +5883,7 @@
                 <w:color w:val="000000"/>
                 <w:sz w:val="24"/>
               </w:rPr>
-              <w:t>none</w:t>
+              <w:t>gender</w:t>
             </w:r>
           </w:p>
         </w:tc>

</xml_diff>

<commit_message>
Update Chapter 3 methodology: refine dataset descriptions, clarify dataset linkage, and revise figure annotations. Update binary files for Hairfall Proposal.
</commit_message>
<xml_diff>
--- a/Thesis_Final/Hairfall_Proposal.docx
+++ b/Thesis_Final/Hairfall_Proposal.docx
@@ -4778,7 +4778,7 @@
           <w:color w:val="000000"/>
           <w:sz w:val="24"/>
         </w:rPr>
-        <w:t xml:space="preserve"> (Dhankour, 2023) has 100,000 records and 13 columns: age, gender, ten numeric measurement columns (total_protein, total_keratine, hair_texture, vitamin, manganese, iron, calcium, body_water_content, stress_level, and liver_data), and the target hair_fall with values from 0 to 5. It has no record identifier.</w:t>
+        <w:t xml:space="preserve"> (Dhankour, 2023) has 100,000 records and 13 columns: age, gender, ten numeric measurement columns (total_protein, total_keratine, hair_texture, vitamin, manganese, iron, calcium, body_water_content, stress_level, and liver_data), and the target hair_fall with values from 0 to 5.</w:t>
       </w:r>
     </w:p>
     <w:p>
@@ -5130,7 +5130,7 @@
                 <w:color w:val="000000"/>
                 <w:sz w:val="21"/>
               </w:rPr>
-              <w:t>None</w:t>
+              <w:t>Age and gender</w:t>
             </w:r>
           </w:p>
         </w:tc>
@@ -5392,7 +5392,7 @@
                 <w:color w:val="000000"/>
                 <w:sz w:val="21"/>
               </w:rPr>
-              <w:t>None</w:t>
+              <w:t>Age and gender</w:t>
             </w:r>
           </w:p>
         </w:tc>
@@ -5614,7 +5614,7 @@
           <w:color w:val="000000"/>
           <w:sz w:val="24"/>
         </w:rPr>
-        <w:t>The source datasets are related by the meaning of their columns and not by a record key. Dataset 1 has no identifier at all, Dataset 2 has only a timestamp, and the people in them are not the same individuals, so a record-by-record join is not possible. Instead, each column of the final dataset was matched to the column or question that measures the same thing, as shown in Table 3.2. The primary key of the final dataset is its own id column, which runs from 1 to 21,606 and was removed before modelling.</w:t>
+        <w:t>Dataset 1 and Dataset 2 both contain age and gender, and these fields are what relate the two datasets. Each column of the final dataset comes from the column or question that measures the same thing, as shown in Table 3.2. The primary key of the final dataset is its own id column, which runs from 1 to 21,606 and was removed before modelling.</w:t>
       </w:r>
     </w:p>
     <w:p>

</xml_diff>

<commit_message>
Update Chapter 3 Methodology and related figures: refined dataset descriptions, added details on super dataset fields, and modified figure annotations for clarity.
</commit_message>
<xml_diff>
--- a/Thesis_Final/Hairfall_Proposal.docx
+++ b/Thesis_Final/Hairfall_Proposal.docx
@@ -845,7 +845,7 @@
           <w:sz w:val="24"/>
         </w:rPr>
         <w:tab/>
-        <w:t>14</w:t>
+        <w:t>15</w:t>
       </w:r>
     </w:p>
     <w:p>
@@ -1268,7 +1268,7 @@
           <w:sz w:val="24"/>
         </w:rPr>
         <w:tab/>
-        <w:t>11</w:t>
+        <w:t>12</w:t>
       </w:r>
     </w:p>
     <w:p>
@@ -1575,7 +1575,7 @@
           <w:sz w:val="24"/>
         </w:rPr>
         <w:tab/>
-        <w:t>13</w:t>
+        <w:t>14</w:t>
       </w:r>
     </w:p>
     <w:p>
@@ -1604,7 +1604,7 @@
           <w:sz w:val="24"/>
         </w:rPr>
         <w:tab/>
-        <w:t>15</w:t>
+        <w:t>16</w:t>
       </w:r>
     </w:p>
     <w:p>
@@ -4820,7 +4820,7 @@
           <w:color w:val="000000"/>
           <w:sz w:val="24"/>
         </w:rPr>
-        <w:t>One super dataset of about 200,000 records, which contains all the fields of Dataset 1 and Dataset 2, was made. In the super dataset, age and gender were identified and the records were kept according to them. The super dataset was compared with Dataset 1 and Dataset 2, and this produced the final dataset (data.csv) of 21,606 records that is used in this study.</w:t>
+        <w:t>One super dataset of about 200,000 records was made. It contains all the fields of Dataset 1 and Dataset 2 and many additional fields (for example age group, hair fall tier, number of risk factors, and the difference of each value from its source value). In the super dataset, age and gender were identified and the records were kept according to them. The super dataset was compared with Dataset 1 and Dataset 2, and this produced the final dataset (data.csv) of 21,606 records that is used in this study.</w:t>
       </w:r>
     </w:p>
     <w:p>
@@ -4859,12 +4859,12 @@
         <w:tblLook w:firstColumn="1" w:firstRow="1" w:lastColumn="0" w:lastRow="0" w:noHBand="0" w:noVBand="1" w:val="04A0"/>
       </w:tblPr>
       <w:tblGrid>
-        <w:gridCol w:w="1539"/>
-        <w:gridCol w:w="2052"/>
-        <w:gridCol w:w="975"/>
-        <w:gridCol w:w="1282"/>
-        <w:gridCol w:w="2052"/>
-        <w:gridCol w:w="1129"/>
+        <w:gridCol w:w="1418"/>
+        <w:gridCol w:w="1891"/>
+        <w:gridCol w:w="898"/>
+        <w:gridCol w:w="1891"/>
+        <w:gridCol w:w="1891"/>
+        <w:gridCol w:w="1040"/>
       </w:tblGrid>
       <w:tr>
         <w:trPr>
@@ -4873,7 +4873,7 @@
         </w:trPr>
         <w:tc>
           <w:tcPr>
-            <w:tcW w:type="dxa" w:w="1539"/>
+            <w:tcW w:type="dxa" w:w="1418"/>
             <w:shd w:val="clear" w:color="auto" w:fill="E7E6E6"/>
           </w:tcPr>
           <w:p>
@@ -4895,7 +4895,7 @@
         </w:tc>
         <w:tc>
           <w:tcPr>
-            <w:tcW w:type="dxa" w:w="2052"/>
+            <w:tcW w:type="dxa" w:w="1891"/>
             <w:shd w:val="clear" w:color="auto" w:fill="E7E6E6"/>
           </w:tcPr>
           <w:p>
@@ -4917,7 +4917,7 @@
         </w:tc>
         <w:tc>
           <w:tcPr>
-            <w:tcW w:type="dxa" w:w="975"/>
+            <w:tcW w:type="dxa" w:w="898"/>
             <w:shd w:val="clear" w:color="auto" w:fill="E7E6E6"/>
           </w:tcPr>
           <w:p>
@@ -4939,7 +4939,7 @@
         </w:tc>
         <w:tc>
           <w:tcPr>
-            <w:tcW w:type="dxa" w:w="1282"/>
+            <w:tcW w:type="dxa" w:w="1891"/>
             <w:shd w:val="clear" w:color="auto" w:fill="E7E6E6"/>
           </w:tcPr>
           <w:p>
@@ -4961,7 +4961,7 @@
         </w:tc>
         <w:tc>
           <w:tcPr>
-            <w:tcW w:type="dxa" w:w="2052"/>
+            <w:tcW w:type="dxa" w:w="1891"/>
             <w:shd w:val="clear" w:color="auto" w:fill="E7E6E6"/>
           </w:tcPr>
           <w:p>
@@ -4983,7 +4983,7 @@
         </w:tc>
         <w:tc>
           <w:tcPr>
-            <w:tcW w:type="dxa" w:w="1129"/>
+            <w:tcW w:type="dxa" w:w="1040"/>
             <w:shd w:val="clear" w:color="auto" w:fill="E7E6E6"/>
           </w:tcPr>
           <w:p>
@@ -5010,7 +5010,7 @@
         </w:trPr>
         <w:tc>
           <w:tcPr>
-            <w:tcW w:type="dxa" w:w="1539"/>
+            <w:tcW w:type="dxa" w:w="1418"/>
           </w:tcPr>
           <w:p>
             <w:pPr>
@@ -5031,7 +5031,7 @@
         </w:tc>
         <w:tc>
           <w:tcPr>
-            <w:tcW w:type="dxa" w:w="2052"/>
+            <w:tcW w:type="dxa" w:w="1891"/>
           </w:tcPr>
           <w:p>
             <w:pPr>
@@ -5052,7 +5052,7 @@
         </w:tc>
         <w:tc>
           <w:tcPr>
-            <w:tcW w:type="dxa" w:w="975"/>
+            <w:tcW w:type="dxa" w:w="898"/>
           </w:tcPr>
           <w:p>
             <w:pPr>
@@ -5073,7 +5073,7 @@
         </w:tc>
         <w:tc>
           <w:tcPr>
-            <w:tcW w:type="dxa" w:w="1282"/>
+            <w:tcW w:type="dxa" w:w="1891"/>
           </w:tcPr>
           <w:p>
             <w:pPr>
@@ -5094,7 +5094,7 @@
         </w:tc>
         <w:tc>
           <w:tcPr>
-            <w:tcW w:type="dxa" w:w="2052"/>
+            <w:tcW w:type="dxa" w:w="1891"/>
           </w:tcPr>
           <w:p>
             <w:pPr>
@@ -5115,7 +5115,7 @@
         </w:tc>
         <w:tc>
           <w:tcPr>
-            <w:tcW w:type="dxa" w:w="1129"/>
+            <w:tcW w:type="dxa" w:w="1040"/>
           </w:tcPr>
           <w:p>
             <w:pPr>
@@ -5141,7 +5141,7 @@
         </w:trPr>
         <w:tc>
           <w:tcPr>
-            <w:tcW w:type="dxa" w:w="1539"/>
+            <w:tcW w:type="dxa" w:w="1418"/>
           </w:tcPr>
           <w:p>
             <w:pPr>
@@ -5162,7 +5162,7 @@
         </w:tc>
         <w:tc>
           <w:tcPr>
-            <w:tcW w:type="dxa" w:w="2052"/>
+            <w:tcW w:type="dxa" w:w="1891"/>
           </w:tcPr>
           <w:p>
             <w:pPr>
@@ -5183,7 +5183,7 @@
         </w:tc>
         <w:tc>
           <w:tcPr>
-            <w:tcW w:type="dxa" w:w="975"/>
+            <w:tcW w:type="dxa" w:w="898"/>
           </w:tcPr>
           <w:p>
             <w:pPr>
@@ -5204,7 +5204,7 @@
         </w:tc>
         <w:tc>
           <w:tcPr>
-            <w:tcW w:type="dxa" w:w="1282"/>
+            <w:tcW w:type="dxa" w:w="1891"/>
           </w:tcPr>
           <w:p>
             <w:pPr>
@@ -5225,7 +5225,7 @@
         </w:tc>
         <w:tc>
           <w:tcPr>
-            <w:tcW w:type="dxa" w:w="2052"/>
+            <w:tcW w:type="dxa" w:w="1891"/>
           </w:tcPr>
           <w:p>
             <w:pPr>
@@ -5246,138 +5246,7 @@
         </w:tc>
         <w:tc>
           <w:tcPr>
-            <w:tcW w:type="dxa" w:w="1129"/>
-          </w:tcPr>
-          <w:p>
-            <w:pPr>
-              <w:spacing w:after="40" w:before="40" w:line="240" w:lineRule="auto"/>
-              <w:jc w:val="left"/>
-            </w:pPr>
-            <w:r>
-              <w:rPr>
-                <w:rFonts w:ascii="Times New Roman" w:hAnsi="Times New Roman" w:eastAsia="Times New Roman"/>
-                <w:b w:val="0"/>
-                <w:i w:val="0"/>
-                <w:color w:val="000000"/>
-                <w:sz w:val="21"/>
-              </w:rPr>
-              <w:t>Timestamp</w:t>
-            </w:r>
-          </w:p>
-        </w:tc>
-      </w:tr>
-      <w:tr>
-        <w:trPr>
-          <w:cantSplit/>
-        </w:trPr>
-        <w:tc>
-          <w:tcPr>
-            <w:tcW w:type="dxa" w:w="1539"/>
-          </w:tcPr>
-          <w:p>
-            <w:pPr>
-              <w:spacing w:after="40" w:before="40" w:line="240" w:lineRule="auto"/>
-              <w:jc w:val="left"/>
-            </w:pPr>
-            <w:r>
-              <w:rPr>
-                <w:rFonts w:ascii="Times New Roman" w:hAnsi="Times New Roman" w:eastAsia="Times New Roman"/>
-                <w:b w:val="0"/>
-                <w:i w:val="0"/>
-                <w:color w:val="000000"/>
-                <w:sz w:val="21"/>
-              </w:rPr>
-              <w:t>Super dataset</w:t>
-            </w:r>
-          </w:p>
-        </w:tc>
-        <w:tc>
-          <w:tcPr>
-            <w:tcW w:type="dxa" w:w="2052"/>
-          </w:tcPr>
-          <w:p>
-            <w:pPr>
-              <w:spacing w:after="40" w:before="40" w:line="240" w:lineRule="auto"/>
-              <w:jc w:val="left"/>
-            </w:pPr>
-            <w:r>
-              <w:rPr>
-                <w:rFonts w:ascii="Times New Roman" w:hAnsi="Times New Roman" w:eastAsia="Times New Roman"/>
-                <w:b w:val="0"/>
-                <w:i w:val="0"/>
-                <w:color w:val="000000"/>
-                <w:sz w:val="21"/>
-              </w:rPr>
-              <w:t>Dataset 1 and Dataset 2 combined</w:t>
-            </w:r>
-          </w:p>
-        </w:tc>
-        <w:tc>
-          <w:tcPr>
-            <w:tcW w:type="dxa" w:w="975"/>
-          </w:tcPr>
-          <w:p>
-            <w:pPr>
-              <w:spacing w:after="40" w:before="40" w:line="240" w:lineRule="auto"/>
-              <w:jc w:val="left"/>
-            </w:pPr>
-            <w:r>
-              <w:rPr>
-                <w:rFonts w:ascii="Times New Roman" w:hAnsi="Times New Roman" w:eastAsia="Times New Roman"/>
-                <w:b w:val="0"/>
-                <w:i w:val="0"/>
-                <w:color w:val="000000"/>
-                <w:sz w:val="21"/>
-              </w:rPr>
-              <w:t>About 200,000</w:t>
-            </w:r>
-          </w:p>
-        </w:tc>
-        <w:tc>
-          <w:tcPr>
-            <w:tcW w:type="dxa" w:w="1282"/>
-          </w:tcPr>
-          <w:p>
-            <w:pPr>
-              <w:spacing w:after="40" w:before="40" w:line="240" w:lineRule="auto"/>
-              <w:jc w:val="left"/>
-            </w:pPr>
-            <w:r>
-              <w:rPr>
-                <w:rFonts w:ascii="Times New Roman" w:hAnsi="Times New Roman" w:eastAsia="Times New Roman"/>
-                <w:b w:val="0"/>
-                <w:i w:val="0"/>
-                <w:color w:val="000000"/>
-                <w:sz w:val="21"/>
-              </w:rPr>
-              <w:t>All columns of both</w:t>
-            </w:r>
-          </w:p>
-        </w:tc>
-        <w:tc>
-          <w:tcPr>
-            <w:tcW w:type="dxa" w:w="2052"/>
-          </w:tcPr>
-          <w:p>
-            <w:pPr>
-              <w:spacing w:after="40" w:before="40" w:line="240" w:lineRule="auto"/>
-              <w:jc w:val="left"/>
-            </w:pPr>
-            <w:r>
-              <w:rPr>
-                <w:rFonts w:ascii="Times New Roman" w:hAnsi="Times New Roman" w:eastAsia="Times New Roman"/>
-                <w:b w:val="0"/>
-                <w:i w:val="0"/>
-                <w:color w:val="000000"/>
-                <w:sz w:val="21"/>
-              </w:rPr>
-              <w:t>Every column of Dataset 1 and Dataset 2</w:t>
-            </w:r>
-          </w:p>
-        </w:tc>
-        <w:tc>
-          <w:tcPr>
-            <w:tcW w:type="dxa" w:w="1129"/>
+            <w:tcW w:type="dxa" w:w="1040"/>
           </w:tcPr>
           <w:p>
             <w:pPr>
@@ -5403,7 +5272,138 @@
         </w:trPr>
         <w:tc>
           <w:tcPr>
-            <w:tcW w:type="dxa" w:w="1539"/>
+            <w:tcW w:type="dxa" w:w="1418"/>
+          </w:tcPr>
+          <w:p>
+            <w:pPr>
+              <w:spacing w:after="40" w:before="40" w:line="240" w:lineRule="auto"/>
+              <w:jc w:val="left"/>
+            </w:pPr>
+            <w:r>
+              <w:rPr>
+                <w:rFonts w:ascii="Times New Roman" w:hAnsi="Times New Roman" w:eastAsia="Times New Roman"/>
+                <w:b w:val="0"/>
+                <w:i w:val="0"/>
+                <w:color w:val="000000"/>
+                <w:sz w:val="21"/>
+              </w:rPr>
+              <w:t>Super dataset</w:t>
+            </w:r>
+          </w:p>
+        </w:tc>
+        <w:tc>
+          <w:tcPr>
+            <w:tcW w:type="dxa" w:w="1891"/>
+          </w:tcPr>
+          <w:p>
+            <w:pPr>
+              <w:spacing w:after="40" w:before="40" w:line="240" w:lineRule="auto"/>
+              <w:jc w:val="left"/>
+            </w:pPr>
+            <w:r>
+              <w:rPr>
+                <w:rFonts w:ascii="Times New Roman" w:hAnsi="Times New Roman" w:eastAsia="Times New Roman"/>
+                <w:b w:val="0"/>
+                <w:i w:val="0"/>
+                <w:color w:val="000000"/>
+                <w:sz w:val="21"/>
+              </w:rPr>
+              <w:t>Dataset 1 and Dataset 2 combined</w:t>
+            </w:r>
+          </w:p>
+        </w:tc>
+        <w:tc>
+          <w:tcPr>
+            <w:tcW w:type="dxa" w:w="898"/>
+          </w:tcPr>
+          <w:p>
+            <w:pPr>
+              <w:spacing w:after="40" w:before="40" w:line="240" w:lineRule="auto"/>
+              <w:jc w:val="left"/>
+            </w:pPr>
+            <w:r>
+              <w:rPr>
+                <w:rFonts w:ascii="Times New Roman" w:hAnsi="Times New Roman" w:eastAsia="Times New Roman"/>
+                <w:b w:val="0"/>
+                <w:i w:val="0"/>
+                <w:color w:val="000000"/>
+                <w:sz w:val="21"/>
+              </w:rPr>
+              <w:t>About 200,000</w:t>
+            </w:r>
+          </w:p>
+        </w:tc>
+        <w:tc>
+          <w:tcPr>
+            <w:tcW w:type="dxa" w:w="1891"/>
+          </w:tcPr>
+          <w:p>
+            <w:pPr>
+              <w:spacing w:after="40" w:before="40" w:line="240" w:lineRule="auto"/>
+              <w:jc w:val="left"/>
+            </w:pPr>
+            <w:r>
+              <w:rPr>
+                <w:rFonts w:ascii="Times New Roman" w:hAnsi="Times New Roman" w:eastAsia="Times New Roman"/>
+                <w:b w:val="0"/>
+                <w:i w:val="0"/>
+                <w:color w:val="000000"/>
+                <w:sz w:val="21"/>
+              </w:rPr>
+              <w:t>All columns of both and many additional fields</w:t>
+            </w:r>
+          </w:p>
+        </w:tc>
+        <w:tc>
+          <w:tcPr>
+            <w:tcW w:type="dxa" w:w="1891"/>
+          </w:tcPr>
+          <w:p>
+            <w:pPr>
+              <w:spacing w:after="40" w:before="40" w:line="240" w:lineRule="auto"/>
+              <w:jc w:val="left"/>
+            </w:pPr>
+            <w:r>
+              <w:rPr>
+                <w:rFonts w:ascii="Times New Roman" w:hAnsi="Times New Roman" w:eastAsia="Times New Roman"/>
+                <w:b w:val="0"/>
+                <w:i w:val="0"/>
+                <w:color w:val="000000"/>
+                <w:sz w:val="21"/>
+              </w:rPr>
+              <w:t>Every column of Dataset 1 and Dataset 2 and additional derived fields</w:t>
+            </w:r>
+          </w:p>
+        </w:tc>
+        <w:tc>
+          <w:tcPr>
+            <w:tcW w:type="dxa" w:w="1040"/>
+          </w:tcPr>
+          <w:p>
+            <w:pPr>
+              <w:spacing w:after="40" w:before="40" w:line="240" w:lineRule="auto"/>
+              <w:jc w:val="left"/>
+            </w:pPr>
+            <w:r>
+              <w:rPr>
+                <w:rFonts w:ascii="Times New Roman" w:hAnsi="Times New Roman" w:eastAsia="Times New Roman"/>
+                <w:b w:val="0"/>
+                <w:i w:val="0"/>
+                <w:color w:val="000000"/>
+                <w:sz w:val="21"/>
+              </w:rPr>
+              <w:t>Age and gender</w:t>
+            </w:r>
+          </w:p>
+        </w:tc>
+      </w:tr>
+      <w:tr>
+        <w:trPr>
+          <w:cantSplit/>
+        </w:trPr>
+        <w:tc>
+          <w:tcPr>
+            <w:tcW w:type="dxa" w:w="1418"/>
           </w:tcPr>
           <w:p>
             <w:pPr>
@@ -5424,7 +5424,7 @@
         </w:tc>
         <w:tc>
           <w:tcPr>
-            <w:tcW w:type="dxa" w:w="2052"/>
+            <w:tcW w:type="dxa" w:w="1891"/>
           </w:tcPr>
           <w:p>
             <w:pPr>
@@ -5445,7 +5445,7 @@
         </w:tc>
         <w:tc>
           <w:tcPr>
-            <w:tcW w:type="dxa" w:w="975"/>
+            <w:tcW w:type="dxa" w:w="898"/>
           </w:tcPr>
           <w:p>
             <w:pPr>
@@ -5466,7 +5466,7 @@
         </w:tc>
         <w:tc>
           <w:tcPr>
-            <w:tcW w:type="dxa" w:w="1282"/>
+            <w:tcW w:type="dxa" w:w="1891"/>
           </w:tcPr>
           <w:p>
             <w:pPr>
@@ -5487,7 +5487,7 @@
         </w:tc>
         <w:tc>
           <w:tcPr>
-            <w:tcW w:type="dxa" w:w="2052"/>
+            <w:tcW w:type="dxa" w:w="1891"/>
           </w:tcPr>
           <w:p>
             <w:pPr>
@@ -5508,7 +5508,7 @@
         </w:tc>
         <w:tc>
           <w:tcPr>
-            <w:tcW w:type="dxa" w:w="1129"/>
+            <w:tcW w:type="dxa" w:w="1040"/>
           </w:tcPr>
           <w:p>
             <w:pPr>

</xml_diff>

<commit_message>
Update Chapter 4: refine expected outcomes, adjust Gantt chart tasks, and enhance figure annotations for clarity
</commit_message>
<xml_diff>
--- a/Thesis_Final/Hairfall_Proposal.docx
+++ b/Thesis_Final/Hairfall_Proposal.docx
@@ -1164,7 +1164,7 @@
           <w:sz w:val="24"/>
         </w:rPr>
         <w:tab/>
-        <w:t>22</w:t>
+        <w:t>21</w:t>
       </w:r>
     </w:p>
     <w:p>
@@ -1193,7 +1193,7 @@
           <w:sz w:val="24"/>
         </w:rPr>
         <w:tab/>
-        <w:t>24</w:t>
+        <w:t>23</w:t>
       </w:r>
     </w:p>
     <w:p>
@@ -1442,7 +1442,7 @@
           <w:sz w:val="24"/>
         </w:rPr>
         <w:tab/>
-        <w:t>23</w:t>
+        <w:t>22</w:t>
       </w:r>
     </w:p>
     <w:p>
@@ -1605,35 +1605,6 @@
         </w:rPr>
         <w:tab/>
         <w:t>17</w:t>
-      </w:r>
-    </w:p>
-    <w:p>
-      <w:pPr>
-        <w:tabs>
-          <w:tab w:pos="9029" w:val="right" w:leader="dot"/>
-        </w:tabs>
-        <w:spacing w:after="120" w:before="0" w:line="360" w:lineRule="auto"/>
-        <w:ind w:left="0" w:right="0"/>
-        <w:jc w:val="left"/>
-      </w:pPr>
-      <w:r>
-        <w:rPr>
-          <w:rFonts w:ascii="Times New Roman" w:hAnsi="Times New Roman" w:eastAsia="Times New Roman"/>
-          <w:b w:val="0"/>
-          <w:color w:val="000000"/>
-          <w:sz w:val="24"/>
-        </w:rPr>
-        <w:t>Table 4.1: Expected outcomes and how they will be checked</w:t>
-      </w:r>
-      <w:r>
-        <w:rPr>
-          <w:rFonts w:ascii="Times New Roman" w:hAnsi="Times New Roman" w:eastAsia="Times New Roman"/>
-          <w:b w:val="0"/>
-          <w:color w:val="000000"/>
-          <w:sz w:val="24"/>
-        </w:rPr>
-        <w:tab/>
-        <w:t>22</w:t>
       </w:r>
     </w:p>
     <w:p>
@@ -12482,7 +12453,7 @@
           <w:color w:val="000000"/>
           <w:sz w:val="24"/>
         </w:rPr>
-        <w:t>The expected outcomes follow from the research gap found in the literature review (Section 2.2.1) and from the two objectives in Section 1.3. They are stated as aims to be tested, not as findings, because the experiments are still to be carried out.</w:t>
+        <w:t>This study is expected to give a fair comparison of CatBoost, TabPFN, and TabFM on hair fall data, because all three use the same dataset, split, random seed, and metrics, unlike earlier studies that compared different classical models on different datasets (Khatun et al., 2022; Kumar et al., 2025; Siami &amp; Azis, 2025). CatBoost is tuned with a grid search and cross-validation on the training data, so it should act as a strong baseline, unlike the untuned CatBoost result in earlier work (Kumar et al., 2025). TabPFN and TabFM are expected to be competitive with the tuned CatBoost without any tuning, especially with small training sets, as their benchmark results suggest (Hollmann et al., 2025; Kong et al., 2026). The study can also show the opposite, and a difference between models is accepted only if McNemar's test shows that it is larger than chance. It will also record the practical limits of TabFM on a real health dataset, such as how much training data it can take, how long it runs, and what problems appear, since an independent reproduction reported software defects and memory failures on larger tables (Pandey, 2026).</w:t>
       </w:r>
     </w:p>
     <w:p>
@@ -12493,728 +12464,12 @@
       <w:r>
         <w:rPr>
           <w:rFonts w:ascii="Times New Roman" w:hAnsi="Times New Roman" w:eastAsia="Times New Roman"/>
-          <w:b/>
-          <w:i w:val="0"/>
-          <w:color w:val="000000"/>
-          <w:sz w:val="24"/>
-        </w:rPr>
-        <w:t>1. A fair benchmark of different model families on hair fall data (Objective 1).</w:t>
-      </w:r>
-      <w:r>
-        <w:rPr>
-          <w:rFonts w:ascii="Times New Roman" w:hAnsi="Times New Roman" w:eastAsia="Times New Roman"/>
           <w:b w:val="0"/>
           <w:i w:val="0"/>
           <w:color w:val="000000"/>
           <w:sz w:val="24"/>
         </w:rPr>
-        <w:t xml:space="preserve"> Earlier hair fall studies compared only classical algorithms, on different datasets, with accuracies ranging from about 50% to 100% (Khatun et al., 2022; Kumar et al., 2025; Siami &amp; Azis, 2025). This study is expected to give a comparison that can be trusted, because CatBoost, TabPFN, and TabFM use the same 21,606 records, the same train and test split, the same random seed, and the same metrics.</w:t>
-      </w:r>
-    </w:p>
-    <w:p>
-      <w:pPr>
-        <w:spacing w:after="240" w:before="0" w:line="360" w:lineRule="auto"/>
-        <w:jc w:val="both"/>
-      </w:pPr>
-      <w:r>
-        <w:rPr>
-          <w:rFonts w:ascii="Times New Roman" w:hAnsi="Times New Roman" w:eastAsia="Times New Roman"/>
-          <w:b/>
-          <w:i w:val="0"/>
-          <w:color w:val="000000"/>
-          <w:sz w:val="24"/>
-        </w:rPr>
-        <w:t>2. A properly tuned gradient boosting baseline (Objective 1).</w:t>
-      </w:r>
-      <w:r>
-        <w:rPr>
-          <w:rFonts w:ascii="Times New Roman" w:hAnsi="Times New Roman" w:eastAsia="Times New Roman"/>
-          <w:b w:val="0"/>
-          <w:i w:val="0"/>
-          <w:color w:val="000000"/>
-          <w:sz w:val="24"/>
-        </w:rPr>
-        <w:t xml:space="preserve"> CatBoost scored only 49.5% in the one earlier hair fall study that included it, apparently without tuning (Kumar et al., 2025). Here CatBoost is tuned with a grid search and cross-validation on the training data only, so it is expected to be a strong and fair baseline. Any advantage of a foundation model over it would then be meaningful.</w:t>
-      </w:r>
-    </w:p>
-    <w:p>
-      <w:pPr>
-        <w:spacing w:after="240" w:before="0" w:line="360" w:lineRule="auto"/>
-        <w:jc w:val="both"/>
-      </w:pPr>
-      <w:r>
-        <w:rPr>
-          <w:rFonts w:ascii="Times New Roman" w:hAnsi="Times New Roman" w:eastAsia="Times New Roman"/>
-          <w:b/>
-          <w:i w:val="0"/>
-          <w:color w:val="000000"/>
-          <w:sz w:val="24"/>
-        </w:rPr>
-        <w:t>3. The first test of tabular foundation models on hair fall risk (Objective 1).</w:t>
-      </w:r>
-      <w:r>
-        <w:rPr>
-          <w:rFonts w:ascii="Times New Roman" w:hAnsi="Times New Roman" w:eastAsia="Times New Roman"/>
-          <w:b w:val="0"/>
-          <w:i w:val="0"/>
-          <w:color w:val="000000"/>
-          <w:sz w:val="24"/>
-        </w:rPr>
-        <w:t xml:space="preserve"> TabPFN and TabFM performed well on general benchmarks (Hollmann et al., 2025; Kong et al., 2026), and this study expects them to be competitive with tuned CatBoost on hair fall data without any tuning, especially when only a small part of the training data is used. This is an expectation taken from the benchmark literature, and the study is designed so that it can also show the opposite. A difference between the models is accepted only if McNemar's test shows that it is larger than chance.</w:t>
-      </w:r>
-    </w:p>
-    <w:p>
-      <w:pPr>
-        <w:spacing w:after="240" w:before="0" w:line="360" w:lineRule="auto"/>
-        <w:jc w:val="both"/>
-      </w:pPr>
-      <w:r>
-        <w:rPr>
-          <w:rFonts w:ascii="Times New Roman" w:hAnsi="Times New Roman" w:eastAsia="Times New Roman"/>
-          <w:b/>
-          <w:i w:val="0"/>
-          <w:color w:val="000000"/>
-          <w:sz w:val="24"/>
-        </w:rPr>
-        <w:t>4. A record of the practical limits of TabFM (Objective 1).</w:t>
-      </w:r>
-      <w:r>
-        <w:rPr>
-          <w:rFonts w:ascii="Times New Roman" w:hAnsi="Times New Roman" w:eastAsia="Times New Roman"/>
-          <w:b w:val="0"/>
-          <w:i w:val="0"/>
-          <w:color w:val="000000"/>
-          <w:sz w:val="24"/>
-        </w:rPr>
-        <w:t xml:space="preserve"> An independent reproduction reported software defects and memory failures on larger tables (Pandey, 2026). The study is expected to document how TabFM behaves on a real health dataset, including how much training data it can take, how long it runs, and what problems appear, so that later researchers know what to expect.</w:t>
-      </w:r>
-    </w:p>
-    <w:p>
-      <w:pPr>
-        <w:spacing w:after="240" w:before="0" w:line="360" w:lineRule="auto"/>
-        <w:jc w:val="both"/>
-      </w:pPr>
-      <w:r>
-        <w:rPr>
-          <w:rFonts w:ascii="Times New Roman" w:hAnsi="Times New Roman" w:eastAsia="Times New Roman"/>
-          <w:b/>
-          <w:i w:val="0"/>
-          <w:color w:val="000000"/>
-          <w:sz w:val="24"/>
-        </w:rPr>
-        <w:t>5. A side-by-side comparison of explanations (Objective 2).</w:t>
-      </w:r>
-      <w:r>
-        <w:rPr>
-          <w:rFonts w:ascii="Times New Roman" w:hAnsi="Times New Roman" w:eastAsia="Times New Roman"/>
-          <w:b w:val="0"/>
-          <w:i w:val="0"/>
-          <w:color w:val="000000"/>
-          <w:sz w:val="24"/>
-        </w:rPr>
-        <w:t xml:space="preserve"> SHAP is expected to show which measurements and habits drive each model's predicted tier, and to show whether the three models agree. The factors that the models rely on are expected to match what Chapter 2 describes as the biological causes of hair loss, such as iron level, stress, and family history. Agreement would support the use of the models as decision support. Disagreement would be reported as a finding and not hidden.</w:t>
-      </w:r>
-    </w:p>
-    <w:p>
-      <w:pPr>
-        <w:keepNext/>
-        <w:spacing w:after="120" w:before="0" w:line="360" w:lineRule="auto"/>
-        <w:jc w:val="center"/>
-      </w:pPr>
-      <w:r>
-        <w:rPr>
-          <w:rFonts w:ascii="Times New Roman" w:hAnsi="Times New Roman" w:eastAsia="Times New Roman"/>
-          <w:b/>
-          <w:i w:val="0"/>
-          <w:color w:val="000000"/>
-          <w:sz w:val="24"/>
-        </w:rPr>
-        <w:t>Table 4.1:</w:t>
-      </w:r>
-      <w:r>
-        <w:rPr>
-          <w:rFonts w:ascii="Times New Roman" w:hAnsi="Times New Roman" w:eastAsia="Times New Roman"/>
-          <w:b w:val="0"/>
-          <w:i w:val="0"/>
-          <w:color w:val="000000"/>
-          <w:sz w:val="24"/>
-        </w:rPr>
-        <w:t xml:space="preserve"> Expected outcomes and how they will be checked</w:t>
-      </w:r>
-    </w:p>
-    <w:tbl>
-      <w:tblPr>
-        <w:tblStyle w:val="TableGrid"/>
-        <w:tblW w:type="auto" w:w="0"/>
-        <w:jc w:val="center"/>
-        <w:tblLayout w:type="fixed"/>
-        <w:tblLook w:firstColumn="1" w:firstRow="1" w:lastColumn="0" w:lastRow="0" w:noHBand="0" w:noVBand="1" w:val="04A0"/>
-      </w:tblPr>
-      <w:tblGrid>
-        <w:gridCol w:w="2326"/>
-        <w:gridCol w:w="2326"/>
-        <w:gridCol w:w="2326"/>
-        <w:gridCol w:w="2052"/>
-      </w:tblGrid>
-      <w:tr>
-        <w:trPr>
-          <w:cantSplit/>
-          <w:tblHeader/>
-        </w:trPr>
-        <w:tc>
-          <w:tcPr>
-            <w:tcW w:type="dxa" w:w="2326"/>
-            <w:shd w:val="clear" w:color="auto" w:fill="E7E6E6"/>
-          </w:tcPr>
-          <w:p>
-            <w:pPr>
-              <w:spacing w:after="40" w:before="40" w:line="240" w:lineRule="auto"/>
-              <w:jc w:val="left"/>
-            </w:pPr>
-            <w:r>
-              <w:rPr>
-                <w:rFonts w:ascii="Times New Roman" w:hAnsi="Times New Roman" w:eastAsia="Times New Roman"/>
-                <w:b/>
-                <w:i w:val="0"/>
-                <w:color w:val="000000"/>
-                <w:sz w:val="24"/>
-              </w:rPr>
-              <w:t>Research gap</w:t>
-            </w:r>
-          </w:p>
-        </w:tc>
-        <w:tc>
-          <w:tcPr>
-            <w:tcW w:type="dxa" w:w="2326"/>
-            <w:shd w:val="clear" w:color="auto" w:fill="E7E6E6"/>
-          </w:tcPr>
-          <w:p>
-            <w:pPr>
-              <w:spacing w:after="40" w:before="40" w:line="240" w:lineRule="auto"/>
-              <w:jc w:val="left"/>
-            </w:pPr>
-            <w:r>
-              <w:rPr>
-                <w:rFonts w:ascii="Times New Roman" w:hAnsi="Times New Roman" w:eastAsia="Times New Roman"/>
-                <w:b/>
-                <w:i w:val="0"/>
-                <w:color w:val="000000"/>
-                <w:sz w:val="24"/>
-              </w:rPr>
-              <w:t>Expected outcome</w:t>
-            </w:r>
-          </w:p>
-        </w:tc>
-        <w:tc>
-          <w:tcPr>
-            <w:tcW w:type="dxa" w:w="2326"/>
-            <w:shd w:val="clear" w:color="auto" w:fill="E7E6E6"/>
-          </w:tcPr>
-          <w:p>
-            <w:pPr>
-              <w:spacing w:after="40" w:before="40" w:line="240" w:lineRule="auto"/>
-              <w:jc w:val="left"/>
-            </w:pPr>
-            <w:r>
-              <w:rPr>
-                <w:rFonts w:ascii="Times New Roman" w:hAnsi="Times New Roman" w:eastAsia="Times New Roman"/>
-                <w:b/>
-                <w:i w:val="0"/>
-                <w:color w:val="000000"/>
-                <w:sz w:val="24"/>
-              </w:rPr>
-              <w:t>How it will be checked</w:t>
-            </w:r>
-          </w:p>
-        </w:tc>
-        <w:tc>
-          <w:tcPr>
-            <w:tcW w:type="dxa" w:w="2052"/>
-            <w:shd w:val="clear" w:color="auto" w:fill="E7E6E6"/>
-          </w:tcPr>
-          <w:p>
-            <w:pPr>
-              <w:spacing w:after="40" w:before="40" w:line="240" w:lineRule="auto"/>
-              <w:jc w:val="left"/>
-            </w:pPr>
-            <w:r>
-              <w:rPr>
-                <w:rFonts w:ascii="Times New Roman" w:hAnsi="Times New Roman" w:eastAsia="Times New Roman"/>
-                <w:b/>
-                <w:i w:val="0"/>
-                <w:color w:val="000000"/>
-                <w:sz w:val="24"/>
-              </w:rPr>
-              <w:t>Method in Chapter 3</w:t>
-            </w:r>
-          </w:p>
-        </w:tc>
-      </w:tr>
-      <w:tr>
-        <w:trPr>
-          <w:cantSplit/>
-        </w:trPr>
-        <w:tc>
-          <w:tcPr>
-            <w:tcW w:type="dxa" w:w="2326"/>
-          </w:tcPr>
-          <w:p>
-            <w:pPr>
-              <w:spacing w:after="40" w:before="40" w:line="240" w:lineRule="auto"/>
-              <w:jc w:val="left"/>
-            </w:pPr>
-            <w:r>
-              <w:rPr>
-                <w:rFonts w:ascii="Times New Roman" w:hAnsi="Times New Roman" w:eastAsia="Times New Roman"/>
-                <w:b w:val="0"/>
-                <w:i w:val="0"/>
-                <w:color w:val="000000"/>
-                <w:sz w:val="24"/>
-              </w:rPr>
-              <w:t>Only classical models, different datasets</w:t>
-            </w:r>
-          </w:p>
-        </w:tc>
-        <w:tc>
-          <w:tcPr>
-            <w:tcW w:type="dxa" w:w="2326"/>
-          </w:tcPr>
-          <w:p>
-            <w:pPr>
-              <w:spacing w:after="40" w:before="40" w:line="240" w:lineRule="auto"/>
-              <w:jc w:val="left"/>
-            </w:pPr>
-            <w:r>
-              <w:rPr>
-                <w:rFonts w:ascii="Times New Roman" w:hAnsi="Times New Roman" w:eastAsia="Times New Roman"/>
-                <w:b w:val="0"/>
-                <w:i w:val="0"/>
-                <w:color w:val="000000"/>
-                <w:sz w:val="24"/>
-              </w:rPr>
-              <w:t>Fair three-model benchmark</w:t>
-            </w:r>
-          </w:p>
-        </w:tc>
-        <w:tc>
-          <w:tcPr>
-            <w:tcW w:type="dxa" w:w="2326"/>
-          </w:tcPr>
-          <w:p>
-            <w:pPr>
-              <w:spacing w:after="40" w:before="40" w:line="240" w:lineRule="auto"/>
-              <w:jc w:val="left"/>
-            </w:pPr>
-            <w:r>
-              <w:rPr>
-                <w:rFonts w:ascii="Times New Roman" w:hAnsi="Times New Roman" w:eastAsia="Times New Roman"/>
-                <w:b w:val="0"/>
-                <w:i w:val="0"/>
-                <w:color w:val="000000"/>
-                <w:sz w:val="24"/>
-              </w:rPr>
-              <w:t>Same data, split, seed, and metrics</w:t>
-            </w:r>
-          </w:p>
-        </w:tc>
-        <w:tc>
-          <w:tcPr>
-            <w:tcW w:type="dxa" w:w="2052"/>
-          </w:tcPr>
-          <w:p>
-            <w:pPr>
-              <w:spacing w:after="40" w:before="40" w:line="240" w:lineRule="auto"/>
-              <w:jc w:val="left"/>
-            </w:pPr>
-            <w:r>
-              <w:rPr>
-                <w:rFonts w:ascii="Times New Roman" w:hAnsi="Times New Roman" w:eastAsia="Times New Roman"/>
-                <w:b w:val="0"/>
-                <w:i w:val="0"/>
-                <w:color w:val="000000"/>
-                <w:sz w:val="24"/>
-              </w:rPr>
-              <w:t>Sections 3.3, 3.8</w:t>
-            </w:r>
-          </w:p>
-        </w:tc>
-      </w:tr>
-      <w:tr>
-        <w:trPr>
-          <w:cantSplit/>
-        </w:trPr>
-        <w:tc>
-          <w:tcPr>
-            <w:tcW w:type="dxa" w:w="2326"/>
-          </w:tcPr>
-          <w:p>
-            <w:pPr>
-              <w:spacing w:after="40" w:before="40" w:line="240" w:lineRule="auto"/>
-              <w:jc w:val="left"/>
-            </w:pPr>
-            <w:r>
-              <w:rPr>
-                <w:rFonts w:ascii="Times New Roman" w:hAnsi="Times New Roman" w:eastAsia="Times New Roman"/>
-                <w:b w:val="0"/>
-                <w:i w:val="0"/>
-                <w:color w:val="000000"/>
-                <w:sz w:val="24"/>
-              </w:rPr>
-              <w:t>CatBoost not tuned</w:t>
-            </w:r>
-          </w:p>
-        </w:tc>
-        <w:tc>
-          <w:tcPr>
-            <w:tcW w:type="dxa" w:w="2326"/>
-          </w:tcPr>
-          <w:p>
-            <w:pPr>
-              <w:spacing w:after="40" w:before="40" w:line="240" w:lineRule="auto"/>
-              <w:jc w:val="left"/>
-            </w:pPr>
-            <w:r>
-              <w:rPr>
-                <w:rFonts w:ascii="Times New Roman" w:hAnsi="Times New Roman" w:eastAsia="Times New Roman"/>
-                <w:b w:val="0"/>
-                <w:i w:val="0"/>
-                <w:color w:val="000000"/>
-                <w:sz w:val="24"/>
-              </w:rPr>
-              <w:t>Strong tuned baseline</w:t>
-            </w:r>
-          </w:p>
-        </w:tc>
-        <w:tc>
-          <w:tcPr>
-            <w:tcW w:type="dxa" w:w="2326"/>
-          </w:tcPr>
-          <w:p>
-            <w:pPr>
-              <w:spacing w:after="40" w:before="40" w:line="240" w:lineRule="auto"/>
-              <w:jc w:val="left"/>
-            </w:pPr>
-            <w:r>
-              <w:rPr>
-                <w:rFonts w:ascii="Times New Roman" w:hAnsi="Times New Roman" w:eastAsia="Times New Roman"/>
-                <w:b w:val="0"/>
-                <w:i w:val="0"/>
-                <w:color w:val="000000"/>
-                <w:sz w:val="24"/>
-              </w:rPr>
-              <w:t>Grid search with cross-validation on training data</w:t>
-            </w:r>
-          </w:p>
-        </w:tc>
-        <w:tc>
-          <w:tcPr>
-            <w:tcW w:type="dxa" w:w="2052"/>
-          </w:tcPr>
-          <w:p>
-            <w:pPr>
-              <w:spacing w:after="40" w:before="40" w:line="240" w:lineRule="auto"/>
-              <w:jc w:val="left"/>
-            </w:pPr>
-            <w:r>
-              <w:rPr>
-                <w:rFonts w:ascii="Times New Roman" w:hAnsi="Times New Roman" w:eastAsia="Times New Roman"/>
-                <w:b w:val="0"/>
-                <w:i w:val="0"/>
-                <w:color w:val="000000"/>
-                <w:sz w:val="24"/>
-              </w:rPr>
-              <w:t>Section 3.4.1</w:t>
-            </w:r>
-          </w:p>
-        </w:tc>
-      </w:tr>
-      <w:tr>
-        <w:trPr>
-          <w:cantSplit/>
-        </w:trPr>
-        <w:tc>
-          <w:tcPr>
-            <w:tcW w:type="dxa" w:w="2326"/>
-          </w:tcPr>
-          <w:p>
-            <w:pPr>
-              <w:spacing w:after="40" w:before="40" w:line="240" w:lineRule="auto"/>
-              <w:jc w:val="left"/>
-            </w:pPr>
-            <w:r>
-              <w:rPr>
-                <w:rFonts w:ascii="Times New Roman" w:hAnsi="Times New Roman" w:eastAsia="Times New Roman"/>
-                <w:b w:val="0"/>
-                <w:i w:val="0"/>
-                <w:color w:val="000000"/>
-                <w:sz w:val="24"/>
-              </w:rPr>
-              <w:t>Foundation models not tested on hair fall</w:t>
-            </w:r>
-          </w:p>
-        </w:tc>
-        <w:tc>
-          <w:tcPr>
-            <w:tcW w:type="dxa" w:w="2326"/>
-          </w:tcPr>
-          <w:p>
-            <w:pPr>
-              <w:spacing w:after="40" w:before="40" w:line="240" w:lineRule="auto"/>
-              <w:jc w:val="left"/>
-            </w:pPr>
-            <w:r>
-              <w:rPr>
-                <w:rFonts w:ascii="Times New Roman" w:hAnsi="Times New Roman" w:eastAsia="Times New Roman"/>
-                <w:b w:val="0"/>
-                <w:i w:val="0"/>
-                <w:color w:val="000000"/>
-                <w:sz w:val="24"/>
-              </w:rPr>
-              <w:t>Competitive results without tuning, to be confirmed</w:t>
-            </w:r>
-          </w:p>
-        </w:tc>
-        <w:tc>
-          <w:tcPr>
-            <w:tcW w:type="dxa" w:w="2326"/>
-          </w:tcPr>
-          <w:p>
-            <w:pPr>
-              <w:spacing w:after="40" w:before="40" w:line="240" w:lineRule="auto"/>
-              <w:jc w:val="left"/>
-            </w:pPr>
-            <w:r>
-              <w:rPr>
-                <w:rFonts w:ascii="Times New Roman" w:hAnsi="Times New Roman" w:eastAsia="Times New Roman"/>
-                <w:b w:val="0"/>
-                <w:i w:val="0"/>
-                <w:color w:val="000000"/>
-                <w:sz w:val="24"/>
-              </w:rPr>
-              <w:t>Macro-F1 and ROC-AUC, McNemar's test, Wilson intervals</w:t>
-            </w:r>
-          </w:p>
-        </w:tc>
-        <w:tc>
-          <w:tcPr>
-            <w:tcW w:type="dxa" w:w="2052"/>
-          </w:tcPr>
-          <w:p>
-            <w:pPr>
-              <w:spacing w:after="40" w:before="40" w:line="240" w:lineRule="auto"/>
-              <w:jc w:val="left"/>
-            </w:pPr>
-            <w:r>
-              <w:rPr>
-                <w:rFonts w:ascii="Times New Roman" w:hAnsi="Times New Roman" w:eastAsia="Times New Roman"/>
-                <w:b w:val="0"/>
-                <w:i w:val="0"/>
-                <w:color w:val="000000"/>
-                <w:sz w:val="24"/>
-              </w:rPr>
-              <w:t>Sections 3.4.2, 3.4.3, 3.8</w:t>
-            </w:r>
-          </w:p>
-        </w:tc>
-      </w:tr>
-      <w:tr>
-        <w:trPr>
-          <w:cantSplit/>
-        </w:trPr>
-        <w:tc>
-          <w:tcPr>
-            <w:tcW w:type="dxa" w:w="2326"/>
-          </w:tcPr>
-          <w:p>
-            <w:pPr>
-              <w:spacing w:after="40" w:before="40" w:line="240" w:lineRule="auto"/>
-              <w:jc w:val="left"/>
-            </w:pPr>
-            <w:r>
-              <w:rPr>
-                <w:rFonts w:ascii="Times New Roman" w:hAnsi="Times New Roman" w:eastAsia="Times New Roman"/>
-                <w:b w:val="0"/>
-                <w:i w:val="0"/>
-                <w:color w:val="000000"/>
-                <w:sz w:val="24"/>
-              </w:rPr>
-              <w:t>TabFM limits unknown</w:t>
-            </w:r>
-          </w:p>
-        </w:tc>
-        <w:tc>
-          <w:tcPr>
-            <w:tcW w:type="dxa" w:w="2326"/>
-          </w:tcPr>
-          <w:p>
-            <w:pPr>
-              <w:spacing w:after="40" w:before="40" w:line="240" w:lineRule="auto"/>
-              <w:jc w:val="left"/>
-            </w:pPr>
-            <w:r>
-              <w:rPr>
-                <w:rFonts w:ascii="Times New Roman" w:hAnsi="Times New Roman" w:eastAsia="Times New Roman"/>
-                <w:b w:val="0"/>
-                <w:i w:val="0"/>
-                <w:color w:val="000000"/>
-                <w:sz w:val="24"/>
-              </w:rPr>
-              <w:t>Documented limits of TabFM</w:t>
-            </w:r>
-          </w:p>
-        </w:tc>
-        <w:tc>
-          <w:tcPr>
-            <w:tcW w:type="dxa" w:w="2326"/>
-          </w:tcPr>
-          <w:p>
-            <w:pPr>
-              <w:spacing w:after="40" w:before="40" w:line="240" w:lineRule="auto"/>
-              <w:jc w:val="left"/>
-            </w:pPr>
-            <w:r>
-              <w:rPr>
-                <w:rFonts w:ascii="Times New Roman" w:hAnsi="Times New Roman" w:eastAsia="Times New Roman"/>
-                <w:b w:val="0"/>
-                <w:i w:val="0"/>
-                <w:color w:val="000000"/>
-                <w:sz w:val="24"/>
-              </w:rPr>
-              <w:t>Recorded settings, problems, and run conditions</w:t>
-            </w:r>
-          </w:p>
-        </w:tc>
-        <w:tc>
-          <w:tcPr>
-            <w:tcW w:type="dxa" w:w="2052"/>
-          </w:tcPr>
-          <w:p>
-            <w:pPr>
-              <w:spacing w:after="40" w:before="40" w:line="240" w:lineRule="auto"/>
-              <w:jc w:val="left"/>
-            </w:pPr>
-            <w:r>
-              <w:rPr>
-                <w:rFonts w:ascii="Times New Roman" w:hAnsi="Times New Roman" w:eastAsia="Times New Roman"/>
-                <w:b w:val="0"/>
-                <w:i w:val="0"/>
-                <w:color w:val="000000"/>
-                <w:sz w:val="24"/>
-              </w:rPr>
-              <w:t>Section 3.7</w:t>
-            </w:r>
-          </w:p>
-        </w:tc>
-      </w:tr>
-      <w:tr>
-        <w:trPr>
-          <w:cantSplit/>
-        </w:trPr>
-        <w:tc>
-          <w:tcPr>
-            <w:tcW w:type="dxa" w:w="2326"/>
-          </w:tcPr>
-          <w:p>
-            <w:pPr>
-              <w:spacing w:after="40" w:before="40" w:line="240" w:lineRule="auto"/>
-              <w:jc w:val="left"/>
-            </w:pPr>
-            <w:r>
-              <w:rPr>
-                <w:rFonts w:ascii="Times New Roman" w:hAnsi="Times New Roman" w:eastAsia="Times New Roman"/>
-                <w:b w:val="0"/>
-                <w:i w:val="0"/>
-                <w:color w:val="000000"/>
-                <w:sz w:val="24"/>
-              </w:rPr>
-              <w:t>Explanations not compared</w:t>
-            </w:r>
-          </w:p>
-        </w:tc>
-        <w:tc>
-          <w:tcPr>
-            <w:tcW w:type="dxa" w:w="2326"/>
-          </w:tcPr>
-          <w:p>
-            <w:pPr>
-              <w:spacing w:after="40" w:before="40" w:line="240" w:lineRule="auto"/>
-              <w:jc w:val="left"/>
-            </w:pPr>
-            <w:r>
-              <w:rPr>
-                <w:rFonts w:ascii="Times New Roman" w:hAnsi="Times New Roman" w:eastAsia="Times New Roman"/>
-                <w:b w:val="0"/>
-                <w:i w:val="0"/>
-                <w:color w:val="000000"/>
-                <w:sz w:val="24"/>
-              </w:rPr>
-              <w:t>Comparable SHAP explanations for all three models</w:t>
-            </w:r>
-          </w:p>
-        </w:tc>
-        <w:tc>
-          <w:tcPr>
-            <w:tcW w:type="dxa" w:w="2326"/>
-          </w:tcPr>
-          <w:p>
-            <w:pPr>
-              <w:spacing w:after="40" w:before="40" w:line="240" w:lineRule="auto"/>
-              <w:jc w:val="left"/>
-            </w:pPr>
-            <w:r>
-              <w:rPr>
-                <w:rFonts w:ascii="Times New Roman" w:hAnsi="Times New Roman" w:eastAsia="Times New Roman"/>
-                <w:b w:val="0"/>
-                <w:i w:val="0"/>
-                <w:color w:val="000000"/>
-                <w:sz w:val="24"/>
-              </w:rPr>
-              <w:t>Global ranking and per-patient explanations</w:t>
-            </w:r>
-          </w:p>
-        </w:tc>
-        <w:tc>
-          <w:tcPr>
-            <w:tcW w:type="dxa" w:w="2052"/>
-          </w:tcPr>
-          <w:p>
-            <w:pPr>
-              <w:spacing w:after="40" w:before="40" w:line="240" w:lineRule="auto"/>
-              <w:jc w:val="left"/>
-            </w:pPr>
-            <w:r>
-              <w:rPr>
-                <w:rFonts w:ascii="Times New Roman" w:hAnsi="Times New Roman" w:eastAsia="Times New Roman"/>
-                <w:b w:val="0"/>
-                <w:i w:val="0"/>
-                <w:color w:val="000000"/>
-                <w:sz w:val="24"/>
-              </w:rPr>
-              <w:t>Section 3.5</w:t>
-            </w:r>
-          </w:p>
-        </w:tc>
-      </w:tr>
-    </w:tbl>
-    <w:p>
-      <w:pPr>
-        <w:spacing w:after="120" w:before="0" w:line="240" w:lineRule="auto"/>
-      </w:pPr>
-    </w:p>
-    <w:p>
-      <w:pPr>
-        <w:spacing w:after="240" w:before="0" w:line="360" w:lineRule="auto"/>
-        <w:jc w:val="both"/>
-      </w:pPr>
-      <w:r>
-        <w:rPr>
-          <w:rFonts w:ascii="Times New Roman" w:hAnsi="Times New Roman" w:eastAsia="Times New Roman"/>
-          <w:b w:val="0"/>
-          <w:i w:val="0"/>
-          <w:color w:val="000000"/>
-          <w:sz w:val="24"/>
-        </w:rPr>
-        <w:t>Beyond the individual outcomes, the study is expected to show whether explainable, data-efficient tabular modelling can be a practical alternative to heavily tuned gradient boosting for structured health risk prediction, and to leave a documented and reproducible pipeline that others can rerun on their own data.</w:t>
+        <w:t>SHAP is expected to show which measurements and habits drive each model's predicted risk tier and whether the three models agree. The factors the models rely on are expected to match the known biological causes of hair loss, such as iron level, stress, and family history. Agreement would support the use of the models as decision support, and disagreement would be reported as a finding. Overall, the study expects to show whether explainable, data-efficient tabular modelling can be a practical alternative to heavily tuned gradient boosting for structured health risk prediction, and to leave a documented and reproducible pipeline that others can rerun on their own data.</w:t>
       </w:r>
     </w:p>
     <w:p>
@@ -13259,7 +12514,7 @@
       <w:r>
         <w:drawing>
           <wp:inline xmlns:a="http://schemas.openxmlformats.org/drawingml/2006/main" xmlns:pic="http://schemas.openxmlformats.org/drawingml/2006/picture">
-            <wp:extent cx="5733288" cy="2873121"/>
+            <wp:extent cx="5733288" cy="4237939"/>
             <wp:docPr id="20" name="Picture 20"/>
             <wp:cNvGraphicFramePr>
               <a:graphicFrameLocks noChangeAspect="1"/>
@@ -13280,7 +12535,7 @@
                   <pic:spPr>
                     <a:xfrm>
                       <a:off x="0" y="0"/>
-                      <a:ext cx="5733288" cy="2873121"/>
+                      <a:ext cx="5733288" cy="4237939"/>
                     </a:xfrm>
                     <a:prstGeom prst="rect"/>
                   </pic:spPr>

</xml_diff>

<commit_message>
Update Chapter 3 Methodology: refine super dataset description and clarify figure annotations. Update binary files for Hairfall Proposal and related figures.
</commit_message>
<xml_diff>
--- a/Thesis_Final/Hairfall_Proposal.docx
+++ b/Thesis_Final/Hairfall_Proposal.docx
@@ -3196,7 +3196,7 @@
           <w:color w:val="000000"/>
           <w:sz w:val="24"/>
         </w:rPr>
-        <w:t>One super dataset of about 200,000 records was made. It contains all the fields of Dataset 1 and Dataset 2 and many additional fields (for example age group, hair fall tier, and number of risk factors). In the super dataset, age and gender were identified and the records were kept according to them. The super dataset was compared with Dataset 1 and Dataset 2, and this produced the final dataset of 21,606 records that is used in this study.</w:t>
+        <w:t>A super dataset of 200,000 records was taken. It contains all the fields of Dataset 1 and Dataset 2 and many additional fields (for example age group, hair fall tier, and number of risk factors). In the super dataset, age and gender were identified and the records were kept according to them. It was compared with Dataset 1 and Dataset 2, and this gave the final dataset of 21,606 records that is used in this study.</w:t>
       </w:r>
     </w:p>
     <w:p>
@@ -3235,12 +3235,12 @@
         <w:tblLook w:firstColumn="1" w:firstRow="1" w:lastColumn="0" w:lastRow="0" w:noHBand="0" w:noVBand="1" w:val="04A0"/>
       </w:tblPr>
       <w:tblGrid>
-        <w:gridCol w:w="984"/>
-        <w:gridCol w:w="1968"/>
-        <w:gridCol w:w="984"/>
-        <w:gridCol w:w="1968"/>
-        <w:gridCol w:w="1968"/>
-        <w:gridCol w:w="1158"/>
+        <w:gridCol w:w="1023"/>
+        <w:gridCol w:w="2047"/>
+        <w:gridCol w:w="662"/>
+        <w:gridCol w:w="2047"/>
+        <w:gridCol w:w="2047"/>
+        <w:gridCol w:w="1204"/>
       </w:tblGrid>
       <w:tr>
         <w:trPr>
@@ -3249,7 +3249,7 @@
         </w:trPr>
         <w:tc>
           <w:tcPr>
-            <w:tcW w:type="dxa" w:w="984"/>
+            <w:tcW w:type="dxa" w:w="1023"/>
             <w:shd w:val="clear" w:color="auto" w:fill="E7E6E6"/>
           </w:tcPr>
           <w:p>
@@ -3271,7 +3271,7 @@
         </w:tc>
         <w:tc>
           <w:tcPr>
-            <w:tcW w:type="dxa" w:w="1968"/>
+            <w:tcW w:type="dxa" w:w="2047"/>
             <w:shd w:val="clear" w:color="auto" w:fill="E7E6E6"/>
           </w:tcPr>
           <w:p>
@@ -3293,7 +3293,7 @@
         </w:tc>
         <w:tc>
           <w:tcPr>
-            <w:tcW w:type="dxa" w:w="984"/>
+            <w:tcW w:type="dxa" w:w="662"/>
             <w:shd w:val="clear" w:color="auto" w:fill="E7E6E6"/>
           </w:tcPr>
           <w:p>
@@ -3315,7 +3315,7 @@
         </w:tc>
         <w:tc>
           <w:tcPr>
-            <w:tcW w:type="dxa" w:w="1968"/>
+            <w:tcW w:type="dxa" w:w="2047"/>
             <w:shd w:val="clear" w:color="auto" w:fill="E7E6E6"/>
           </w:tcPr>
           <w:p>
@@ -3337,7 +3337,7 @@
         </w:tc>
         <w:tc>
           <w:tcPr>
-            <w:tcW w:type="dxa" w:w="1968"/>
+            <w:tcW w:type="dxa" w:w="2047"/>
             <w:shd w:val="clear" w:color="auto" w:fill="E7E6E6"/>
           </w:tcPr>
           <w:p>
@@ -3359,7 +3359,7 @@
         </w:tc>
         <w:tc>
           <w:tcPr>
-            <w:tcW w:type="dxa" w:w="1158"/>
+            <w:tcW w:type="dxa" w:w="1204"/>
             <w:shd w:val="clear" w:color="auto" w:fill="E7E6E6"/>
           </w:tcPr>
           <w:p>
@@ -3386,7 +3386,7 @@
         </w:trPr>
         <w:tc>
           <w:tcPr>
-            <w:tcW w:type="dxa" w:w="984"/>
+            <w:tcW w:type="dxa" w:w="1023"/>
           </w:tcPr>
           <w:p>
             <w:pPr>
@@ -3407,7 +3407,7 @@
         </w:tc>
         <w:tc>
           <w:tcPr>
-            <w:tcW w:type="dxa" w:w="1968"/>
+            <w:tcW w:type="dxa" w:w="2047"/>
           </w:tcPr>
           <w:p>
             <w:pPr>
@@ -3428,7 +3428,7 @@
         </w:tc>
         <w:tc>
           <w:tcPr>
-            <w:tcW w:type="dxa" w:w="984"/>
+            <w:tcW w:type="dxa" w:w="662"/>
           </w:tcPr>
           <w:p>
             <w:pPr>
@@ -3449,7 +3449,7 @@
         </w:tc>
         <w:tc>
           <w:tcPr>
-            <w:tcW w:type="dxa" w:w="1968"/>
+            <w:tcW w:type="dxa" w:w="2047"/>
           </w:tcPr>
           <w:p>
             <w:pPr>
@@ -3470,7 +3470,7 @@
         </w:tc>
         <w:tc>
           <w:tcPr>
-            <w:tcW w:type="dxa" w:w="1968"/>
+            <w:tcW w:type="dxa" w:w="2047"/>
           </w:tcPr>
           <w:p>
             <w:pPr>
@@ -3491,7 +3491,7 @@
         </w:tc>
         <w:tc>
           <w:tcPr>
-            <w:tcW w:type="dxa" w:w="1158"/>
+            <w:tcW w:type="dxa" w:w="1204"/>
           </w:tcPr>
           <w:p>
             <w:pPr>
@@ -3517,7 +3517,7 @@
         </w:trPr>
         <w:tc>
           <w:tcPr>
-            <w:tcW w:type="dxa" w:w="984"/>
+            <w:tcW w:type="dxa" w:w="1023"/>
           </w:tcPr>
           <w:p>
             <w:pPr>
@@ -3538,7 +3538,7 @@
         </w:tc>
         <w:tc>
           <w:tcPr>
-            <w:tcW w:type="dxa" w:w="1968"/>
+            <w:tcW w:type="dxa" w:w="2047"/>
           </w:tcPr>
           <w:p>
             <w:pPr>
@@ -3559,7 +3559,7 @@
         </w:tc>
         <w:tc>
           <w:tcPr>
-            <w:tcW w:type="dxa" w:w="984"/>
+            <w:tcW w:type="dxa" w:w="662"/>
           </w:tcPr>
           <w:p>
             <w:pPr>
@@ -3580,7 +3580,7 @@
         </w:tc>
         <w:tc>
           <w:tcPr>
-            <w:tcW w:type="dxa" w:w="1968"/>
+            <w:tcW w:type="dxa" w:w="2047"/>
           </w:tcPr>
           <w:p>
             <w:pPr>
@@ -3601,7 +3601,7 @@
         </w:tc>
         <w:tc>
           <w:tcPr>
-            <w:tcW w:type="dxa" w:w="1968"/>
+            <w:tcW w:type="dxa" w:w="2047"/>
           </w:tcPr>
           <w:p>
             <w:pPr>
@@ -3622,7 +3622,7 @@
         </w:tc>
         <w:tc>
           <w:tcPr>
-            <w:tcW w:type="dxa" w:w="1158"/>
+            <w:tcW w:type="dxa" w:w="1204"/>
           </w:tcPr>
           <w:p>
             <w:pPr>
@@ -3648,7 +3648,7 @@
         </w:trPr>
         <w:tc>
           <w:tcPr>
-            <w:tcW w:type="dxa" w:w="984"/>
+            <w:tcW w:type="dxa" w:w="1023"/>
           </w:tcPr>
           <w:p>
             <w:pPr>
@@ -3669,7 +3669,7 @@
         </w:tc>
         <w:tc>
           <w:tcPr>
-            <w:tcW w:type="dxa" w:w="1968"/>
+            <w:tcW w:type="dxa" w:w="2047"/>
           </w:tcPr>
           <w:p>
             <w:pPr>
@@ -3690,7 +3690,7 @@
         </w:tc>
         <w:tc>
           <w:tcPr>
-            <w:tcW w:type="dxa" w:w="984"/>
+            <w:tcW w:type="dxa" w:w="662"/>
           </w:tcPr>
           <w:p>
             <w:pPr>
@@ -3705,13 +3705,13 @@
                 <w:color w:val="000000"/>
                 <w:sz w:val="19"/>
               </w:rPr>
-              <w:t>About 200,000</w:t>
+              <w:t>200,000</w:t>
             </w:r>
           </w:p>
         </w:tc>
         <w:tc>
           <w:tcPr>
-            <w:tcW w:type="dxa" w:w="1968"/>
+            <w:tcW w:type="dxa" w:w="2047"/>
           </w:tcPr>
           <w:p>
             <w:pPr>
@@ -3732,7 +3732,7 @@
         </w:tc>
         <w:tc>
           <w:tcPr>
-            <w:tcW w:type="dxa" w:w="1968"/>
+            <w:tcW w:type="dxa" w:w="2047"/>
           </w:tcPr>
           <w:p>
             <w:pPr>
@@ -3753,7 +3753,7 @@
         </w:tc>
         <w:tc>
           <w:tcPr>
-            <w:tcW w:type="dxa" w:w="1158"/>
+            <w:tcW w:type="dxa" w:w="1204"/>
           </w:tcPr>
           <w:p>
             <w:pPr>
@@ -3779,7 +3779,7 @@
         </w:trPr>
         <w:tc>
           <w:tcPr>
-            <w:tcW w:type="dxa" w:w="984"/>
+            <w:tcW w:type="dxa" w:w="1023"/>
           </w:tcPr>
           <w:p>
             <w:pPr>
@@ -3800,7 +3800,7 @@
         </w:tc>
         <w:tc>
           <w:tcPr>
-            <w:tcW w:type="dxa" w:w="1968"/>
+            <w:tcW w:type="dxa" w:w="2047"/>
           </w:tcPr>
           <w:p>
             <w:pPr>
@@ -3821,7 +3821,7 @@
         </w:tc>
         <w:tc>
           <w:tcPr>
-            <w:tcW w:type="dxa" w:w="984"/>
+            <w:tcW w:type="dxa" w:w="662"/>
           </w:tcPr>
           <w:p>
             <w:pPr>
@@ -3842,7 +3842,7 @@
         </w:tc>
         <w:tc>
           <w:tcPr>
-            <w:tcW w:type="dxa" w:w="1968"/>
+            <w:tcW w:type="dxa" w:w="2047"/>
           </w:tcPr>
           <w:p>
             <w:pPr>
@@ -3863,7 +3863,7 @@
         </w:tc>
         <w:tc>
           <w:tcPr>
-            <w:tcW w:type="dxa" w:w="1968"/>
+            <w:tcW w:type="dxa" w:w="2047"/>
           </w:tcPr>
           <w:p>
             <w:pPr>
@@ -3884,7 +3884,7 @@
         </w:tc>
         <w:tc>
           <w:tcPr>
-            <w:tcW w:type="dxa" w:w="1158"/>
+            <w:tcW w:type="dxa" w:w="1204"/>
           </w:tcPr>
           <w:p>
             <w:pPr>
@@ -6481,7 +6481,7 @@
           <w:color w:val="000000"/>
           <w:sz w:val="24"/>
         </w:rPr>
-        <w:t>Dataset 1 and Dataset 2 were the two source datasets. The super dataset was made from them and holds all their fields. The final dataset was made using all three (Dataset 1, Dataset 2, and the super dataset), and only the final dataset is used for modelling.</w:t>
+        <w:t>Dataset 1 and Dataset 2 were the two source datasets. The super dataset holds all their fields. The final dataset was made using all three (Dataset 1, Dataset 2, and the super dataset), and only the final dataset is used for modelling.</w:t>
       </w:r>
     </w:p>
     <w:p>

</xml_diff>

<commit_message>
Update Chapter 3 Methodology: refine super dataset description and final dataset details for clarity. Update Hairfall Proposal binary files.
</commit_message>
<xml_diff>
--- a/Thesis_Final/Hairfall_Proposal.docx
+++ b/Thesis_Final/Hairfall_Proposal.docx
@@ -3684,7 +3684,7 @@
                 <w:color w:val="000000"/>
                 <w:sz w:val="19"/>
               </w:rPr>
-              <w:t>Dataset 1 and Dataset 2 combined</w:t>
+              <w:t>Consolidated health dataset</w:t>
             </w:r>
           </w:p>
         </w:tc>
@@ -3815,7 +3815,7 @@
                 <w:color w:val="000000"/>
                 <w:sz w:val="19"/>
               </w:rPr>
-              <w:t>Made from Dataset 1, Dataset 2, and the super dataset</w:t>
+              <w:t>Derived from Dataset 1, Dataset 2, and the super dataset</w:t>
             </w:r>
           </w:p>
         </w:tc>

</xml_diff>

<commit_message>
Update Chapter 3 Methodology: remove outdated model explanation and streamline content. Update Hairfall Proposal binary files.
</commit_message>
<xml_diff>
--- a/Thesis_Final/Hairfall_Proposal.docx
+++ b/Thesis_Final/Hairfall_Proposal.docx
@@ -990,7 +990,7 @@
           <w:sz w:val="24"/>
         </w:rPr>
         <w:tab/>
-        <w:t>16</w:t>
+        <w:t>15</w:t>
       </w:r>
     </w:p>
     <w:p>
@@ -1077,7 +1077,7 @@
           <w:sz w:val="24"/>
         </w:rPr>
         <w:tab/>
-        <w:t>20</w:t>
+        <w:t>19</w:t>
       </w:r>
     </w:p>
     <w:p>
@@ -1106,7 +1106,7 @@
           <w:sz w:val="24"/>
         </w:rPr>
         <w:tab/>
-        <w:t>20</w:t>
+        <w:t>19</w:t>
       </w:r>
     </w:p>
     <w:p>
@@ -1135,7 +1135,7 @@
           <w:sz w:val="24"/>
         </w:rPr>
         <w:tab/>
-        <w:t>20</w:t>
+        <w:t>19</w:t>
       </w:r>
     </w:p>
     <w:p>
@@ -1164,7 +1164,7 @@
           <w:sz w:val="24"/>
         </w:rPr>
         <w:tab/>
-        <w:t>22</w:t>
+        <w:t>21</w:t>
       </w:r>
     </w:p>
     <w:p>
@@ -1384,7 +1384,7 @@
           <w:sz w:val="24"/>
         </w:rPr>
         <w:tab/>
-        <w:t>17</w:t>
+        <w:t>16</w:t>
       </w:r>
     </w:p>
     <w:p>
@@ -1413,7 +1413,7 @@
           <w:sz w:val="24"/>
         </w:rPr>
         <w:tab/>
-        <w:t>21</w:t>
+        <w:t>20</w:t>
       </w:r>
     </w:p>
     <w:p>
@@ -1517,7 +1517,7 @@
           <w:sz w:val="24"/>
         </w:rPr>
         <w:tab/>
-        <w:t>16</w:t>
+        <w:t>15</w:t>
       </w:r>
     </w:p>
     <w:p>
@@ -8505,100 +8505,6 @@
     </w:p>
     <w:p>
       <w:pPr>
-        <w:tabs>
-          <w:tab w:pos="720" w:val="left"/>
-        </w:tabs>
-        <w:spacing w:after="160" w:before="0" w:line="360" w:lineRule="auto"/>
-        <w:ind w:left="720" w:hanging="432"/>
-        <w:jc w:val="both"/>
-      </w:pPr>
-      <w:r>
-        <w:rPr>
-          <w:rFonts w:ascii="Times New Roman" w:hAnsi="Times New Roman" w:eastAsia="Times New Roman"/>
-          <w:color w:val="000000"/>
-          <w:sz w:val="24"/>
-        </w:rPr>
-        <w:t>•</w:t>
-        <w:tab/>
-      </w:r>
-      <w:r>
-        <w:rPr>
-          <w:rFonts w:ascii="Times New Roman" w:hAnsi="Times New Roman" w:eastAsia="Times New Roman"/>
-          <w:b/>
-          <w:i w:val="0"/>
-          <w:color w:val="000000"/>
-          <w:sz w:val="24"/>
-        </w:rPr>
-        <w:t>CatBoost:</w:t>
-      </w:r>
-      <w:r>
-        <w:rPr>
-          <w:rFonts w:ascii="Times New Roman" w:hAnsi="Times New Roman" w:eastAsia="Times New Roman"/>
-          <w:b w:val="0"/>
-          <w:i w:val="0"/>
-          <w:color w:val="000000"/>
-          <w:sz w:val="24"/>
-        </w:rPr>
-        <w:t xml:space="preserve"> TreeExplainer, which uses the tree structure to compute exact values, will be applied to a sample of 1,000 test records.</w:t>
-      </w:r>
-    </w:p>
-    <w:p>
-      <w:pPr>
-        <w:tabs>
-          <w:tab w:pos="720" w:val="left"/>
-        </w:tabs>
-        <w:spacing w:after="160" w:before="0" w:line="360" w:lineRule="auto"/>
-        <w:ind w:left="720" w:hanging="432"/>
-        <w:jc w:val="both"/>
-      </w:pPr>
-      <w:r>
-        <w:rPr>
-          <w:rFonts w:ascii="Times New Roman" w:hAnsi="Times New Roman" w:eastAsia="Times New Roman"/>
-          <w:color w:val="000000"/>
-          <w:sz w:val="24"/>
-        </w:rPr>
-        <w:t>•</w:t>
-        <w:tab/>
-      </w:r>
-      <w:r>
-        <w:rPr>
-          <w:rFonts w:ascii="Times New Roman" w:hAnsi="Times New Roman" w:eastAsia="Times New Roman"/>
-          <w:b/>
-          <w:i w:val="0"/>
-          <w:color w:val="000000"/>
-          <w:sz w:val="24"/>
-        </w:rPr>
-        <w:t>TabPFN and TabFM:</w:t>
-      </w:r>
-      <w:r>
-        <w:rPr>
-          <w:rFonts w:ascii="Times New Roman" w:hAnsi="Times New Roman" w:eastAsia="Times New Roman"/>
-          <w:b w:val="0"/>
-          <w:i w:val="0"/>
-          <w:color w:val="000000"/>
-          <w:sz w:val="24"/>
-        </w:rPr>
-        <w:t xml:space="preserve"> KernelExplainer, which estimates the values by repeatedly changing the inputs and predicting again. Because every repeat is a full forward pass of a large model, it will be applied to a small sample of test records (a few tens) with a small k-means background set.</w:t>
-      </w:r>
-    </w:p>
-    <w:p>
-      <w:pPr>
-        <w:spacing w:after="240" w:before="0" w:line="360" w:lineRule="auto"/>
-        <w:jc w:val="both"/>
-      </w:pPr>
-      <w:r>
-        <w:rPr>
-          <w:rFonts w:ascii="Times New Roman" w:hAnsi="Times New Roman" w:eastAsia="Times New Roman"/>
-          <w:b w:val="0"/>
-          <w:i w:val="0"/>
-          <w:color w:val="000000"/>
-          <w:sz w:val="24"/>
-        </w:rPr>
-        <w:t>The results will be a global ranking of the features (which matter most overall) and per-patient explanations (why this person received this tier). The rankings of the three models will be compared with each other and with the known biology from Chapter 2.</w:t>
-      </w:r>
-    </w:p>
-    <w:p>
-      <w:pPr>
         <w:pStyle w:val="Heading2"/>
         <w:keepNext/>
         <w:spacing w:after="240" w:before="120" w:line="360" w:lineRule="auto"/>

</xml_diff>

<commit_message>
Update Chapter 3 Methodology: revise tools and technologies section for clarity and conciseness. Update experimental environment figure and related scripts. Update Hairfall Proposal binary files.
</commit_message>
<xml_diff>
--- a/Thesis_Final/Hairfall_Proposal.docx
+++ b/Thesis_Final/Hairfall_Proposal.docx
@@ -1489,35 +1489,6 @@
         </w:rPr>
         <w:tab/>
         <w:t>10</w:t>
-      </w:r>
-    </w:p>
-    <w:p>
-      <w:pPr>
-        <w:tabs>
-          <w:tab w:pos="9029" w:val="right" w:leader="dot"/>
-        </w:tabs>
-        <w:spacing w:after="120" w:before="0" w:line="360" w:lineRule="auto"/>
-        <w:ind w:left="0" w:right="0"/>
-        <w:jc w:val="left"/>
-      </w:pPr>
-      <w:r>
-        <w:rPr>
-          <w:rFonts w:ascii="Times New Roman" w:hAnsi="Times New Roman" w:eastAsia="Times New Roman"/>
-          <w:b w:val="0"/>
-          <w:color w:val="000000"/>
-          <w:sz w:val="24"/>
-        </w:rPr>
-        <w:t>Table 3.3: Software tools</w:t>
-      </w:r>
-      <w:r>
-        <w:rPr>
-          <w:rFonts w:ascii="Times New Roman" w:hAnsi="Times New Roman" w:eastAsia="Times New Roman"/>
-          <w:b w:val="0"/>
-          <w:color w:val="000000"/>
-          <w:sz w:val="24"/>
-        </w:rPr>
-        <w:tab/>
-        <w:t>15</w:t>
       </w:r>
     </w:p>
     <w:p>
@@ -8522,10 +8493,38 @@
     </w:p>
     <w:p>
       <w:pPr>
-        <w:keepNext/>
-        <w:spacing w:after="120" w:before="0" w:line="360" w:lineRule="auto"/>
-        <w:jc w:val="center"/>
-      </w:pPr>
+        <w:spacing w:after="240" w:before="0" w:line="360" w:lineRule="auto"/>
+        <w:jc w:val="both"/>
+      </w:pPr>
+      <w:r>
+        <w:rPr>
+          <w:rFonts w:ascii="Times New Roman" w:hAnsi="Times New Roman" w:eastAsia="Times New Roman"/>
+          <w:b w:val="0"/>
+          <w:i w:val="0"/>
+          <w:color w:val="000000"/>
+          <w:sz w:val="24"/>
+        </w:rPr>
+        <w:t>This research will be implemented using the following Python-based software stack:</w:t>
+      </w:r>
+    </w:p>
+    <w:p>
+      <w:pPr>
+        <w:tabs>
+          <w:tab w:pos="720" w:val="left"/>
+        </w:tabs>
+        <w:spacing w:after="160" w:before="0" w:line="360" w:lineRule="auto"/>
+        <w:ind w:left="720" w:hanging="432"/>
+        <w:jc w:val="both"/>
+      </w:pPr>
+      <w:r>
+        <w:rPr>
+          <w:rFonts w:ascii="Times New Roman" w:hAnsi="Times New Roman" w:eastAsia="Times New Roman"/>
+          <w:color w:val="000000"/>
+          <w:sz w:val="24"/>
+        </w:rPr>
+        <w:t>•</w:t>
+        <w:tab/>
+      </w:r>
       <w:r>
         <w:rPr>
           <w:rFonts w:ascii="Times New Roman" w:hAnsi="Times New Roman" w:eastAsia="Times New Roman"/>
@@ -8534,7 +8533,7 @@
           <w:color w:val="000000"/>
           <w:sz w:val="24"/>
         </w:rPr>
-        <w:t>Table 3.3:</w:t>
+        <w:t>Data manipulation and preprocessing:</w:t>
       </w:r>
       <w:r>
         <w:rPr>
@@ -8544,921 +8543,37 @@
           <w:color w:val="000000"/>
           <w:sz w:val="24"/>
         </w:rPr>
-        <w:t xml:space="preserve"> Software tools</w:t>
-      </w:r>
-    </w:p>
-    <w:tbl>
-      <w:tblPr>
-        <w:tblStyle w:val="TableGrid"/>
-        <w:tblW w:type="auto" w:w="0"/>
-        <w:jc w:val="center"/>
-        <w:tblLayout w:type="fixed"/>
-        <w:tblLook w:firstColumn="1" w:firstRow="1" w:lastColumn="0" w:lastRow="0" w:noHBand="0" w:noVBand="1" w:val="04A0"/>
-      </w:tblPr>
-      <w:tblGrid>
-        <w:gridCol w:w="3903"/>
-        <w:gridCol w:w="3485"/>
-        <w:gridCol w:w="1640"/>
-      </w:tblGrid>
-      <w:tr>
-        <w:trPr>
-          <w:cantSplit/>
-          <w:tblHeader/>
-        </w:trPr>
-        <w:tc>
-          <w:tcPr>
-            <w:tcW w:type="dxa" w:w="3903"/>
-            <w:shd w:val="clear" w:color="auto" w:fill="E7E6E6"/>
-          </w:tcPr>
-          <w:p>
-            <w:pPr>
-              <w:spacing w:after="40" w:before="40" w:line="240" w:lineRule="auto"/>
-              <w:jc w:val="left"/>
-            </w:pPr>
-            <w:r>
-              <w:rPr>
-                <w:rFonts w:ascii="Times New Roman" w:hAnsi="Times New Roman" w:eastAsia="Times New Roman"/>
-                <w:b/>
-                <w:i w:val="0"/>
-                <w:color w:val="000000"/>
-                <w:sz w:val="24"/>
-              </w:rPr>
-              <w:t>Purpose</w:t>
-            </w:r>
-          </w:p>
-        </w:tc>
-        <w:tc>
-          <w:tcPr>
-            <w:tcW w:type="dxa" w:w="3485"/>
-            <w:shd w:val="clear" w:color="auto" w:fill="E7E6E6"/>
-          </w:tcPr>
-          <w:p>
-            <w:pPr>
-              <w:spacing w:after="40" w:before="40" w:line="240" w:lineRule="auto"/>
-              <w:jc w:val="left"/>
-            </w:pPr>
-            <w:r>
-              <w:rPr>
-                <w:rFonts w:ascii="Times New Roman" w:hAnsi="Times New Roman" w:eastAsia="Times New Roman"/>
-                <w:b/>
-                <w:i w:val="0"/>
-                <w:color w:val="000000"/>
-                <w:sz w:val="24"/>
-              </w:rPr>
-              <w:t>Tool</w:t>
-            </w:r>
-          </w:p>
-        </w:tc>
-        <w:tc>
-          <w:tcPr>
-            <w:tcW w:type="dxa" w:w="1640"/>
-            <w:shd w:val="clear" w:color="auto" w:fill="E7E6E6"/>
-          </w:tcPr>
-          <w:p>
-            <w:pPr>
-              <w:spacing w:after="40" w:before="40" w:line="240" w:lineRule="auto"/>
-              <w:jc w:val="left"/>
-            </w:pPr>
-            <w:r>
-              <w:rPr>
-                <w:rFonts w:ascii="Times New Roman" w:hAnsi="Times New Roman" w:eastAsia="Times New Roman"/>
-                <w:b/>
-                <w:i w:val="0"/>
-                <w:color w:val="000000"/>
-                <w:sz w:val="24"/>
-              </w:rPr>
-              <w:t>Version</w:t>
-            </w:r>
-          </w:p>
-        </w:tc>
-      </w:tr>
-      <w:tr>
-        <w:trPr>
-          <w:cantSplit/>
-        </w:trPr>
-        <w:tc>
-          <w:tcPr>
-            <w:tcW w:type="dxa" w:w="3903"/>
-          </w:tcPr>
-          <w:p>
-            <w:pPr>
-              <w:spacing w:after="40" w:before="40" w:line="240" w:lineRule="auto"/>
-              <w:jc w:val="left"/>
-            </w:pPr>
-            <w:r>
-              <w:rPr>
-                <w:rFonts w:ascii="Times New Roman" w:hAnsi="Times New Roman" w:eastAsia="Times New Roman"/>
-                <w:b w:val="0"/>
-                <w:i w:val="0"/>
-                <w:color w:val="000000"/>
-                <w:sz w:val="24"/>
-              </w:rPr>
-              <w:t>Language</w:t>
-            </w:r>
-          </w:p>
-        </w:tc>
-        <w:tc>
-          <w:tcPr>
-            <w:tcW w:type="dxa" w:w="3485"/>
-          </w:tcPr>
-          <w:p>
-            <w:pPr>
-              <w:spacing w:after="40" w:before="40" w:line="240" w:lineRule="auto"/>
-              <w:jc w:val="left"/>
-            </w:pPr>
-            <w:r>
-              <w:rPr>
-                <w:rFonts w:ascii="Times New Roman" w:hAnsi="Times New Roman" w:eastAsia="Times New Roman"/>
-                <w:b w:val="0"/>
-                <w:i w:val="0"/>
-                <w:color w:val="000000"/>
-                <w:sz w:val="24"/>
-              </w:rPr>
-              <w:t>Python</w:t>
-            </w:r>
-          </w:p>
-        </w:tc>
-        <w:tc>
-          <w:tcPr>
-            <w:tcW w:type="dxa" w:w="1640"/>
-          </w:tcPr>
-          <w:p>
-            <w:pPr>
-              <w:spacing w:after="40" w:before="40" w:line="240" w:lineRule="auto"/>
-              <w:jc w:val="left"/>
-            </w:pPr>
-            <w:r>
-              <w:rPr>
-                <w:rFonts w:ascii="Times New Roman" w:hAnsi="Times New Roman" w:eastAsia="Times New Roman"/>
-                <w:b w:val="0"/>
-                <w:i w:val="0"/>
-                <w:color w:val="000000"/>
-                <w:sz w:val="24"/>
-              </w:rPr>
-              <w:t>3.12.14</w:t>
-            </w:r>
-          </w:p>
-        </w:tc>
-      </w:tr>
-      <w:tr>
-        <w:trPr>
-          <w:cantSplit/>
-        </w:trPr>
-        <w:tc>
-          <w:tcPr>
-            <w:tcW w:type="dxa" w:w="3903"/>
-          </w:tcPr>
-          <w:p>
-            <w:pPr>
-              <w:spacing w:after="40" w:before="40" w:line="240" w:lineRule="auto"/>
-              <w:jc w:val="left"/>
-            </w:pPr>
-            <w:r>
-              <w:rPr>
-                <w:rFonts w:ascii="Times New Roman" w:hAnsi="Times New Roman" w:eastAsia="Times New Roman"/>
-                <w:b w:val="0"/>
-                <w:i w:val="0"/>
-                <w:color w:val="000000"/>
-                <w:sz w:val="24"/>
-              </w:rPr>
-              <w:t>Data handling</w:t>
-            </w:r>
-          </w:p>
-        </w:tc>
-        <w:tc>
-          <w:tcPr>
-            <w:tcW w:type="dxa" w:w="3485"/>
-          </w:tcPr>
-          <w:p>
-            <w:pPr>
-              <w:spacing w:after="40" w:before="40" w:line="240" w:lineRule="auto"/>
-              <w:jc w:val="left"/>
-            </w:pPr>
-            <w:r>
-              <w:rPr>
-                <w:rFonts w:ascii="Times New Roman" w:hAnsi="Times New Roman" w:eastAsia="Times New Roman"/>
-                <w:b w:val="0"/>
-                <w:i w:val="0"/>
-                <w:color w:val="000000"/>
-                <w:sz w:val="24"/>
-              </w:rPr>
-              <w:t>pandas, NumPy</w:t>
-            </w:r>
-          </w:p>
-        </w:tc>
-        <w:tc>
-          <w:tcPr>
-            <w:tcW w:type="dxa" w:w="1640"/>
-          </w:tcPr>
-          <w:p>
-            <w:pPr>
-              <w:spacing w:after="40" w:before="40" w:line="240" w:lineRule="auto"/>
-              <w:jc w:val="left"/>
-            </w:pPr>
-            <w:r>
-              <w:rPr>
-                <w:rFonts w:ascii="Times New Roman" w:hAnsi="Times New Roman" w:eastAsia="Times New Roman"/>
-                <w:b w:val="0"/>
-                <w:i w:val="0"/>
-                <w:color w:val="000000"/>
-                <w:sz w:val="24"/>
-              </w:rPr>
-              <w:t>3.0.6, 2.5.3</w:t>
-            </w:r>
-          </w:p>
-        </w:tc>
-      </w:tr>
-      <w:tr>
-        <w:trPr>
-          <w:cantSplit/>
-        </w:trPr>
-        <w:tc>
-          <w:tcPr>
-            <w:tcW w:type="dxa" w:w="3903"/>
-          </w:tcPr>
-          <w:p>
-            <w:pPr>
-              <w:spacing w:after="40" w:before="40" w:line="240" w:lineRule="auto"/>
-              <w:jc w:val="left"/>
-            </w:pPr>
-            <w:r>
-              <w:rPr>
-                <w:rFonts w:ascii="Times New Roman" w:hAnsi="Times New Roman" w:eastAsia="Times New Roman"/>
-                <w:b w:val="0"/>
-                <w:i w:val="0"/>
-                <w:color w:val="000000"/>
-                <w:sz w:val="24"/>
-              </w:rPr>
-              <w:t>Split, metrics, cross-validation</w:t>
-            </w:r>
-          </w:p>
-        </w:tc>
-        <w:tc>
-          <w:tcPr>
-            <w:tcW w:type="dxa" w:w="3485"/>
-          </w:tcPr>
-          <w:p>
-            <w:pPr>
-              <w:spacing w:after="40" w:before="40" w:line="240" w:lineRule="auto"/>
-              <w:jc w:val="left"/>
-            </w:pPr>
-            <w:r>
-              <w:rPr>
-                <w:rFonts w:ascii="Times New Roman" w:hAnsi="Times New Roman" w:eastAsia="Times New Roman"/>
-                <w:b w:val="0"/>
-                <w:i w:val="0"/>
-                <w:color w:val="000000"/>
-                <w:sz w:val="24"/>
-              </w:rPr>
-              <w:t>scikit-learn</w:t>
-            </w:r>
-          </w:p>
-        </w:tc>
-        <w:tc>
-          <w:tcPr>
-            <w:tcW w:type="dxa" w:w="1640"/>
-          </w:tcPr>
-          <w:p>
-            <w:pPr>
-              <w:spacing w:after="40" w:before="40" w:line="240" w:lineRule="auto"/>
-              <w:jc w:val="left"/>
-            </w:pPr>
-            <w:r>
-              <w:rPr>
-                <w:rFonts w:ascii="Times New Roman" w:hAnsi="Times New Roman" w:eastAsia="Times New Roman"/>
-                <w:b w:val="0"/>
-                <w:i w:val="0"/>
-                <w:color w:val="000000"/>
-                <w:sz w:val="24"/>
-              </w:rPr>
-              <w:t>1.9.1</w:t>
-            </w:r>
-          </w:p>
-        </w:tc>
-      </w:tr>
-      <w:tr>
-        <w:trPr>
-          <w:cantSplit/>
-        </w:trPr>
-        <w:tc>
-          <w:tcPr>
-            <w:tcW w:type="dxa" w:w="3903"/>
-          </w:tcPr>
-          <w:p>
-            <w:pPr>
-              <w:spacing w:after="40" w:before="40" w:line="240" w:lineRule="auto"/>
-              <w:jc w:val="left"/>
-            </w:pPr>
-            <w:r>
-              <w:rPr>
-                <w:rFonts w:ascii="Times New Roman" w:hAnsi="Times New Roman" w:eastAsia="Times New Roman"/>
-                <w:b w:val="0"/>
-                <w:i w:val="0"/>
-                <w:color w:val="000000"/>
-                <w:sz w:val="24"/>
-              </w:rPr>
-              <w:t>Statistical tests</w:t>
-            </w:r>
-          </w:p>
-        </w:tc>
-        <w:tc>
-          <w:tcPr>
-            <w:tcW w:type="dxa" w:w="3485"/>
-          </w:tcPr>
-          <w:p>
-            <w:pPr>
-              <w:spacing w:after="40" w:before="40" w:line="240" w:lineRule="auto"/>
-              <w:jc w:val="left"/>
-            </w:pPr>
-            <w:r>
-              <w:rPr>
-                <w:rFonts w:ascii="Times New Roman" w:hAnsi="Times New Roman" w:eastAsia="Times New Roman"/>
-                <w:b w:val="0"/>
-                <w:i w:val="0"/>
-                <w:color w:val="000000"/>
-                <w:sz w:val="24"/>
-              </w:rPr>
-              <w:t>statsmodels (McNemar's test, Wilson intervals)</w:t>
-            </w:r>
-          </w:p>
-        </w:tc>
-        <w:tc>
-          <w:tcPr>
-            <w:tcW w:type="dxa" w:w="1640"/>
-          </w:tcPr>
-          <w:p>
-            <w:pPr>
-              <w:spacing w:after="40" w:before="40" w:line="240" w:lineRule="auto"/>
-              <w:jc w:val="left"/>
-            </w:pPr>
-            <w:r>
-              <w:rPr>
-                <w:rFonts w:ascii="Times New Roman" w:hAnsi="Times New Roman" w:eastAsia="Times New Roman"/>
-                <w:b w:val="0"/>
-                <w:i w:val="0"/>
-                <w:color w:val="000000"/>
-                <w:sz w:val="24"/>
-              </w:rPr>
-              <w:t>0.15.0</w:t>
-            </w:r>
-          </w:p>
-        </w:tc>
-      </w:tr>
-      <w:tr>
-        <w:trPr>
-          <w:cantSplit/>
-        </w:trPr>
-        <w:tc>
-          <w:tcPr>
-            <w:tcW w:type="dxa" w:w="3903"/>
-          </w:tcPr>
-          <w:p>
-            <w:pPr>
-              <w:spacing w:after="40" w:before="40" w:line="240" w:lineRule="auto"/>
-              <w:jc w:val="left"/>
-            </w:pPr>
-            <w:r>
-              <w:rPr>
-                <w:rFonts w:ascii="Times New Roman" w:hAnsi="Times New Roman" w:eastAsia="Times New Roman"/>
-                <w:b w:val="0"/>
-                <w:i w:val="0"/>
-                <w:color w:val="000000"/>
-                <w:sz w:val="24"/>
-              </w:rPr>
-              <w:t>Gradient boosting model</w:t>
-            </w:r>
-          </w:p>
-        </w:tc>
-        <w:tc>
-          <w:tcPr>
-            <w:tcW w:type="dxa" w:w="3485"/>
-          </w:tcPr>
-          <w:p>
-            <w:pPr>
-              <w:spacing w:after="40" w:before="40" w:line="240" w:lineRule="auto"/>
-              <w:jc w:val="left"/>
-            </w:pPr>
-            <w:r>
-              <w:rPr>
-                <w:rFonts w:ascii="Times New Roman" w:hAnsi="Times New Roman" w:eastAsia="Times New Roman"/>
-                <w:b w:val="0"/>
-                <w:i w:val="0"/>
-                <w:color w:val="000000"/>
-                <w:sz w:val="24"/>
-              </w:rPr>
-              <w:t>CatBoost</w:t>
-            </w:r>
-          </w:p>
-        </w:tc>
-        <w:tc>
-          <w:tcPr>
-            <w:tcW w:type="dxa" w:w="1640"/>
-          </w:tcPr>
-          <w:p>
-            <w:pPr>
-              <w:spacing w:after="40" w:before="40" w:line="240" w:lineRule="auto"/>
-              <w:jc w:val="left"/>
-            </w:pPr>
-            <w:r>
-              <w:rPr>
-                <w:rFonts w:ascii="Times New Roman" w:hAnsi="Times New Roman" w:eastAsia="Times New Roman"/>
-                <w:b w:val="0"/>
-                <w:i w:val="0"/>
-                <w:color w:val="000000"/>
-                <w:sz w:val="24"/>
-              </w:rPr>
-              <w:t>1.2.10</w:t>
-            </w:r>
-          </w:p>
-        </w:tc>
-      </w:tr>
-      <w:tr>
-        <w:trPr>
-          <w:cantSplit/>
-        </w:trPr>
-        <w:tc>
-          <w:tcPr>
-            <w:tcW w:type="dxa" w:w="3903"/>
-          </w:tcPr>
-          <w:p>
-            <w:pPr>
-              <w:spacing w:after="40" w:before="40" w:line="240" w:lineRule="auto"/>
-              <w:jc w:val="left"/>
-            </w:pPr>
-            <w:r>
-              <w:rPr>
-                <w:rFonts w:ascii="Times New Roman" w:hAnsi="Times New Roman" w:eastAsia="Times New Roman"/>
-                <w:b w:val="0"/>
-                <w:i w:val="0"/>
-                <w:color w:val="000000"/>
-                <w:sz w:val="24"/>
-              </w:rPr>
-              <w:t>Foundation model 1</w:t>
-            </w:r>
-          </w:p>
-        </w:tc>
-        <w:tc>
-          <w:tcPr>
-            <w:tcW w:type="dxa" w:w="3485"/>
-          </w:tcPr>
-          <w:p>
-            <w:pPr>
-              <w:spacing w:after="40" w:before="40" w:line="240" w:lineRule="auto"/>
-              <w:jc w:val="left"/>
-            </w:pPr>
-            <w:r>
-              <w:rPr>
-                <w:rFonts w:ascii="Times New Roman" w:hAnsi="Times New Roman" w:eastAsia="Times New Roman"/>
-                <w:b w:val="0"/>
-                <w:i w:val="0"/>
-                <w:color w:val="000000"/>
-                <w:sz w:val="24"/>
-              </w:rPr>
-              <w:t>TabPFN</w:t>
-            </w:r>
-          </w:p>
-        </w:tc>
-        <w:tc>
-          <w:tcPr>
-            <w:tcW w:type="dxa" w:w="1640"/>
-          </w:tcPr>
-          <w:p>
-            <w:pPr>
-              <w:spacing w:after="40" w:before="40" w:line="240" w:lineRule="auto"/>
-              <w:jc w:val="left"/>
-            </w:pPr>
-            <w:r>
-              <w:rPr>
-                <w:rFonts w:ascii="Times New Roman" w:hAnsi="Times New Roman" w:eastAsia="Times New Roman"/>
-                <w:b w:val="0"/>
-                <w:i w:val="0"/>
-                <w:color w:val="000000"/>
-                <w:sz w:val="24"/>
-              </w:rPr>
-              <w:t>9.0.0</w:t>
-            </w:r>
-          </w:p>
-        </w:tc>
-      </w:tr>
-      <w:tr>
-        <w:trPr>
-          <w:cantSplit/>
-        </w:trPr>
-        <w:tc>
-          <w:tcPr>
-            <w:tcW w:type="dxa" w:w="3903"/>
-          </w:tcPr>
-          <w:p>
-            <w:pPr>
-              <w:spacing w:after="40" w:before="40" w:line="240" w:lineRule="auto"/>
-              <w:jc w:val="left"/>
-            </w:pPr>
-            <w:r>
-              <w:rPr>
-                <w:rFonts w:ascii="Times New Roman" w:hAnsi="Times New Roman" w:eastAsia="Times New Roman"/>
-                <w:b w:val="0"/>
-                <w:i w:val="0"/>
-                <w:color w:val="000000"/>
-                <w:sz w:val="24"/>
-              </w:rPr>
-              <w:t>Foundation model 2</w:t>
-            </w:r>
-          </w:p>
-        </w:tc>
-        <w:tc>
-          <w:tcPr>
-            <w:tcW w:type="dxa" w:w="3485"/>
-          </w:tcPr>
-          <w:p>
-            <w:pPr>
-              <w:spacing w:after="40" w:before="40" w:line="240" w:lineRule="auto"/>
-              <w:jc w:val="left"/>
-            </w:pPr>
-            <w:r>
-              <w:rPr>
-                <w:rFonts w:ascii="Times New Roman" w:hAnsi="Times New Roman" w:eastAsia="Times New Roman"/>
-                <w:b w:val="0"/>
-                <w:i w:val="0"/>
-                <w:color w:val="000000"/>
-                <w:sz w:val="24"/>
-              </w:rPr>
-              <w:t>TabFM (weights from Hugging Face: google/tabfm-1.0.0-pytorch)</w:t>
-            </w:r>
-          </w:p>
-        </w:tc>
-        <w:tc>
-          <w:tcPr>
-            <w:tcW w:type="dxa" w:w="1640"/>
-          </w:tcPr>
-          <w:p>
-            <w:pPr>
-              <w:spacing w:after="40" w:before="40" w:line="240" w:lineRule="auto"/>
-              <w:jc w:val="left"/>
-            </w:pPr>
-            <w:r>
-              <w:rPr>
-                <w:rFonts w:ascii="Times New Roman" w:hAnsi="Times New Roman" w:eastAsia="Times New Roman"/>
-                <w:b w:val="0"/>
-                <w:i w:val="0"/>
-                <w:color w:val="000000"/>
-                <w:sz w:val="24"/>
-              </w:rPr>
-              <w:t>1.0.1</w:t>
-            </w:r>
-          </w:p>
-        </w:tc>
-      </w:tr>
-      <w:tr>
-        <w:trPr>
-          <w:cantSplit/>
-        </w:trPr>
-        <w:tc>
-          <w:tcPr>
-            <w:tcW w:type="dxa" w:w="3903"/>
-          </w:tcPr>
-          <w:p>
-            <w:pPr>
-              <w:spacing w:after="40" w:before="40" w:line="240" w:lineRule="auto"/>
-              <w:jc w:val="left"/>
-            </w:pPr>
-            <w:r>
-              <w:rPr>
-                <w:rFonts w:ascii="Times New Roman" w:hAnsi="Times New Roman" w:eastAsia="Times New Roman"/>
-                <w:b w:val="0"/>
-                <w:i w:val="0"/>
-                <w:color w:val="000000"/>
-                <w:sz w:val="24"/>
-              </w:rPr>
-              <w:t>Explainability</w:t>
-            </w:r>
-          </w:p>
-        </w:tc>
-        <w:tc>
-          <w:tcPr>
-            <w:tcW w:type="dxa" w:w="3485"/>
-          </w:tcPr>
-          <w:p>
-            <w:pPr>
-              <w:spacing w:after="40" w:before="40" w:line="240" w:lineRule="auto"/>
-              <w:jc w:val="left"/>
-            </w:pPr>
-            <w:r>
-              <w:rPr>
-                <w:rFonts w:ascii="Times New Roman" w:hAnsi="Times New Roman" w:eastAsia="Times New Roman"/>
-                <w:b w:val="0"/>
-                <w:i w:val="0"/>
-                <w:color w:val="000000"/>
-                <w:sz w:val="24"/>
-              </w:rPr>
-              <w:t>SHAP</w:t>
-            </w:r>
-          </w:p>
-        </w:tc>
-        <w:tc>
-          <w:tcPr>
-            <w:tcW w:type="dxa" w:w="1640"/>
-          </w:tcPr>
-          <w:p>
-            <w:pPr>
-              <w:spacing w:after="40" w:before="40" w:line="240" w:lineRule="auto"/>
-              <w:jc w:val="left"/>
-            </w:pPr>
-            <w:r>
-              <w:rPr>
-                <w:rFonts w:ascii="Times New Roman" w:hAnsi="Times New Roman" w:eastAsia="Times New Roman"/>
-                <w:b w:val="0"/>
-                <w:i w:val="0"/>
-                <w:color w:val="000000"/>
-                <w:sz w:val="24"/>
-              </w:rPr>
-              <w:t>0.52.0</w:t>
-            </w:r>
-          </w:p>
-        </w:tc>
-      </w:tr>
-      <w:tr>
-        <w:trPr>
-          <w:cantSplit/>
-        </w:trPr>
-        <w:tc>
-          <w:tcPr>
-            <w:tcW w:type="dxa" w:w="3903"/>
-          </w:tcPr>
-          <w:p>
-            <w:pPr>
-              <w:spacing w:after="40" w:before="40" w:line="240" w:lineRule="auto"/>
-              <w:jc w:val="left"/>
-            </w:pPr>
-            <w:r>
-              <w:rPr>
-                <w:rFonts w:ascii="Times New Roman" w:hAnsi="Times New Roman" w:eastAsia="Times New Roman"/>
-                <w:b w:val="0"/>
-                <w:i w:val="0"/>
-                <w:color w:val="000000"/>
-                <w:sz w:val="24"/>
-              </w:rPr>
-              <w:t>Deep learning backend</w:t>
-            </w:r>
-          </w:p>
-        </w:tc>
-        <w:tc>
-          <w:tcPr>
-            <w:tcW w:type="dxa" w:w="3485"/>
-          </w:tcPr>
-          <w:p>
-            <w:pPr>
-              <w:spacing w:after="40" w:before="40" w:line="240" w:lineRule="auto"/>
-              <w:jc w:val="left"/>
-            </w:pPr>
-            <w:r>
-              <w:rPr>
-                <w:rFonts w:ascii="Times New Roman" w:hAnsi="Times New Roman" w:eastAsia="Times New Roman"/>
-                <w:b w:val="0"/>
-                <w:i w:val="0"/>
-                <w:color w:val="000000"/>
-                <w:sz w:val="24"/>
-              </w:rPr>
-              <w:t>PyTorch</w:t>
-            </w:r>
-          </w:p>
-        </w:tc>
-        <w:tc>
-          <w:tcPr>
-            <w:tcW w:type="dxa" w:w="1640"/>
-          </w:tcPr>
-          <w:p>
-            <w:pPr>
-              <w:spacing w:after="40" w:before="40" w:line="240" w:lineRule="auto"/>
-              <w:jc w:val="left"/>
-            </w:pPr>
-            <w:r>
-              <w:rPr>
-                <w:rFonts w:ascii="Times New Roman" w:hAnsi="Times New Roman" w:eastAsia="Times New Roman"/>
-                <w:b w:val="0"/>
-                <w:i w:val="0"/>
-                <w:color w:val="000000"/>
-                <w:sz w:val="24"/>
-              </w:rPr>
-              <w:t>2.14.0</w:t>
-            </w:r>
-          </w:p>
-        </w:tc>
-      </w:tr>
-      <w:tr>
-        <w:trPr>
-          <w:cantSplit/>
-        </w:trPr>
-        <w:tc>
-          <w:tcPr>
-            <w:tcW w:type="dxa" w:w="3903"/>
-          </w:tcPr>
-          <w:p>
-            <w:pPr>
-              <w:spacing w:after="40" w:before="40" w:line="240" w:lineRule="auto"/>
-              <w:jc w:val="left"/>
-            </w:pPr>
-            <w:r>
-              <w:rPr>
-                <w:rFonts w:ascii="Times New Roman" w:hAnsi="Times New Roman" w:eastAsia="Times New Roman"/>
-                <w:b w:val="0"/>
-                <w:i w:val="0"/>
-                <w:color w:val="000000"/>
-                <w:sz w:val="24"/>
-              </w:rPr>
-              <w:t>Charts</w:t>
-            </w:r>
-          </w:p>
-        </w:tc>
-        <w:tc>
-          <w:tcPr>
-            <w:tcW w:type="dxa" w:w="3485"/>
-          </w:tcPr>
-          <w:p>
-            <w:pPr>
-              <w:spacing w:after="40" w:before="40" w:line="240" w:lineRule="auto"/>
-              <w:jc w:val="left"/>
-            </w:pPr>
-            <w:r>
-              <w:rPr>
-                <w:rFonts w:ascii="Times New Roman" w:hAnsi="Times New Roman" w:eastAsia="Times New Roman"/>
-                <w:b w:val="0"/>
-                <w:i w:val="0"/>
-                <w:color w:val="000000"/>
-                <w:sz w:val="24"/>
-              </w:rPr>
-              <w:t>Matplotlib</w:t>
-            </w:r>
-          </w:p>
-        </w:tc>
-        <w:tc>
-          <w:tcPr>
-            <w:tcW w:type="dxa" w:w="1640"/>
-          </w:tcPr>
-          <w:p>
-            <w:pPr>
-              <w:spacing w:after="40" w:before="40" w:line="240" w:lineRule="auto"/>
-              <w:jc w:val="left"/>
-            </w:pPr>
-            <w:r>
-              <w:rPr>
-                <w:rFonts w:ascii="Times New Roman" w:hAnsi="Times New Roman" w:eastAsia="Times New Roman"/>
-                <w:b w:val="0"/>
-                <w:i w:val="0"/>
-                <w:color w:val="000000"/>
-                <w:sz w:val="24"/>
-              </w:rPr>
-              <w:t>3.11.2</w:t>
-            </w:r>
-          </w:p>
-        </w:tc>
-      </w:tr>
-      <w:tr>
-        <w:trPr>
-          <w:cantSplit/>
-        </w:trPr>
-        <w:tc>
-          <w:tcPr>
-            <w:tcW w:type="dxa" w:w="3903"/>
-          </w:tcPr>
-          <w:p>
-            <w:pPr>
-              <w:spacing w:after="40" w:before="40" w:line="240" w:lineRule="auto"/>
-              <w:jc w:val="left"/>
-            </w:pPr>
-            <w:r>
-              <w:rPr>
-                <w:rFonts w:ascii="Times New Roman" w:hAnsi="Times New Roman" w:eastAsia="Times New Roman"/>
-                <w:b w:val="0"/>
-                <w:i w:val="0"/>
-                <w:color w:val="000000"/>
-                <w:sz w:val="24"/>
-              </w:rPr>
-              <w:t>Workflow</w:t>
-            </w:r>
-          </w:p>
-        </w:tc>
-        <w:tc>
-          <w:tcPr>
-            <w:tcW w:type="dxa" w:w="3485"/>
-          </w:tcPr>
-          <w:p>
-            <w:pPr>
-              <w:spacing w:after="40" w:before="40" w:line="240" w:lineRule="auto"/>
-              <w:jc w:val="left"/>
-            </w:pPr>
-            <w:r>
-              <w:rPr>
-                <w:rFonts w:ascii="Times New Roman" w:hAnsi="Times New Roman" w:eastAsia="Times New Roman"/>
-                <w:b w:val="0"/>
-                <w:i w:val="0"/>
-                <w:color w:val="000000"/>
-                <w:sz w:val="24"/>
-              </w:rPr>
-              <w:t>Local lab application (notebook-style steps) with PostgreSQL and MinIO</w:t>
-            </w:r>
-          </w:p>
-        </w:tc>
-        <w:tc>
-          <w:tcPr>
-            <w:tcW w:type="dxa" w:w="1640"/>
-          </w:tcPr>
-          <w:p>
-            <w:pPr>
-              <w:spacing w:after="40" w:before="40" w:line="240" w:lineRule="auto"/>
-              <w:jc w:val="left"/>
-            </w:pPr>
-            <w:r>
-              <w:rPr>
-                <w:rFonts w:ascii="Times New Roman" w:hAnsi="Times New Roman" w:eastAsia="Times New Roman"/>
-                <w:b w:val="0"/>
-                <w:i w:val="0"/>
-                <w:color w:val="000000"/>
-                <w:sz w:val="24"/>
-              </w:rPr>
-              <w:t>—</w:t>
-            </w:r>
-          </w:p>
-        </w:tc>
-      </w:tr>
-      <w:tr>
-        <w:trPr>
-          <w:cantSplit/>
-        </w:trPr>
-        <w:tc>
-          <w:tcPr>
-            <w:tcW w:type="dxa" w:w="3903"/>
-          </w:tcPr>
-          <w:p>
-            <w:pPr>
-              <w:spacing w:after="40" w:before="40" w:line="240" w:lineRule="auto"/>
-              <w:jc w:val="left"/>
-            </w:pPr>
-            <w:r>
-              <w:rPr>
-                <w:rFonts w:ascii="Times New Roman" w:hAnsi="Times New Roman" w:eastAsia="Times New Roman"/>
-                <w:b w:val="0"/>
-                <w:i w:val="0"/>
-                <w:color w:val="000000"/>
-                <w:sz w:val="24"/>
-              </w:rPr>
-              <w:t>GPU runs</w:t>
-            </w:r>
-          </w:p>
-        </w:tc>
-        <w:tc>
-          <w:tcPr>
-            <w:tcW w:type="dxa" w:w="3485"/>
-          </w:tcPr>
-          <w:p>
-            <w:pPr>
-              <w:spacing w:after="40" w:before="40" w:line="240" w:lineRule="auto"/>
-              <w:jc w:val="left"/>
-            </w:pPr>
-            <w:r>
-              <w:rPr>
-                <w:rFonts w:ascii="Times New Roman" w:hAnsi="Times New Roman" w:eastAsia="Times New Roman"/>
-                <w:b w:val="0"/>
-                <w:i w:val="0"/>
-                <w:color w:val="000000"/>
-                <w:sz w:val="24"/>
-              </w:rPr>
-              <w:t>Kaggle notebooks</w:t>
-            </w:r>
-          </w:p>
-        </w:tc>
-        <w:tc>
-          <w:tcPr>
-            <w:tcW w:type="dxa" w:w="1640"/>
-          </w:tcPr>
-          <w:p>
-            <w:pPr>
-              <w:spacing w:after="40" w:before="40" w:line="240" w:lineRule="auto"/>
-              <w:jc w:val="left"/>
-            </w:pPr>
-            <w:r>
-              <w:rPr>
-                <w:rFonts w:ascii="Times New Roman" w:hAnsi="Times New Roman" w:eastAsia="Times New Roman"/>
-                <w:b w:val="0"/>
-                <w:i w:val="0"/>
-                <w:color w:val="000000"/>
-                <w:sz w:val="24"/>
-              </w:rPr>
-              <w:t>—</w:t>
-            </w:r>
-          </w:p>
-        </w:tc>
-      </w:tr>
-    </w:tbl>
-    <w:p>
-      <w:pPr>
-        <w:spacing w:after="120" w:before="0" w:line="240" w:lineRule="auto"/>
-      </w:pPr>
+        <w:t xml:space="preserve"> Pandas and NumPy for data handling, and Scikit-learn for the stratified train-test split, stratified 5-fold cross-validation, and the standard evaluation metrics.</w:t>
+      </w:r>
     </w:p>
     <w:p>
       <w:pPr>
-        <w:spacing w:after="240" w:before="0" w:line="360" w:lineRule="auto"/>
+        <w:tabs>
+          <w:tab w:pos="720" w:val="left"/>
+        </w:tabs>
+        <w:spacing w:after="160" w:before="0" w:line="360" w:lineRule="auto"/>
+        <w:ind w:left="720" w:hanging="432"/>
         <w:jc w:val="both"/>
       </w:pPr>
+      <w:r>
+        <w:rPr>
+          <w:rFonts w:ascii="Times New Roman" w:hAnsi="Times New Roman" w:eastAsia="Times New Roman"/>
+          <w:color w:val="000000"/>
+          <w:sz w:val="24"/>
+        </w:rPr>
+        <w:t>•</w:t>
+        <w:tab/>
+      </w:r>
+      <w:r>
+        <w:rPr>
+          <w:rFonts w:ascii="Times New Roman" w:hAnsi="Times New Roman" w:eastAsia="Times New Roman"/>
+          <w:b/>
+          <w:i w:val="0"/>
+          <w:color w:val="000000"/>
+          <w:sz w:val="24"/>
+        </w:rPr>
+        <w:t>Tabular AI engines:</w:t>
+      </w:r>
       <w:r>
         <w:rPr>
           <w:rFonts w:ascii="Times New Roman" w:hAnsi="Times New Roman" w:eastAsia="Times New Roman"/>
@@ -9467,7 +8582,124 @@
           <w:color w:val="000000"/>
           <w:sz w:val="24"/>
         </w:rPr>
-        <w:t>Package versions used on Kaggle are recorded at the start of each notebook and reported with the results.</w:t>
+        <w:t xml:space="preserve"> the official CatBoost framework for gradient-boosted tree training, the TabPFN Python package for zero-shot tabular foundation model inference, and Google Research's TabFM package for the second zero-shot tabular foundation model. PyTorch will be used as the deep learning backend for TabPFN and TabFM.</w:t>
+      </w:r>
+    </w:p>
+    <w:p>
+      <w:pPr>
+        <w:tabs>
+          <w:tab w:pos="720" w:val="left"/>
+        </w:tabs>
+        <w:spacing w:after="160" w:before="0" w:line="360" w:lineRule="auto"/>
+        <w:ind w:left="720" w:hanging="432"/>
+        <w:jc w:val="both"/>
+      </w:pPr>
+      <w:r>
+        <w:rPr>
+          <w:rFonts w:ascii="Times New Roman" w:hAnsi="Times New Roman" w:eastAsia="Times New Roman"/>
+          <w:color w:val="000000"/>
+          <w:sz w:val="24"/>
+        </w:rPr>
+        <w:t>•</w:t>
+        <w:tab/>
+      </w:r>
+      <w:r>
+        <w:rPr>
+          <w:rFonts w:ascii="Times New Roman" w:hAnsi="Times New Roman" w:eastAsia="Times New Roman"/>
+          <w:b/>
+          <w:i w:val="0"/>
+          <w:color w:val="000000"/>
+          <w:sz w:val="24"/>
+        </w:rPr>
+        <w:t>Explainable AI:</w:t>
+      </w:r>
+      <w:r>
+        <w:rPr>
+          <w:rFonts w:ascii="Times New Roman" w:hAnsi="Times New Roman" w:eastAsia="Times New Roman"/>
+          <w:b w:val="0"/>
+          <w:i w:val="0"/>
+          <w:color w:val="000000"/>
+          <w:sz w:val="24"/>
+        </w:rPr>
+        <w:t xml:space="preserve"> the official SHAP library, which will be used to compute feature attributions for all three models, using TreeExplainer for CatBoost and KernelExplainer for TabPFN and TabFM.</w:t>
+      </w:r>
+    </w:p>
+    <w:p>
+      <w:pPr>
+        <w:tabs>
+          <w:tab w:pos="720" w:val="left"/>
+        </w:tabs>
+        <w:spacing w:after="160" w:before="0" w:line="360" w:lineRule="auto"/>
+        <w:ind w:left="720" w:hanging="432"/>
+        <w:jc w:val="both"/>
+      </w:pPr>
+      <w:r>
+        <w:rPr>
+          <w:rFonts w:ascii="Times New Roman" w:hAnsi="Times New Roman" w:eastAsia="Times New Roman"/>
+          <w:color w:val="000000"/>
+          <w:sz w:val="24"/>
+        </w:rPr>
+        <w:t>•</w:t>
+        <w:tab/>
+      </w:r>
+      <w:r>
+        <w:rPr>
+          <w:rFonts w:ascii="Times New Roman" w:hAnsi="Times New Roman" w:eastAsia="Times New Roman"/>
+          <w:b/>
+          <w:i w:val="0"/>
+          <w:color w:val="000000"/>
+          <w:sz w:val="24"/>
+        </w:rPr>
+        <w:t>Statistical analysis:</w:t>
+      </w:r>
+      <w:r>
+        <w:rPr>
+          <w:rFonts w:ascii="Times New Roman" w:hAnsi="Times New Roman" w:eastAsia="Times New Roman"/>
+          <w:b w:val="0"/>
+          <w:i w:val="0"/>
+          <w:color w:val="000000"/>
+          <w:sz w:val="24"/>
+        </w:rPr>
+        <w:t xml:space="preserve"> Statsmodels, which will be used to compute McNemar's test for pairwise significance testing between model predictions and Wilson score confidence intervals for the reported accuracy figures.</w:t>
+      </w:r>
+    </w:p>
+    <w:p>
+      <w:pPr>
+        <w:tabs>
+          <w:tab w:pos="720" w:val="left"/>
+        </w:tabs>
+        <w:spacing w:after="160" w:before="0" w:line="360" w:lineRule="auto"/>
+        <w:ind w:left="720" w:hanging="432"/>
+        <w:jc w:val="both"/>
+      </w:pPr>
+      <w:r>
+        <w:rPr>
+          <w:rFonts w:ascii="Times New Roman" w:hAnsi="Times New Roman" w:eastAsia="Times New Roman"/>
+          <w:color w:val="000000"/>
+          <w:sz w:val="24"/>
+        </w:rPr>
+        <w:t>•</w:t>
+        <w:tab/>
+      </w:r>
+      <w:r>
+        <w:rPr>
+          <w:rFonts w:ascii="Times New Roman" w:hAnsi="Times New Roman" w:eastAsia="Times New Roman"/>
+          <w:b/>
+          <w:i w:val="0"/>
+          <w:color w:val="000000"/>
+          <w:sz w:val="24"/>
+        </w:rPr>
+        <w:t>Visualisation:</w:t>
+      </w:r>
+      <w:r>
+        <w:rPr>
+          <w:rFonts w:ascii="Times New Roman" w:hAnsi="Times New Roman" w:eastAsia="Times New Roman"/>
+          <w:b w:val="0"/>
+          <w:i w:val="0"/>
+          <w:color w:val="000000"/>
+          <w:sz w:val="24"/>
+        </w:rPr>
+        <w:t xml:space="preserve"> Matplotlib for the confusion matrices, SHAP plots, and result charts.</w:t>
       </w:r>
     </w:p>
     <w:p>
@@ -9500,7 +8732,7 @@
           <w:color w:val="000000"/>
           <w:sz w:val="24"/>
         </w:rPr>
-        <w:t>The work is divided between two environments (Figure 3.7).</w:t>
+        <w:t>The experiments will be carried out in two environments (Figure 3.7). CatBoost tuning and training, the statistical tests, and the result tables and figures will be run on an Apple-silicon Mac with Python. TabPFN and TabFM will be run in Kaggle notebooks with a GPU accelerator, because they need a GPU to make their predictions in reasonable time, and Kaggle offers more GPU capacity than Google Colab. The train and test files will be uploaded to the notebook, and the predictions and metrics will be downloaded back for comparison.</w:t>
       </w:r>
     </w:p>
     <w:p>
@@ -9512,7 +8744,7 @@
       <w:r>
         <w:drawing>
           <wp:inline xmlns:a="http://schemas.openxmlformats.org/drawingml/2006/main" xmlns:pic="http://schemas.openxmlformats.org/drawingml/2006/picture">
-            <wp:extent cx="5733288" cy="2392545"/>
+            <wp:extent cx="5733288" cy="2197760"/>
             <wp:docPr id="12" name="Picture 12"/>
             <wp:cNvGraphicFramePr>
               <a:graphicFrameLocks noChangeAspect="1"/>
@@ -9533,7 +8765,7 @@
                   <pic:spPr>
                     <a:xfrm>
                       <a:off x="0" y="0"/>
-                      <a:ext cx="5733288" cy="2392545"/>
+                      <a:ext cx="5733288" cy="2197760"/>
                     </a:xfrm>
                     <a:prstGeom prst="rect"/>
                   </pic:spPr>
@@ -9578,64 +8810,12 @@
       <w:r>
         <w:rPr>
           <w:rFonts w:ascii="Times New Roman" w:hAnsi="Times New Roman" w:eastAsia="Times New Roman"/>
-          <w:b/>
-          <w:i w:val="0"/>
-          <w:color w:val="000000"/>
-          <w:sz w:val="24"/>
-        </w:rPr>
-        <w:t>Local machine.</w:t>
-      </w:r>
-      <w:r>
-        <w:rPr>
-          <w:rFonts w:ascii="Times New Roman" w:hAnsi="Times New Roman" w:eastAsia="Times New Roman"/>
           <w:b w:val="0"/>
           <w:i w:val="0"/>
           <w:color w:val="000000"/>
           <w:sz w:val="24"/>
         </w:rPr>
-        <w:t xml:space="preserve"> Data preparation and the split have already been done on an Apple-silicon Mac (macOS, 17.2 GB memory, Apple GPU) with Python 3.12, and CatBoost tuning and training, the statistical tests, and the result tables and figures will be run there as well. The steps are run one by one in a local lab application that stores the data in PostgreSQL and the outputs in MinIO, so every run is saved and can be reopened.</w:t>
-      </w:r>
-    </w:p>
-    <w:p>
-      <w:pPr>
-        <w:spacing w:after="240" w:before="0" w:line="360" w:lineRule="auto"/>
-        <w:jc w:val="both"/>
-      </w:pPr>
-      <w:r>
-        <w:rPr>
-          <w:rFonts w:ascii="Times New Roman" w:hAnsi="Times New Roman" w:eastAsia="Times New Roman"/>
-          <w:b/>
-          <w:i w:val="0"/>
-          <w:color w:val="000000"/>
-          <w:sz w:val="24"/>
-        </w:rPr>
-        <w:t>Kaggle notebooks.</w:t>
-      </w:r>
-      <w:r>
-        <w:rPr>
-          <w:rFonts w:ascii="Times New Roman" w:hAnsi="Times New Roman" w:eastAsia="Times New Roman"/>
-          <w:b w:val="0"/>
-          <w:i w:val="0"/>
-          <w:color w:val="000000"/>
-          <w:sz w:val="24"/>
-        </w:rPr>
-        <w:t xml:space="preserve"> TabFM and TabPFN need a GPU to make their predictions in reasonable time, and TabFM is the largest model (about 6.5 GB of weights). These runs will therefore be done in Kaggle notebooks, which offer more GPU capacity than Google Colab. The train and test files created on the local machine are uploaded to the notebook, and the metrics and predictions are downloaded back for comparison. SHAP for the two foundation models will also be run there.</w:t>
-      </w:r>
-    </w:p>
-    <w:p>
-      <w:pPr>
-        <w:spacing w:after="240" w:before="0" w:line="360" w:lineRule="auto"/>
-        <w:jc w:val="both"/>
-      </w:pPr>
-      <w:r>
-        <w:rPr>
-          <w:rFonts w:ascii="Times New Roman" w:hAnsi="Times New Roman" w:eastAsia="Times New Roman"/>
-          <w:b w:val="0"/>
-          <w:i w:val="0"/>
-          <w:color w:val="000000"/>
-          <w:sz w:val="24"/>
-        </w:rPr>
-        <w:t>To keep the comparison fair, all three models use the same split and the same random seed (42), and the environment of every session (Python, GPU, memory, package versions) is recorded and reported.</w:t>
+        <w:t>To keep the comparison fair, all three models will use the same split and the same random seed (42). The Python version, GPU model, available memory, and package versions of every session will be recorded and reported with the results.</w:t>
       </w:r>
     </w:p>
     <w:p>

</xml_diff>

<commit_message>
Update Chapter 3 and Chapter 4 Methodology: revise text for clarity and consistency, adjust dataset descriptions, and update Gantt chart. Modify binary files for Hairfall Proposal and related figures.
</commit_message>
<xml_diff>
--- a/Thesis_Final/Hairfall_Proposal.docx
+++ b/Thesis_Final/Hairfall_Proposal.docx
@@ -1643,9 +1643,9 @@
           <w:color w:val="000000"/>
           <w:sz w:val="24"/>
         </w:rPr>
-        <w:t>DT</w:t>
+        <w:t>EHR</w:t>
         <w:tab/>
-        <w:t>Decision Tree</w:t>
+        <w:t>Electronic Health Record</w:t>
       </w:r>
     </w:p>
     <w:p>
@@ -1663,9 +1663,9 @@
           <w:color w:val="000000"/>
           <w:sz w:val="24"/>
         </w:rPr>
-        <w:t>EHR</w:t>
+        <w:t>FN</w:t>
         <w:tab/>
-        <w:t>Electronic Health Record</w:t>
+        <w:t>False Negatives</w:t>
       </w:r>
     </w:p>
     <w:p>
@@ -1683,9 +1683,9 @@
           <w:color w:val="000000"/>
           <w:sz w:val="24"/>
         </w:rPr>
-        <w:t>GB</w:t>
+        <w:t>FP</w:t>
         <w:tab/>
-        <w:t>Gradient Boosting</w:t>
+        <w:t>False Positives</w:t>
       </w:r>
     </w:p>
     <w:p>
@@ -1743,9 +1743,9 @@
           <w:color w:val="000000"/>
           <w:sz w:val="24"/>
         </w:rPr>
-        <w:t>LR</w:t>
+        <w:t>LSTM</w:t>
         <w:tab/>
-        <w:t>Logistic Regression</w:t>
+        <w:t>Long Short-Term Memory</w:t>
       </w:r>
     </w:p>
     <w:p>
@@ -1763,9 +1763,9 @@
           <w:color w:val="000000"/>
           <w:sz w:val="24"/>
         </w:rPr>
-        <w:t>LSTM</w:t>
+        <w:t>ROC</w:t>
         <w:tab/>
-        <w:t>Long Short-Term Memory</w:t>
+        <w:t>Receiver Operating Characteristic</w:t>
       </w:r>
     </w:p>
     <w:p>
@@ -1783,9 +1783,9 @@
           <w:color w:val="000000"/>
           <w:sz w:val="24"/>
         </w:rPr>
-        <w:t>RF</w:t>
+        <w:t>ROC-AUC</w:t>
         <w:tab/>
-        <w:t>Random Forest</w:t>
+        <w:t>Area Under the Receiver Operating Characteristic Curve</w:t>
       </w:r>
     </w:p>
     <w:p>
@@ -1803,9 +1803,9 @@
           <w:color w:val="000000"/>
           <w:sz w:val="24"/>
         </w:rPr>
-        <w:t>ROC</w:t>
+        <w:t>SHAP</w:t>
         <w:tab/>
-        <w:t>Receiver Operating Characteristic</w:t>
+        <w:t>Shapley Additive Explanations</w:t>
       </w:r>
     </w:p>
     <w:p>
@@ -1823,9 +1823,9 @@
           <w:color w:val="000000"/>
           <w:sz w:val="24"/>
         </w:rPr>
-        <w:t>ROC-AUC</w:t>
+        <w:t>SVM</w:t>
         <w:tab/>
-        <w:t>Area Under the Receiver Operating Characteristic Curve</w:t>
+        <w:t>Support Vector Machine</w:t>
       </w:r>
     </w:p>
     <w:p>
@@ -1843,9 +1843,9 @@
           <w:color w:val="000000"/>
           <w:sz w:val="24"/>
         </w:rPr>
-        <w:t>SHAP</w:t>
+        <w:t>TabFM</w:t>
         <w:tab/>
-        <w:t>Shapley Additive Explanations</w:t>
+        <w:t>Tabular Foundation Model</w:t>
       </w:r>
     </w:p>
     <w:p>
@@ -1863,9 +1863,9 @@
           <w:color w:val="000000"/>
           <w:sz w:val="24"/>
         </w:rPr>
-        <w:t>SVM</w:t>
+        <w:t>TabPFN</w:t>
         <w:tab/>
-        <w:t>Support Vector Machine</w:t>
+        <w:t>Tabular Prior-Data Fitted Network</w:t>
       </w:r>
     </w:p>
     <w:p>
@@ -1883,9 +1883,9 @@
           <w:color w:val="000000"/>
           <w:sz w:val="24"/>
         </w:rPr>
-        <w:t>TabFM</w:t>
+        <w:t>TFT</w:t>
         <w:tab/>
-        <w:t>Tabular Foundation Model</w:t>
+        <w:t>Temporal Fusion Transformer</w:t>
       </w:r>
     </w:p>
     <w:p>
@@ -1903,29 +1903,9 @@
           <w:color w:val="000000"/>
           <w:sz w:val="24"/>
         </w:rPr>
-        <w:t>TabPFN</w:t>
+        <w:t>TP</w:t>
         <w:tab/>
-        <w:t>Tabular Prior-Data Fitted Network</w:t>
-      </w:r>
-    </w:p>
-    <w:p>
-      <w:pPr>
-        <w:tabs>
-          <w:tab w:pos="2016" w:val="left"/>
-        </w:tabs>
-        <w:spacing w:after="80" w:before="0" w:line="360" w:lineRule="auto"/>
-        <w:ind w:left="2016" w:hanging="2016"/>
-        <w:jc w:val="left"/>
-      </w:pPr>
-      <w:r>
-        <w:rPr>
-          <w:rFonts w:ascii="Times New Roman" w:hAnsi="Times New Roman" w:eastAsia="Times New Roman"/>
-          <w:color w:val="000000"/>
-          <w:sz w:val="24"/>
-        </w:rPr>
-        <w:t>TFT</w:t>
-        <w:tab/>
-        <w:t>Temporal Fusion Transformer</w:t>
+        <w:t>True Positives</w:t>
       </w:r>
     </w:p>
     <w:p>
@@ -2895,7 +2875,7 @@
           <w:color w:val="000000"/>
           <w:sz w:val="24"/>
         </w:rPr>
-        <w:t>The study follows one pipeline from data to explanation, shown in Figure 3.1. The final dataset is cleaned and split once. The same training and test rows are then given to three models, CatBoost, TabPFN, and TabFM. To see how each model behaves when little data is available, each will also be given two smaller stratified subsets of the training rows (500 and 2,000 records) in addition to all 17,284. Their predictions are compared with the same metrics and statistical tests, and SHAP is applied to all three so that each predicted risk tier can be traced to its features.</w:t>
+        <w:t>The study follows one pipeline from data to explanation, shown in Figure 3.1. The final dataset will be cleaned and split once. The same training and test rows will then be given to three models, CatBoost, TabPFN, and TabFM. To see how each model behaves when little data is available, each will also be given two smaller stratified subsets of the training rows (500 and 2,000 records) in addition to all 17,284. Their predictions will be compared with the same metrics and statistical tests, and SHAP will be applied to all three so that each predicted risk tier can be traced to its features.</w:t>
       </w:r>
     </w:p>
     <w:p>
@@ -3012,7 +2992,7 @@
           <w:color w:val="000000"/>
           <w:sz w:val="24"/>
         </w:rPr>
-        <w:t>Two public datasets were the sources of the data.</w:t>
+        <w:t>Two public datasets are the sources of the data.</w:t>
       </w:r>
     </w:p>
     <w:p>
@@ -3064,7 +3044,7 @@
           <w:color w:val="000000"/>
           <w:sz w:val="24"/>
         </w:rPr>
-        <w:t xml:space="preserve"> (Arnob et al., 2024) is a survey of 716 people with 14 columns: a timestamp, the name of the respondent (removed before use), age, gender, whether the person has a hair fall problem, eight yes/no questions (family history of hair fall, chronic illness, staying up late, sleep disturbance, water as a reason, use of chemicals on hair, anemia, and stress), and food habit.</w:t>
+        <w:t xml:space="preserve"> (Arnob et al., 2024) is a survey of 716 people with 14 columns: a timestamp, the name of the respondent (to be removed before use), age, gender, whether the person has a hair fall problem, eight yes/no questions (family history of hair fall, chronic illness, staying up late, sleep disturbance, water as a reason, use of chemicals on hair, anemia, and stress), and food habit.</w:t>
       </w:r>
     </w:p>
     <w:p>
@@ -3080,7 +3060,7 @@
           <w:color w:val="000000"/>
           <w:sz w:val="24"/>
         </w:rPr>
-        <w:t>A super dataset of 200,000 records was taken. It contains all the fields of Dataset 1 and Dataset 2 and many additional fields (for example age group, hair fall tier, and number of risk factors). In the super dataset, age and gender were identified and the records were kept according to them. It was compared with Dataset 1 and Dataset 2, and this gave the final dataset of 21,606 records that is used in this study.</w:t>
+        <w:t>A super dataset of 200,000 records will be taken. It contains all the fields of Dataset 1 and Dataset 2 and many additional fields (for example age group, hair fall tier, and number of risk factors). In the super dataset, age and gender will be identified and the records kept according to them. It will be compared with Dataset 1 and Dataset 2, and this will give the final dataset of 21,606 records to be used in this study.</w:t>
       </w:r>
     </w:p>
     <w:p>
@@ -7057,7 +7037,7 @@
           <w:color w:val="000000"/>
           <w:sz w:val="24"/>
         </w:rPr>
-        <w:t>The following steps were applied to the final dataset before any model was run.</w:t>
+        <w:t>The following steps will be applied to the final dataset before any model is run.</w:t>
       </w:r>
     </w:p>
     <w:p>
@@ -7096,7 +7076,7 @@
           <w:color w:val="000000"/>
           <w:sz w:val="24"/>
         </w:rPr>
-        <w:t xml:space="preserve"> The id column and the full_name column (which holds personal names in encoded form) were removed, because they do not describe health and could create false patterns. After removal, 20 features remain.</w:t>
+        <w:t xml:space="preserve"> The id column and the full_name column (which holds personal names in encoded form) will be removed, because they do not describe health and could create false patterns. This leaves 20 features.</w:t>
       </w:r>
     </w:p>
     <w:p>
@@ -7135,7 +7115,7 @@
           <w:color w:val="000000"/>
           <w:sz w:val="24"/>
         </w:rPr>
-        <w:t xml:space="preserve"> The dataset has no missing values and no duplicate records (ignoring id).</w:t>
+        <w:t xml:space="preserve"> The dataset will be checked for missing values and duplicate records (ignoring id).</w:t>
       </w:r>
     </w:p>
     <w:p>
@@ -7174,7 +7154,7 @@
           <w:color w:val="000000"/>
           <w:sz w:val="24"/>
         </w:rPr>
-        <w:t xml:space="preserve"> Each blood and body measurement was compared with its normal reference range and with limits that are physiologically impossible. No values were impossible, so no record was removed. Values outside the normal range were kept on purpose, because they are the information that indicates risk.</w:t>
+        <w:t xml:space="preserve"> Each blood and body measurement will be compared with its normal reference range and with limits that are physiologically impossible. Only impossible values will be removed. Values outside the normal range will be kept on purpose, because they are the information that indicates risk.</w:t>
       </w:r>
     </w:p>
     <w:p>
@@ -7213,7 +7193,7 @@
           <w:color w:val="000000"/>
           <w:sz w:val="24"/>
         </w:rPr>
-        <w:t xml:space="preserve"> Gender was coded 0 = Female, 1 = Male, 2 = Other. The yes/no columns were already 0/1, and the target was already coded 0, 1, 2.</w:t>
+        <w:t xml:space="preserve"> Gender will be coded 0 = Female, 1 = Male, 2 = Other. The yes/no columns are already 0/1, and the target is already coded 0, 1, 2.</w:t>
       </w:r>
     </w:p>
     <w:p>
@@ -7252,7 +7232,7 @@
           <w:color w:val="000000"/>
           <w:sz w:val="24"/>
         </w:rPr>
-        <w:t xml:space="preserve"> The records were split 80% to 20% with the class shares kept equal (random seed 42): 17,284 training records and 4,322 test records, with 45% Low, 35% Moderate, and 20% High in both parts.</w:t>
+        <w:t xml:space="preserve"> The records will be split 80% to 20% with the class shares kept equal (random seed 42), giving 17,284 training records and 4,322 test records, with 45% Low, 35% Moderate, and 20% High in both parts.</w:t>
       </w:r>
     </w:p>
     <w:p>
@@ -7291,7 +7271,7 @@
           <w:color w:val="000000"/>
           <w:sz w:val="24"/>
         </w:rPr>
-        <w:t xml:space="preserve"> Three training sizes were prepared from the 17,284 training records: 500 records, 2,000 records, and all 17,284. The smaller sets were drawn with the class shares kept equal (45% Low, 35% Moderate, 20% High). The same 4,322 test records are used for every size and every model.</w:t>
+        <w:t xml:space="preserve"> Three training sizes will be prepared from the 17,284 training records: 500 records, 2,000 records, and all 17,284. The smaller sets will be drawn with the class shares kept equal (45% Low, 35% Moderate, 20% High). The same 4,322 test records will be used for every size and every model.</w:t>
       </w:r>
     </w:p>
     <w:p>
@@ -9910,7 +9890,7 @@
           <w:color w:val="000000"/>
           <w:sz w:val="24"/>
         </w:rPr>
-        <w:t>This study is expected to give a fair comparison of CatBoost, TabPFN, and TabFM on hair fall data, because all three use the same dataset, split, random seed, and metrics, unlike earlier studies that compared different classical models on different datasets (Khatun et al., 2022; Kumar et al., 2025; Siami &amp; Azis, 2025). CatBoost is tuned with a grid search and cross-validation on the training data, so it should act as a strong baseline, unlike the untuned CatBoost result in earlier work (Kumar et al., 2025). TabPFN and TabFM are expected to be competitive with the tuned CatBoost without any tuning, especially with small training sets, as their benchmark results suggest (Hollmann et al., 2025; Kong et al., 2026). The study can also show the opposite, and a difference between models is accepted only if McNemar's test shows that it is larger than chance. It will also record the practical limits of TabFM on a real health dataset, such as how much training data it can take, how long it runs, and what problems appear, since an independent reproduction reported software defects and memory failures on larger tables (Pandey, 2026).</w:t>
+        <w:t>This study is expected to give a fair comparison of CatBoost, TabPFN, and TabFM on hair fall data, because all three will use the same dataset, split, random seed, and metrics, unlike earlier studies that compared different classical models on different datasets (Khatun et al., 2022; Kumar et al., 2025; Siami &amp; Azis, 2025). CatBoost will be tuned with a grid search and cross-validation on the training data, so it should act as a strong baseline, unlike the untuned CatBoost result in earlier work (Kumar et al., 2025). TabPFN and TabFM are expected to be competitive with the tuned CatBoost without any tuning, especially with small training sets, as their benchmark results suggest (Hollmann et al., 2025; Kong et al., 2026). The study can also show the opposite, and a difference between models is accepted only if McNemar's test shows that it is larger than chance. It will also record the practical limits of TabFM on a real health dataset, such as how much training data it can take, how long it runs, and what problems appear, since an independent reproduction reported software defects and memory failures on larger tables (Pandey, 2026).</w:t>
       </w:r>
     </w:p>
     <w:p>
@@ -9959,7 +9939,7 @@
           <w:color w:val="000000"/>
           <w:sz w:val="24"/>
         </w:rPr>
-        <w:t>The work is planned over six months, with the schedule shown as a Gantt chart in Figure 4.1. The tasks on the left are split into what has already been done up to this proposal (black bars) and what will be done after the proposal is approved (hatched bars). The completed tasks are the problem formulation, the literature review, the comparison and preparation of the datasets, the preprocessing and split, and the setup of the local environment and pipeline code. The planned tasks follow the order of the methodology in Chapter 3: model training, the training-size experiment, SHAP, evaluation, discussion, and thesis writing.</w:t>
+        <w:t>After the proposal is approved, the work will be completed in three months, as shown in the Gantt chart in Figure 4.1. The proposal is the only task completed so far (black bar), and the remaining tasks (hatched bars) follow the order of the methodology in Chapter 3.</w:t>
       </w:r>
     </w:p>
     <w:p>
@@ -9971,7 +9951,7 @@
       <w:r>
         <w:drawing>
           <wp:inline xmlns:a="http://schemas.openxmlformats.org/drawingml/2006/main" xmlns:pic="http://schemas.openxmlformats.org/drawingml/2006/picture">
-            <wp:extent cx="5733288" cy="4237939"/>
+            <wp:extent cx="5733288" cy="3773976"/>
             <wp:docPr id="20" name="Picture 20"/>
             <wp:cNvGraphicFramePr>
               <a:graphicFrameLocks noChangeAspect="1"/>
@@ -9992,7 +9972,7 @@
                   <pic:spPr>
                     <a:xfrm>
                       <a:off x="0" y="0"/>
-                      <a:ext cx="5733288" cy="4237939"/>
+                      <a:ext cx="5733288" cy="3773976"/>
                     </a:xfrm>
                     <a:prstGeom prst="rect"/>
                   </pic:spPr>

</xml_diff>

<commit_message>
Update Chapter 4 Expected Outcomes and Schedule: revise working schedule duration and update Gantt chart details. Modify related binary files for Hairfall Proposal and Gantt chart image.
</commit_message>
<xml_diff>
--- a/Thesis_Final/Hairfall_Proposal.docx
+++ b/Thesis_Final/Hairfall_Proposal.docx
@@ -9939,7 +9939,7 @@
           <w:color w:val="000000"/>
           <w:sz w:val="24"/>
         </w:rPr>
-        <w:t>After the proposal is approved, the work will be completed in three months, as shown in the Gantt chart in Figure 4.1. The proposal is the only task completed so far (black bar), and the remaining tasks (hatched bars) follow the order of the methodology in Chapter 3.</w:t>
+        <w:t>The work is planned over four months, as shown in the Gantt chart in Figure 4.1. Months 1 and 2 are for the proposal work (black bars), and months 3 and 4 are for the final work after the proposal is approved (hatched bars), in the order of the methodology in Chapter 3.</w:t>
       </w:r>
     </w:p>
     <w:p>
@@ -9951,7 +9951,7 @@
       <w:r>
         <w:drawing>
           <wp:inline xmlns:a="http://schemas.openxmlformats.org/drawingml/2006/main" xmlns:pic="http://schemas.openxmlformats.org/drawingml/2006/picture">
-            <wp:extent cx="5733288" cy="3773976"/>
+            <wp:extent cx="5733288" cy="3931773"/>
             <wp:docPr id="20" name="Picture 20"/>
             <wp:cNvGraphicFramePr>
               <a:graphicFrameLocks noChangeAspect="1"/>
@@ -9972,7 +9972,7 @@
                   <pic:spPr>
                     <a:xfrm>
                       <a:off x="0" y="0"/>
-                      <a:ext cx="5733288" cy="3773976"/>
+                      <a:ext cx="5733288" cy="3931773"/>
                     </a:xfrm>
                     <a:prstGeom prst="rect"/>
                   </pic:spPr>

</xml_diff>